<commit_message>
docs: manual v2 com a seção Admin: Importar conhecimento e trechos regerados (234)
Co-Authored-By: Claude Opus 5.5 <noreply@anthropic.com>
</commit_message>
<xml_diff>
--- a/MyMemory_Manual_Operacional_v2.docx
+++ b/MyMemory_Manual_Operacional_v2.docx
@@ -577,7 +577,7 @@
           <w:sz w:val="21"/>
           <w:szCs w:val="21"/>
         </w:rPr>
-        <w:t xml:space="preserve">Seção 27 — Integrações externas (chave de API)</w:t>
+        <w:t xml:space="preserve">Seção 27 — Admin: Importar conhecimento</w:t>
       </w:r>
     </w:p>
     <w:p>
@@ -595,7 +595,7 @@
           <w:sz w:val="21"/>
           <w:szCs w:val="21"/>
         </w:rPr>
-        <w:t xml:space="preserve">Seção 28 — Erros Comuns e Soluções</w:t>
+        <w:t xml:space="preserve">Seção 28 — Integrações externas (chave de API)</w:t>
       </w:r>
     </w:p>
     <w:p>
@@ -613,7 +613,25 @@
           <w:sz w:val="21"/>
           <w:szCs w:val="21"/>
         </w:rPr>
-        <w:t xml:space="preserve">Seção 29 — Referência Rápida Admin</w:t>
+        <w:t xml:space="preserve">Seção 29 — Erros Comuns e Soluções</w:t>
+      </w:r>
+    </w:p>
+    <w:p>
+      <w:pPr>
+        <w:pStyle w:val="ListParagraph"/>
+        <w:numPr>
+          <w:ilvl w:val="0"/>
+          <w:numId w:val="2"/>
+        </w:numPr>
+        <w:spacing w:after="60"/>
+      </w:pPr>
+      <w:r>
+        <w:rPr>
+          <w:rFonts w:ascii="Calibri" w:cs="Calibri" w:eastAsia="Calibri" w:hAnsi="Calibri"/>
+          <w:sz w:val="21"/>
+          <w:szCs w:val="21"/>
+        </w:rPr>
+        <w:t xml:space="preserve">Seção 30 — Referência Rápida Admin</w:t>
       </w:r>
     </w:p>
     <w:p>
@@ -1907,7 +1925,7 @@
                 <w:sz w:val="20"/>
                 <w:szCs w:val="20"/>
               </w:rPr>
-              <w:t xml:space="preserve">Autenticação por chave de API para integrações externas (ex.: Softing-erp) com contexto da tela</w:t>
+              <w:t xml:space="preserve">Importar conhecimento em trechos (ex.: o próprio manual) para responder perguntas no grupo</w:t>
             </w:r>
           </w:p>
         </w:tc>
@@ -1937,6 +1955,70 @@
                 <w:szCs w:val="20"/>
               </w:rPr>
               <w:t xml:space="preserve">Seção 27</w:t>
+            </w:r>
+          </w:p>
+        </w:tc>
+      </w:tr>
+      <w:tr>
+        <w:trPr>
+          <w:cantSplit/>
+          <w:tblHeader w:val="false"/>
+        </w:trPr>
+        <w:tc>
+          <w:tcPr>
+            <w:tcW w:type="dxa" w:w="3031"/>
+            <w:tcBorders>
+              <w:top w:val="single" w:color="B7C4D6" w:sz="4"/>
+              <w:left w:val="single" w:color="B7C4D6" w:sz="4"/>
+              <w:bottom w:val="single" w:color="B7C4D6" w:sz="4"/>
+              <w:right w:val="single" w:color="B7C4D6" w:sz="4"/>
+            </w:tcBorders>
+            <w:tcMar>
+              <w:top w:type="dxa" w:w="60"/>
+              <w:left w:type="dxa" w:w="100"/>
+              <w:bottom w:type="dxa" w:w="60"/>
+              <w:right w:type="dxa" w:w="100"/>
+            </w:tcMar>
+          </w:tcPr>
+          <w:p>
+            <w:r>
+              <w:rPr>
+                <w:rFonts w:ascii="Calibri" w:cs="Calibri" w:eastAsia="Calibri" w:hAnsi="Calibri"/>
+                <w:b/>
+                <w:bCs/>
+                <w:sz w:val="20"/>
+                <w:szCs w:val="20"/>
+              </w:rPr>
+              <w:t xml:space="preserve">Autenticação por chave de API para integrações externas (ex.: Softing-erp) com contexto da tela</w:t>
+            </w:r>
+          </w:p>
+        </w:tc>
+        <w:tc>
+          <w:tcPr>
+            <w:tcW w:type="dxa" w:w="7075"/>
+            <w:tcBorders>
+              <w:top w:val="single" w:color="B7C4D6" w:sz="4"/>
+              <w:left w:val="single" w:color="B7C4D6" w:sz="4"/>
+              <w:bottom w:val="single" w:color="B7C4D6" w:sz="4"/>
+              <w:right w:val="single" w:color="B7C4D6" w:sz="4"/>
+            </w:tcBorders>
+            <w:tcMar>
+              <w:top w:type="dxa" w:w="60"/>
+              <w:left w:type="dxa" w:w="100"/>
+              <w:bottom w:type="dxa" w:w="60"/>
+              <w:right w:type="dxa" w:w="100"/>
+            </w:tcMar>
+          </w:tcPr>
+          <w:p>
+            <w:r>
+              <w:rPr>
+                <w:rFonts w:ascii="Calibri" w:cs="Calibri" w:eastAsia="Calibri" w:hAnsi="Calibri"/>
+                <w:b w:val="false"/>
+                <w:bCs w:val="false"/>
+                <w:sz w:val="20"/>
+                <w:szCs w:val="20"/>
+              </w:rPr>
+              <w:t xml:space="preserve">Seção 28</w:t>
             </w:r>
           </w:p>
         </w:tc>
@@ -24903,6 +24985,70 @@
           </w:p>
         </w:tc>
       </w:tr>
+      <w:tr>
+        <w:trPr>
+          <w:cantSplit/>
+          <w:tblHeader w:val="false"/>
+        </w:trPr>
+        <w:tc>
+          <w:tcPr>
+            <w:tcW w:type="dxa" w:w="3031"/>
+            <w:tcBorders>
+              <w:top w:val="single" w:color="B7C4D6" w:sz="4"/>
+              <w:left w:val="single" w:color="B7C4D6" w:sz="4"/>
+              <w:bottom w:val="single" w:color="B7C4D6" w:sz="4"/>
+              <w:right w:val="single" w:color="B7C4D6" w:sz="4"/>
+            </w:tcBorders>
+            <w:tcMar>
+              <w:top w:type="dxa" w:w="60"/>
+              <w:left w:type="dxa" w:w="100"/>
+              <w:bottom w:type="dxa" w:w="60"/>
+              <w:right w:type="dxa" w:w="100"/>
+            </w:tcMar>
+          </w:tcPr>
+          <w:p>
+            <w:r>
+              <w:rPr>
+                <w:rFonts w:ascii="Calibri" w:cs="Calibri" w:eastAsia="Calibri" w:hAnsi="Calibri"/>
+                <w:b/>
+                <w:bCs/>
+                <w:sz w:val="20"/>
+                <w:szCs w:val="20"/>
+              </w:rPr>
+              <w:t xml:space="preserve">Importar conhecimento</w:t>
+            </w:r>
+          </w:p>
+        </w:tc>
+        <w:tc>
+          <w:tcPr>
+            <w:tcW w:type="dxa" w:w="7075"/>
+            <w:tcBorders>
+              <w:top w:val="single" w:color="B7C4D6" w:sz="4"/>
+              <w:left w:val="single" w:color="B7C4D6" w:sz="4"/>
+              <w:bottom w:val="single" w:color="B7C4D6" w:sz="4"/>
+              <w:right w:val="single" w:color="B7C4D6" w:sz="4"/>
+            </w:tcBorders>
+            <w:tcMar>
+              <w:top w:type="dxa" w:w="60"/>
+              <w:left w:type="dxa" w:w="100"/>
+              <w:bottom w:type="dxa" w:w="60"/>
+              <w:right w:type="dxa" w:w="100"/>
+            </w:tcMar>
+          </w:tcPr>
+          <w:p>
+            <w:r>
+              <w:rPr>
+                <w:rFonts w:ascii="Calibri" w:cs="Calibri" w:eastAsia="Calibri" w:hAnsi="Calibri"/>
+                <w:b w:val="false"/>
+                <w:bCs w:val="false"/>
+                <w:sz w:val="20"/>
+                <w:szCs w:val="20"/>
+              </w:rPr>
+              <w:t xml:space="preserve">→ /admin/conhecimento</w:t>
+            </w:r>
+          </w:p>
+        </w:tc>
+      </w:tr>
     </w:tbl>
     <w:p>
       <w:pPr>
@@ -30796,7 +30942,23 @@
         <w:rPr>
           <w:rFonts w:ascii="Calibri" w:cs="Calibri" w:eastAsia="Calibri" w:hAnsi="Calibri"/>
         </w:rPr>
-        <w:t xml:space="preserve">SEÇÃO 27 — Integrações externas (chave de API)</w:t>
+        <w:t xml:space="preserve">SEÇÃO 27 — Admin: Importar conhecimento</w:t>
+      </w:r>
+    </w:p>
+    <w:p>
+      <w:pPr>
+        <w:spacing w:after="120"/>
+      </w:pPr>
+      <w:r>
+        <w:rPr>
+          <w:rFonts w:ascii="Calibri" w:cs="Calibri" w:eastAsia="Calibri" w:hAnsi="Calibri"/>
+          <w:i/>
+          <w:iCs/>
+          <w:color w:val="555555"/>
+          <w:sz w:val="20"/>
+          <w:szCs w:val="20"/>
+        </w:rPr>
+        <w:t xml:space="preserve">Rota: /admin/conhecimento (Painel Admin → Importar conhecimento)</w:t>
       </w:r>
     </w:p>
     <w:p>
@@ -30821,7 +30983,7 @@
           <w:sz w:val="21"/>
           <w:szCs w:val="21"/>
         </w:rPr>
-        <w:t xml:space="preserve">Sistemas externos, como o Softing-erp, podem fazer perguntas ao MyMemory em nome de um grupo sem login de usuário, usando uma chave de API do grupo.</w:t>
+        <w:t xml:space="preserve">Importa conhecimento já dividido em trechos — por exemplo o próprio Manual MyMemory (docs/manual-chunks/chunks.jsonl) ou um FAQ interno — para dentro de um grupo. Cada trecho vira um memo de texto com categoria, campos e vetores da busca semântica, sem passar pela IA de extração. Depois disso, as perguntas feitas no grupo passam a ser respondidas também com esses trechos.</w:t>
       </w:r>
     </w:p>
     <w:p>
@@ -30833,7 +30995,7 @@
         <w:rPr>
           <w:rFonts w:ascii="Calibri" w:cs="Calibri" w:eastAsia="Calibri" w:hAnsi="Calibri"/>
         </w:rPr>
-        <w:t xml:space="preserve">Funcionamento</w:t>
+        <w:t xml:space="preserve">Antes de importar</w:t>
       </w:r>
     </w:p>
     <w:p>
@@ -30841,7 +31003,7 @@
         <w:pStyle w:val="ListParagraph"/>
         <w:numPr>
           <w:ilvl w:val="0"/>
-          <w:numId w:val="2"/>
+          <w:numId w:val="14"/>
         </w:numPr>
         <w:spacing w:after="60"/>
       </w:pPr>
@@ -30851,7 +31013,7 @@
           <w:sz w:val="21"/>
           <w:szCs w:val="21"/>
         </w:rPr>
-        <w:t xml:space="preserve">A chave é criada por um administrador e vinculada a um grupo e a um usuário de referência. Só o prefixo da chave fica visível depois de criada.</w:t>
+        <w:t xml:space="preserve">Na Estrutura do contexto, criar a categoria de destino (ex.: "Manual MyMemory") no grupo ou como global.</w:t>
       </w:r>
     </w:p>
     <w:p>
@@ -30859,7 +31021,7 @@
         <w:pStyle w:val="ListParagraph"/>
         <w:numPr>
           <w:ilvl w:val="0"/>
-          <w:numId w:val="2"/>
+          <w:numId w:val="14"/>
         </w:numPr>
         <w:spacing w:after="60"/>
       </w:pPr>
@@ -30869,7 +31031,7 @@
           <w:sz w:val="21"/>
           <w:szCs w:val="21"/>
         </w:rPr>
-        <w:t xml:space="preserve">O sistema externo envia a chave no cabeçalho da requisição para /api/perguntas.</w:t>
+        <w:t xml:space="preserve">Criar nela os campos Seção, Tela, Rota, Perfil, Tipo e Versão. Os nomes são casados com ou sem acento ("Secao" = "Seção").</w:t>
       </w:r>
     </w:p>
     <w:p>
@@ -30877,7 +31039,7 @@
         <w:pStyle w:val="ListParagraph"/>
         <w:numPr>
           <w:ilvl w:val="0"/>
-          <w:numId w:val="2"/>
+          <w:numId w:val="14"/>
         </w:numPr>
         <w:spacing w:after="60"/>
       </w:pPr>
@@ -30887,7 +31049,19 @@
           <w:sz w:val="21"/>
           <w:szCs w:val="21"/>
         </w:rPr>
-        <w:t xml:space="preserve">Pode enviar também o "contexto da tela" (tela, filtros e seleção de onde a pergunta partiu); a IA usa esse contexto para interpretar a pergunta.</w:t>
+        <w:t xml:space="preserve">Ter o arquivo .jsonl com um trecho por linha (campos obrigatórios: id e texto).</w:t>
+      </w:r>
+    </w:p>
+    <w:p>
+      <w:pPr>
+        <w:pStyle w:val="Heading2"/>
+        <w:keepNext/>
+      </w:pPr>
+      <w:r>
+        <w:rPr>
+          <w:rFonts w:ascii="Calibri" w:cs="Calibri" w:eastAsia="Calibri" w:hAnsi="Calibri"/>
+        </w:rPr>
+        <w:t xml:space="preserve">Como importar</w:t>
       </w:r>
     </w:p>
     <w:p>
@@ -30895,7 +31069,7 @@
         <w:pStyle w:val="ListParagraph"/>
         <w:numPr>
           <w:ilvl w:val="0"/>
-          <w:numId w:val="2"/>
+          <w:numId w:val="15"/>
         </w:numPr>
         <w:spacing w:after="60"/>
       </w:pPr>
@@ -30905,7 +31079,97 @@
           <w:sz w:val="21"/>
           <w:szCs w:val="21"/>
         </w:rPr>
-        <w:t xml:space="preserve">Chaves podem ser revogadas a qualquer momento; o uso fica registrado (último uso).</w:t>
+        <w:t xml:space="preserve">Abrir Admin → Importar conhecimento.</w:t>
+      </w:r>
+    </w:p>
+    <w:p>
+      <w:pPr>
+        <w:pStyle w:val="ListParagraph"/>
+        <w:numPr>
+          <w:ilvl w:val="0"/>
+          <w:numId w:val="15"/>
+        </w:numPr>
+        <w:spacing w:after="60"/>
+      </w:pPr>
+      <w:r>
+        <w:rPr>
+          <w:rFonts w:ascii="Calibri" w:cs="Calibri" w:eastAsia="Calibri" w:hAnsi="Calibri"/>
+          <w:sz w:val="21"/>
+          <w:szCs w:val="21"/>
+        </w:rPr>
+        <w:t xml:space="preserve">Escolher o grupo que vai consultar o conhecimento.</w:t>
+      </w:r>
+    </w:p>
+    <w:p>
+      <w:pPr>
+        <w:pStyle w:val="ListParagraph"/>
+        <w:numPr>
+          <w:ilvl w:val="0"/>
+          <w:numId w:val="15"/>
+        </w:numPr>
+        <w:spacing w:after="60"/>
+      </w:pPr>
+      <w:r>
+        <w:rPr>
+          <w:rFonts w:ascii="Calibri" w:cs="Calibri" w:eastAsia="Calibri" w:hAnsi="Calibri"/>
+          <w:sz w:val="21"/>
+          <w:szCs w:val="21"/>
+        </w:rPr>
+        <w:t xml:space="preserve">Escolher a categoria (as globais aparecem com "(global)"). Uma categoria com "manual" no nome é pré-selecionada.</w:t>
+      </w:r>
+    </w:p>
+    <w:p>
+      <w:pPr>
+        <w:pStyle w:val="ListParagraph"/>
+        <w:numPr>
+          <w:ilvl w:val="0"/>
+          <w:numId w:val="15"/>
+        </w:numPr>
+        <w:spacing w:after="60"/>
+      </w:pPr>
+      <w:r>
+        <w:rPr>
+          <w:rFonts w:ascii="Calibri" w:cs="Calibri" w:eastAsia="Calibri" w:hAnsi="Calibri"/>
+          <w:sz w:val="21"/>
+          <w:szCs w:val="21"/>
+        </w:rPr>
+        <w:t xml:space="preserve">Escolher o arquivo .jsonl. A tela mostra quantos trechos foram lidos.</w:t>
+      </w:r>
+    </w:p>
+    <w:p>
+      <w:pPr>
+        <w:pStyle w:val="ListParagraph"/>
+        <w:numPr>
+          <w:ilvl w:val="0"/>
+          <w:numId w:val="15"/>
+        </w:numPr>
+        <w:spacing w:after="60"/>
+      </w:pPr>
+      <w:r>
+        <w:rPr>
+          <w:rFonts w:ascii="Calibri" w:cs="Calibri" w:eastAsia="Calibri" w:hAnsi="Calibri"/>
+          <w:sz w:val="21"/>
+          <w:szCs w:val="21"/>
+        </w:rPr>
+        <w:t xml:space="preserve">Manter marcado "Substituir os trechos importados antes nesta categoria" para trocar a versão anterior.</w:t>
+      </w:r>
+    </w:p>
+    <w:p>
+      <w:pPr>
+        <w:pStyle w:val="ListParagraph"/>
+        <w:numPr>
+          <w:ilvl w:val="0"/>
+          <w:numId w:val="15"/>
+        </w:numPr>
+        <w:spacing w:after="60"/>
+      </w:pPr>
+      <w:r>
+        <w:rPr>
+          <w:rFonts w:ascii="Calibri" w:cs="Calibri" w:eastAsia="Calibri" w:hAnsi="Calibri"/>
+          <w:sz w:val="21"/>
+          <w:szCs w:val="21"/>
+        </w:rPr>
+        <w:t xml:space="preserve">Clicar Importar. Leva de um a dois minutos para 200 trechos (o sistema gera os vetores de cada um).</w:t>
       </w:r>
     </w:p>
     <w:p>
@@ -30917,7 +31181,7 @@
         <w:rPr>
           <w:rFonts w:ascii="Calibri" w:cs="Calibri" w:eastAsia="Calibri" w:hAnsi="Calibri"/>
         </w:rPr>
-        <w:t xml:space="preserve">Erros frequentes</w:t>
+        <w:t xml:space="preserve">Campos da tela</w:t>
       </w:r>
     </w:p>
     <w:tbl>
@@ -30968,7 +31232,7 @@
                 <w:sz w:val="20"/>
                 <w:szCs w:val="20"/>
               </w:rPr>
-              <w:t xml:space="preserve">Mensagem / Sintoma</w:t>
+              <w:t xml:space="preserve">Campo / Elemento</w:t>
             </w:r>
           </w:p>
         </w:tc>
@@ -30999,7 +31263,7 @@
                 <w:sz w:val="20"/>
                 <w:szCs w:val="20"/>
               </w:rPr>
-              <w:t xml:space="preserve">Causa e solução</w:t>
+              <w:t xml:space="preserve">Descrição</w:t>
             </w:r>
           </w:p>
         </w:tc>
@@ -31034,7 +31298,7 @@
                 <w:sz w:val="20"/>
                 <w:szCs w:val="20"/>
               </w:rPr>
-              <w:t xml:space="preserve">unauthorized</w:t>
+              <w:t xml:space="preserve">Grupo</w:t>
             </w:r>
           </w:p>
         </w:tc>
@@ -31063,7 +31327,7 @@
                 <w:sz w:val="20"/>
                 <w:szCs w:val="20"/>
               </w:rPr>
-              <w:t xml:space="preserve">Chave ausente, revogada ou expirada. Gerar nova chave.</w:t>
+              <w:t xml:space="preserve">Grupo onde os memos serão criados. Só os membros desse grupo terão respostas a partir deles.</w:t>
             </w:r>
           </w:p>
         </w:tc>
@@ -31098,7 +31362,7 @@
                 <w:sz w:val="20"/>
                 <w:szCs w:val="20"/>
               </w:rPr>
-              <w:t xml:space="preserve">forbidden_group</w:t>
+              <w:t xml:space="preserve">Categoria</w:t>
             </w:r>
           </w:p>
         </w:tc>
@@ -31127,7 +31391,263 @@
                 <w:sz w:val="20"/>
                 <w:szCs w:val="20"/>
               </w:rPr>
-              <w:t xml:space="preserve">A chave não pertence ao grupo informado.</w:t>
+              <w:t xml:space="preserve">Categoria dos memos. Precisa estar disponível para o grupo (do grupo ou global).</w:t>
+            </w:r>
+          </w:p>
+        </w:tc>
+      </w:tr>
+      <w:tr>
+        <w:trPr>
+          <w:cantSplit/>
+          <w:tblHeader w:val="false"/>
+        </w:trPr>
+        <w:tc>
+          <w:tcPr>
+            <w:tcW w:type="dxa" w:w="3031"/>
+            <w:tcBorders>
+              <w:top w:val="single" w:color="B7C4D6" w:sz="4"/>
+              <w:left w:val="single" w:color="B7C4D6" w:sz="4"/>
+              <w:bottom w:val="single" w:color="B7C4D6" w:sz="4"/>
+              <w:right w:val="single" w:color="B7C4D6" w:sz="4"/>
+            </w:tcBorders>
+            <w:tcMar>
+              <w:top w:type="dxa" w:w="60"/>
+              <w:left w:type="dxa" w:w="100"/>
+              <w:bottom w:type="dxa" w:w="60"/>
+              <w:right w:type="dxa" w:w="100"/>
+            </w:tcMar>
+          </w:tcPr>
+          <w:p>
+            <w:r>
+              <w:rPr>
+                <w:rFonts w:ascii="Calibri" w:cs="Calibri" w:eastAsia="Calibri" w:hAnsi="Calibri"/>
+                <w:b/>
+                <w:bCs/>
+                <w:sz w:val="20"/>
+                <w:szCs w:val="20"/>
+              </w:rPr>
+              <w:t xml:space="preserve">Arquivo de trechos</w:t>
+            </w:r>
+          </w:p>
+        </w:tc>
+        <w:tc>
+          <w:tcPr>
+            <w:tcW w:type="dxa" w:w="7075"/>
+            <w:tcBorders>
+              <w:top w:val="single" w:color="B7C4D6" w:sz="4"/>
+              <w:left w:val="single" w:color="B7C4D6" w:sz="4"/>
+              <w:bottom w:val="single" w:color="B7C4D6" w:sz="4"/>
+              <w:right w:val="single" w:color="B7C4D6" w:sz="4"/>
+            </w:tcBorders>
+            <w:tcMar>
+              <w:top w:type="dxa" w:w="60"/>
+              <w:left w:type="dxa" w:w="100"/>
+              <w:bottom w:type="dxa" w:w="60"/>
+              <w:right w:type="dxa" w:w="100"/>
+            </w:tcMar>
+          </w:tcPr>
+          <w:p>
+            <w:r>
+              <w:rPr>
+                <w:rFonts w:ascii="Calibri" w:cs="Calibri" w:eastAsia="Calibri" w:hAnsi="Calibri"/>
+                <w:b w:val="false"/>
+                <w:bCs w:val="false"/>
+                <w:sz w:val="20"/>
+                <w:szCs w:val="20"/>
+              </w:rPr>
+              <w:t xml:space="preserve">.jsonl (um JSON por linha) ou .json com uma lista. Cada trecho: id, texto e, opcionalmente, secao, tela, rota, perfil, tipo, versao.</w:t>
+            </w:r>
+          </w:p>
+        </w:tc>
+      </w:tr>
+      <w:tr>
+        <w:trPr>
+          <w:cantSplit/>
+          <w:tblHeader w:val="false"/>
+        </w:trPr>
+        <w:tc>
+          <w:tcPr>
+            <w:tcW w:type="dxa" w:w="3031"/>
+            <w:tcBorders>
+              <w:top w:val="single" w:color="B7C4D6" w:sz="4"/>
+              <w:left w:val="single" w:color="B7C4D6" w:sz="4"/>
+              <w:bottom w:val="single" w:color="B7C4D6" w:sz="4"/>
+              <w:right w:val="single" w:color="B7C4D6" w:sz="4"/>
+            </w:tcBorders>
+            <w:tcMar>
+              <w:top w:type="dxa" w:w="60"/>
+              <w:left w:type="dxa" w:w="100"/>
+              <w:bottom w:type="dxa" w:w="60"/>
+              <w:right w:type="dxa" w:w="100"/>
+            </w:tcMar>
+          </w:tcPr>
+          <w:p>
+            <w:r>
+              <w:rPr>
+                <w:rFonts w:ascii="Calibri" w:cs="Calibri" w:eastAsia="Calibri" w:hAnsi="Calibri"/>
+                <w:b/>
+                <w:bCs/>
+                <w:sz w:val="20"/>
+                <w:szCs w:val="20"/>
+              </w:rPr>
+              <w:t xml:space="preserve">Substituir</w:t>
+            </w:r>
+          </w:p>
+        </w:tc>
+        <w:tc>
+          <w:tcPr>
+            <w:tcW w:type="dxa" w:w="7075"/>
+            <w:tcBorders>
+              <w:top w:val="single" w:color="B7C4D6" w:sz="4"/>
+              <w:left w:val="single" w:color="B7C4D6" w:sz="4"/>
+              <w:bottom w:val="single" w:color="B7C4D6" w:sz="4"/>
+              <w:right w:val="single" w:color="B7C4D6" w:sz="4"/>
+            </w:tcBorders>
+            <w:tcMar>
+              <w:top w:type="dxa" w:w="60"/>
+              <w:left w:type="dxa" w:w="100"/>
+              <w:bottom w:type="dxa" w:w="60"/>
+              <w:right w:type="dxa" w:w="100"/>
+            </w:tcMar>
+          </w:tcPr>
+          <w:p>
+            <w:r>
+              <w:rPr>
+                <w:rFonts w:ascii="Calibri" w:cs="Calibri" w:eastAsia="Calibri" w:hAnsi="Calibri"/>
+                <w:b w:val="false"/>
+                <w:bCs w:val="false"/>
+                <w:sz w:val="20"/>
+                <w:szCs w:val="20"/>
+              </w:rPr>
+              <w:t xml:space="preserve">Desativa os trechos importados antes na mesma categoria e grupo antes de criar os novos.</w:t>
+            </w:r>
+          </w:p>
+        </w:tc>
+      </w:tr>
+      <w:tr>
+        <w:trPr>
+          <w:cantSplit/>
+          <w:tblHeader w:val="false"/>
+        </w:trPr>
+        <w:tc>
+          <w:tcPr>
+            <w:tcW w:type="dxa" w:w="3031"/>
+            <w:tcBorders>
+              <w:top w:val="single" w:color="B7C4D6" w:sz="4"/>
+              <w:left w:val="single" w:color="B7C4D6" w:sz="4"/>
+              <w:bottom w:val="single" w:color="B7C4D6" w:sz="4"/>
+              <w:right w:val="single" w:color="B7C4D6" w:sz="4"/>
+            </w:tcBorders>
+            <w:tcMar>
+              <w:top w:type="dxa" w:w="60"/>
+              <w:left w:type="dxa" w:w="100"/>
+              <w:bottom w:type="dxa" w:w="60"/>
+              <w:right w:type="dxa" w:w="100"/>
+            </w:tcMar>
+          </w:tcPr>
+          <w:p>
+            <w:r>
+              <w:rPr>
+                <w:rFonts w:ascii="Calibri" w:cs="Calibri" w:eastAsia="Calibri" w:hAnsi="Calibri"/>
+                <w:b/>
+                <w:bCs/>
+                <w:sz w:val="20"/>
+                <w:szCs w:val="20"/>
+              </w:rPr>
+              <w:t xml:space="preserve">Importar</w:t>
+            </w:r>
+          </w:p>
+        </w:tc>
+        <w:tc>
+          <w:tcPr>
+            <w:tcW w:type="dxa" w:w="7075"/>
+            <w:tcBorders>
+              <w:top w:val="single" w:color="B7C4D6" w:sz="4"/>
+              <w:left w:val="single" w:color="B7C4D6" w:sz="4"/>
+              <w:bottom w:val="single" w:color="B7C4D6" w:sz="4"/>
+              <w:right w:val="single" w:color="B7C4D6" w:sz="4"/>
+            </w:tcBorders>
+            <w:tcMar>
+              <w:top w:type="dxa" w:w="60"/>
+              <w:left w:type="dxa" w:w="100"/>
+              <w:bottom w:type="dxa" w:w="60"/>
+              <w:right w:type="dxa" w:w="100"/>
+            </w:tcMar>
+          </w:tcPr>
+          <w:p>
+            <w:r>
+              <w:rPr>
+                <w:rFonts w:ascii="Calibri" w:cs="Calibri" w:eastAsia="Calibri" w:hAnsi="Calibri"/>
+                <w:b w:val="false"/>
+                <w:bCs w:val="false"/>
+                <w:sz w:val="20"/>
+                <w:szCs w:val="20"/>
+              </w:rPr>
+              <w:t xml:space="preserve">Cria os memos e mostra o resultado: criados, substituídos e erros.</w:t>
+            </w:r>
+          </w:p>
+        </w:tc>
+      </w:tr>
+      <w:tr>
+        <w:trPr>
+          <w:cantSplit/>
+          <w:tblHeader w:val="false"/>
+        </w:trPr>
+        <w:tc>
+          <w:tcPr>
+            <w:tcW w:type="dxa" w:w="3031"/>
+            <w:tcBorders>
+              <w:top w:val="single" w:color="B7C4D6" w:sz="4"/>
+              <w:left w:val="single" w:color="B7C4D6" w:sz="4"/>
+              <w:bottom w:val="single" w:color="B7C4D6" w:sz="4"/>
+              <w:right w:val="single" w:color="B7C4D6" w:sz="4"/>
+            </w:tcBorders>
+            <w:tcMar>
+              <w:top w:type="dxa" w:w="60"/>
+              <w:left w:type="dxa" w:w="100"/>
+              <w:bottom w:type="dxa" w:w="60"/>
+              <w:right w:type="dxa" w:w="100"/>
+            </w:tcMar>
+          </w:tcPr>
+          <w:p>
+            <w:r>
+              <w:rPr>
+                <w:rFonts w:ascii="Calibri" w:cs="Calibri" w:eastAsia="Calibri" w:hAnsi="Calibri"/>
+                <w:b/>
+                <w:bCs/>
+                <w:sz w:val="20"/>
+                <w:szCs w:val="20"/>
+              </w:rPr>
+              <w:t xml:space="preserve">Já importado neste grupo</w:t>
+            </w:r>
+          </w:p>
+        </w:tc>
+        <w:tc>
+          <w:tcPr>
+            <w:tcW w:type="dxa" w:w="7075"/>
+            <w:tcBorders>
+              <w:top w:val="single" w:color="B7C4D6" w:sz="4"/>
+              <w:left w:val="single" w:color="B7C4D6" w:sz="4"/>
+              <w:bottom w:val="single" w:color="B7C4D6" w:sz="4"/>
+              <w:right w:val="single" w:color="B7C4D6" w:sz="4"/>
+            </w:tcBorders>
+            <w:tcMar>
+              <w:top w:type="dxa" w:w="60"/>
+              <w:left w:type="dxa" w:w="100"/>
+              <w:bottom w:type="dxa" w:w="60"/>
+              <w:right w:type="dxa" w:w="100"/>
+            </w:tcMar>
+          </w:tcPr>
+          <w:p>
+            <w:r>
+              <w:rPr>
+                <w:rFonts w:ascii="Calibri" w:cs="Calibri" w:eastAsia="Calibri" w:hAnsi="Calibri"/>
+                <w:b w:val="false"/>
+                <w:bCs w:val="false"/>
+                <w:sz w:val="20"/>
+                <w:szCs w:val="20"/>
+              </w:rPr>
+              <w:t xml:space="preserve">Lista categoria, quantidade de trechos, versão e data da última importação, com o botão Remover.</w:t>
             </w:r>
           </w:p>
         </w:tc>
@@ -31137,18 +31657,6 @@
       <w:pPr>
         <w:spacing w:after="60"/>
       </w:pPr>
-    </w:p>
-    <w:p>
-      <w:pPr>
-        <w:pStyle w:val="Heading1"/>
-        <w:pageBreakBefore/>
-      </w:pPr>
-      <w:r>
-        <w:rPr>
-          <w:rFonts w:ascii="Calibri" w:cs="Calibri" w:eastAsia="Calibri" w:hAnsi="Calibri"/>
-        </w:rPr>
-        <w:t xml:space="preserve">SEÇÃO 28 — Erros Comuns e Soluções</w:t>
-      </w:r>
     </w:p>
     <w:p>
       <w:pPr>
@@ -31159,7 +31667,109 @@
         <w:rPr>
           <w:rFonts w:ascii="Calibri" w:cs="Calibri" w:eastAsia="Calibri" w:hAnsi="Calibri"/>
         </w:rPr>
-        <w:t xml:space="preserve">Erros de sessão / autenticação</w:t>
+        <w:t xml:space="preserve">Regras importantes</w:t>
+      </w:r>
+    </w:p>
+    <w:p>
+      <w:pPr>
+        <w:pStyle w:val="ListParagraph"/>
+        <w:numPr>
+          <w:ilvl w:val="0"/>
+          <w:numId w:val="2"/>
+        </w:numPr>
+        <w:spacing w:after="60"/>
+      </w:pPr>
+      <w:r>
+        <w:rPr>
+          <w:rFonts w:ascii="Calibri" w:cs="Calibri" w:eastAsia="Calibri" w:hAnsi="Calibri"/>
+          <w:sz w:val="21"/>
+          <w:szCs w:val="21"/>
+        </w:rPr>
+        <w:t xml:space="preserve">O texto entra exatamente como no arquivo (sem acentos, como todos os memos do sistema); a IA não reescreve nem classifica.</w:t>
+      </w:r>
+    </w:p>
+    <w:p>
+      <w:pPr>
+        <w:pStyle w:val="ListParagraph"/>
+        <w:numPr>
+          <w:ilvl w:val="0"/>
+          <w:numId w:val="2"/>
+        </w:numPr>
+        <w:spacing w:after="60"/>
+      </w:pPr>
+      <w:r>
+        <w:rPr>
+          <w:rFonts w:ascii="Calibri" w:cs="Calibri" w:eastAsia="Calibri" w:hAnsi="Calibri"/>
+          <w:sz w:val="21"/>
+          <w:szCs w:val="21"/>
+        </w:rPr>
+        <w:t xml:space="preserve">Não há custo de IA de extração; só a geração dos vetores da busca semântica (alguns centavos para 200 trechos).</w:t>
+      </w:r>
+    </w:p>
+    <w:p>
+      <w:pPr>
+        <w:pStyle w:val="ListParagraph"/>
+        <w:numPr>
+          <w:ilvl w:val="0"/>
+          <w:numId w:val="2"/>
+        </w:numPr>
+        <w:spacing w:after="60"/>
+      </w:pPr>
+      <w:r>
+        <w:rPr>
+          <w:rFonts w:ascii="Calibri" w:cs="Calibri" w:eastAsia="Calibri" w:hAnsi="Calibri"/>
+          <w:sz w:val="21"/>
+          <w:szCs w:val="21"/>
+        </w:rPr>
+        <w:t xml:space="preserve">Os memos importados aparecem nos Recentes do grupo e podem ser abertos e editados como qualquer memo de texto.</w:t>
+      </w:r>
+    </w:p>
+    <w:p>
+      <w:pPr>
+        <w:pStyle w:val="ListParagraph"/>
+        <w:numPr>
+          <w:ilvl w:val="0"/>
+          <w:numId w:val="2"/>
+        </w:numPr>
+        <w:spacing w:after="60"/>
+      </w:pPr>
+      <w:r>
+        <w:rPr>
+          <w:rFonts w:ascii="Calibri" w:cs="Calibri" w:eastAsia="Calibri" w:hAnsi="Calibri"/>
+          <w:sz w:val="21"/>
+          <w:szCs w:val="21"/>
+        </w:rPr>
+        <w:t xml:space="preserve">Remover desativa os memos (exclusão lógica); eles deixam de ser usados nas respostas.</w:t>
+      </w:r>
+    </w:p>
+    <w:p>
+      <w:pPr>
+        <w:pStyle w:val="ListParagraph"/>
+        <w:numPr>
+          <w:ilvl w:val="0"/>
+          <w:numId w:val="2"/>
+        </w:numPr>
+        <w:spacing w:after="60"/>
+      </w:pPr>
+      <w:r>
+        <w:rPr>
+          <w:rFonts w:ascii="Calibri" w:cs="Calibri" w:eastAsia="Calibri" w:hAnsi="Calibri"/>
+          <w:sz w:val="21"/>
+          <w:szCs w:val="21"/>
+        </w:rPr>
+        <w:t xml:space="preserve">A Importação em Lote (Seção 16) não serve para isso: pelo WebDAV ela não lê o conteúdo dos arquivos e não aplica IA.</w:t>
+      </w:r>
+    </w:p>
+    <w:p>
+      <w:pPr>
+        <w:pStyle w:val="Heading2"/>
+        <w:keepNext/>
+      </w:pPr>
+      <w:r>
+        <w:rPr>
+          <w:rFonts w:ascii="Calibri" w:cs="Calibri" w:eastAsia="Calibri" w:hAnsi="Calibri"/>
+        </w:rPr>
+        <w:t xml:space="preserve">Erros frequentes</w:t>
       </w:r>
     </w:p>
     <w:tbl>
@@ -31276,7 +31886,7 @@
                 <w:sz w:val="20"/>
                 <w:szCs w:val="20"/>
               </w:rPr>
-              <w:t xml:space="preserve">HTTP 401 / Não autorizado</w:t>
+              <w:t xml:space="preserve">Linha N não é JSON válido</w:t>
             </w:r>
           </w:p>
         </w:tc>
@@ -31305,7 +31915,7 @@
                 <w:sz w:val="20"/>
                 <w:szCs w:val="20"/>
               </w:rPr>
-              <w:t xml:space="preserve">Sessão expirada. Usuário deve fazer login novamente.</w:t>
+              <w:t xml:space="preserve">O arquivo não está no formato JSON Lines. Gerar de novo com docs/manual-v2-fonte/gerar_trechos.py.</w:t>
             </w:r>
           </w:p>
         </w:tc>
@@ -31340,7 +31950,7 @@
                 <w:sz w:val="20"/>
                 <w:szCs w:val="20"/>
               </w:rPr>
-              <w:t xml:space="preserve">HTTP 403 / Acesso negado</w:t>
+              <w:t xml:space="preserve">Trecho N sem "id" ou "texto"</w:t>
             </w:r>
           </w:p>
         </w:tc>
@@ -31369,7 +31979,7 @@
                 <w:sz w:val="20"/>
                 <w:szCs w:val="20"/>
               </w:rPr>
-              <w:t xml:space="preserve">Usuário logado não tem permissão para o recurso (grupo, memo de outro usuário, rota admin).</w:t>
+              <w:t xml:space="preserve">Cada linha precisa ter os campos id e texto.</w:t>
             </w:r>
           </w:p>
         </w:tc>
@@ -31404,7 +32014,7 @@
                 <w:sz w:val="20"/>
                 <w:szCs w:val="20"/>
               </w:rPr>
-              <w:t xml:space="preserve">Cookie mm_access ausente</w:t>
+              <w:t xml:space="preserve">Categoria não disponível para este grupo</w:t>
             </w:r>
           </w:p>
         </w:tc>
@@ -31433,7 +32043,71 @@
                 <w:sz w:val="20"/>
                 <w:szCs w:val="20"/>
               </w:rPr>
-              <w:t xml:space="preserve">Usuário não logou ou cookie foi apagado. Refazer login.</w:t>
+              <w:t xml:space="preserve">A categoria é de outro grupo. Usar uma categoria do grupo ou global.</w:t>
+            </w:r>
+          </w:p>
+        </w:tc>
+      </w:tr>
+      <w:tr>
+        <w:trPr>
+          <w:cantSplit/>
+          <w:tblHeader w:val="false"/>
+        </w:trPr>
+        <w:tc>
+          <w:tcPr>
+            <w:tcW w:type="dxa" w:w="3031"/>
+            <w:tcBorders>
+              <w:top w:val="single" w:color="B7C4D6" w:sz="4"/>
+              <w:left w:val="single" w:color="B7C4D6" w:sz="4"/>
+              <w:bottom w:val="single" w:color="B7C4D6" w:sz="4"/>
+              <w:right w:val="single" w:color="B7C4D6" w:sz="4"/>
+            </w:tcBorders>
+            <w:tcMar>
+              <w:top w:type="dxa" w:w="60"/>
+              <w:left w:type="dxa" w:w="100"/>
+              <w:bottom w:type="dxa" w:w="60"/>
+              <w:right w:type="dxa" w:w="100"/>
+            </w:tcMar>
+          </w:tcPr>
+          <w:p>
+            <w:r>
+              <w:rPr>
+                <w:rFonts w:ascii="Calibri" w:cs="Calibri" w:eastAsia="Calibri" w:hAnsi="Calibri"/>
+                <w:b/>
+                <w:bCs/>
+                <w:sz w:val="20"/>
+                <w:szCs w:val="20"/>
+              </w:rPr>
+              <w:t xml:space="preserve">Perguntas não usam os trechos importados</w:t>
+            </w:r>
+          </w:p>
+        </w:tc>
+        <w:tc>
+          <w:tcPr>
+            <w:tcW w:type="dxa" w:w="7075"/>
+            <w:tcBorders>
+              <w:top w:val="single" w:color="B7C4D6" w:sz="4"/>
+              <w:left w:val="single" w:color="B7C4D6" w:sz="4"/>
+              <w:bottom w:val="single" w:color="B7C4D6" w:sz="4"/>
+              <w:right w:val="single" w:color="B7C4D6" w:sz="4"/>
+            </w:tcBorders>
+            <w:tcMar>
+              <w:top w:type="dxa" w:w="60"/>
+              <w:left w:type="dxa" w:w="100"/>
+              <w:bottom w:type="dxa" w:w="60"/>
+              <w:right w:type="dxa" w:w="100"/>
+            </w:tcMar>
+          </w:tcPr>
+          <w:p>
+            <w:r>
+              <w:rPr>
+                <w:rFonts w:ascii="Calibri" w:cs="Calibri" w:eastAsia="Calibri" w:hAnsi="Calibri"/>
+                <w:b w:val="false"/>
+                <w:bCs w:val="false"/>
+                <w:sz w:val="20"/>
+                <w:szCs w:val="20"/>
+              </w:rPr>
+              <w:t xml:space="preserve">Conferir se a pergunta foi feita no mesmo grupo da importação e se a busca semântica está ativa (OPENAI_API_KEY configurada).</w:t>
             </w:r>
           </w:p>
         </w:tc>
@@ -31443,6 +32117,18 @@
       <w:pPr>
         <w:spacing w:after="60"/>
       </w:pPr>
+    </w:p>
+    <w:p>
+      <w:pPr>
+        <w:pStyle w:val="Heading1"/>
+        <w:pageBreakBefore/>
+      </w:pPr>
+      <w:r>
+        <w:rPr>
+          <w:rFonts w:ascii="Calibri" w:cs="Calibri" w:eastAsia="Calibri" w:hAnsi="Calibri"/>
+        </w:rPr>
+        <w:t xml:space="preserve">SEÇÃO 28 — Integrações externas (chave de API)</w:t>
+      </w:r>
     </w:p>
     <w:p>
       <w:pPr>
@@ -31453,7 +32139,116 @@
         <w:rPr>
           <w:rFonts w:ascii="Calibri" w:cs="Calibri" w:eastAsia="Calibri" w:hAnsi="Calibri"/>
         </w:rPr>
-        <w:t xml:space="preserve">Erros de API / servidor</w:t>
+        <w:t xml:space="preserve">Propósito</w:t>
+      </w:r>
+    </w:p>
+    <w:p>
+      <w:pPr>
+        <w:spacing w:after="120"/>
+      </w:pPr>
+      <w:r>
+        <w:rPr>
+          <w:rFonts w:ascii="Calibri" w:cs="Calibri" w:eastAsia="Calibri" w:hAnsi="Calibri"/>
+          <w:sz w:val="21"/>
+          <w:szCs w:val="21"/>
+        </w:rPr>
+        <w:t xml:space="preserve">Sistemas externos, como o Softing-erp, podem fazer perguntas ao MyMemory em nome de um grupo sem login de usuário, usando uma chave de API do grupo.</w:t>
+      </w:r>
+    </w:p>
+    <w:p>
+      <w:pPr>
+        <w:pStyle w:val="Heading2"/>
+        <w:keepNext/>
+      </w:pPr>
+      <w:r>
+        <w:rPr>
+          <w:rFonts w:ascii="Calibri" w:cs="Calibri" w:eastAsia="Calibri" w:hAnsi="Calibri"/>
+        </w:rPr>
+        <w:t xml:space="preserve">Funcionamento</w:t>
+      </w:r>
+    </w:p>
+    <w:p>
+      <w:pPr>
+        <w:pStyle w:val="ListParagraph"/>
+        <w:numPr>
+          <w:ilvl w:val="0"/>
+          <w:numId w:val="2"/>
+        </w:numPr>
+        <w:spacing w:after="60"/>
+      </w:pPr>
+      <w:r>
+        <w:rPr>
+          <w:rFonts w:ascii="Calibri" w:cs="Calibri" w:eastAsia="Calibri" w:hAnsi="Calibri"/>
+          <w:sz w:val="21"/>
+          <w:szCs w:val="21"/>
+        </w:rPr>
+        <w:t xml:space="preserve">A chave é criada por um administrador e vinculada a um grupo e a um usuário de referência. Só o prefixo da chave fica visível depois de criada.</w:t>
+      </w:r>
+    </w:p>
+    <w:p>
+      <w:pPr>
+        <w:pStyle w:val="ListParagraph"/>
+        <w:numPr>
+          <w:ilvl w:val="0"/>
+          <w:numId w:val="2"/>
+        </w:numPr>
+        <w:spacing w:after="60"/>
+      </w:pPr>
+      <w:r>
+        <w:rPr>
+          <w:rFonts w:ascii="Calibri" w:cs="Calibri" w:eastAsia="Calibri" w:hAnsi="Calibri"/>
+          <w:sz w:val="21"/>
+          <w:szCs w:val="21"/>
+        </w:rPr>
+        <w:t xml:space="preserve">O sistema externo envia a chave no cabeçalho da requisição para /api/perguntas.</w:t>
+      </w:r>
+    </w:p>
+    <w:p>
+      <w:pPr>
+        <w:pStyle w:val="ListParagraph"/>
+        <w:numPr>
+          <w:ilvl w:val="0"/>
+          <w:numId w:val="2"/>
+        </w:numPr>
+        <w:spacing w:after="60"/>
+      </w:pPr>
+      <w:r>
+        <w:rPr>
+          <w:rFonts w:ascii="Calibri" w:cs="Calibri" w:eastAsia="Calibri" w:hAnsi="Calibri"/>
+          <w:sz w:val="21"/>
+          <w:szCs w:val="21"/>
+        </w:rPr>
+        <w:t xml:space="preserve">Pode enviar também o "contexto da tela" (tela, filtros e seleção de onde a pergunta partiu); a IA usa esse contexto para interpretar a pergunta.</w:t>
+      </w:r>
+    </w:p>
+    <w:p>
+      <w:pPr>
+        <w:pStyle w:val="ListParagraph"/>
+        <w:numPr>
+          <w:ilvl w:val="0"/>
+          <w:numId w:val="2"/>
+        </w:numPr>
+        <w:spacing w:after="60"/>
+      </w:pPr>
+      <w:r>
+        <w:rPr>
+          <w:rFonts w:ascii="Calibri" w:cs="Calibri" w:eastAsia="Calibri" w:hAnsi="Calibri"/>
+          <w:sz w:val="21"/>
+          <w:szCs w:val="21"/>
+        </w:rPr>
+        <w:t xml:space="preserve">Chaves podem ser revogadas a qualquer momento; o uso fica registrado (último uso).</w:t>
+      </w:r>
+    </w:p>
+    <w:p>
+      <w:pPr>
+        <w:pStyle w:val="Heading2"/>
+        <w:keepNext/>
+      </w:pPr>
+      <w:r>
+        <w:rPr>
+          <w:rFonts w:ascii="Calibri" w:cs="Calibri" w:eastAsia="Calibri" w:hAnsi="Calibri"/>
+        </w:rPr>
+        <w:t xml:space="preserve">Erros frequentes</w:t>
       </w:r>
     </w:p>
     <w:tbl>
@@ -31570,7 +32365,7 @@
                 <w:sz w:val="20"/>
                 <w:szCs w:val="20"/>
               </w:rPr>
-              <w:t xml:space="preserve">Não foi possível conectar à API</w:t>
+              <w:t xml:space="preserve">unauthorized</w:t>
             </w:r>
           </w:p>
         </w:tc>
@@ -31599,7 +32394,7 @@
                 <w:sz w:val="20"/>
                 <w:szCs w:val="20"/>
               </w:rPr>
-              <w:t xml:space="preserve">Container da API parado. Executar: docker compose ps e docker compose up -d api.</w:t>
+              <w:t xml:space="preserve">Chave ausente, revogada ou expirada. Gerar nova chave.</w:t>
             </w:r>
           </w:p>
         </w:tc>
@@ -31634,7 +32429,7 @@
                 <w:sz w:val="20"/>
                 <w:szCs w:val="20"/>
               </w:rPr>
-              <w:t xml:space="preserve">HTTP 500 / Erro interno</w:t>
+              <w:t xml:space="preserve">forbidden_group</w:t>
             </w:r>
           </w:p>
         </w:tc>
@@ -31663,71 +32458,7 @@
                 <w:sz w:val="20"/>
                 <w:szCs w:val="20"/>
               </w:rPr>
-              <w:t xml:space="preserve">Exceção não tratada na API. Ver logs: docker compose logs api --tail=50.</w:t>
-            </w:r>
-          </w:p>
-        </w:tc>
-      </w:tr>
-      <w:tr>
-        <w:trPr>
-          <w:cantSplit/>
-          <w:tblHeader w:val="false"/>
-        </w:trPr>
-        <w:tc>
-          <w:tcPr>
-            <w:tcW w:type="dxa" w:w="3031"/>
-            <w:tcBorders>
-              <w:top w:val="single" w:color="B7C4D6" w:sz="4"/>
-              <w:left w:val="single" w:color="B7C4D6" w:sz="4"/>
-              <w:bottom w:val="single" w:color="B7C4D6" w:sz="4"/>
-              <w:right w:val="single" w:color="B7C4D6" w:sz="4"/>
-            </w:tcBorders>
-            <w:tcMar>
-              <w:top w:type="dxa" w:w="60"/>
-              <w:left w:type="dxa" w:w="100"/>
-              <w:bottom w:type="dxa" w:w="60"/>
-              <w:right w:type="dxa" w:w="100"/>
-            </w:tcMar>
-          </w:tcPr>
-          <w:p>
-            <w:r>
-              <w:rPr>
-                <w:rFonts w:ascii="Calibri" w:cs="Calibri" w:eastAsia="Calibri" w:hAnsi="Calibri"/>
-                <w:b/>
-                <w:bCs/>
-                <w:sz w:val="20"/>
-                <w:szCs w:val="20"/>
-              </w:rPr>
-              <w:t xml:space="preserve">Database connection error</w:t>
-            </w:r>
-          </w:p>
-        </w:tc>
-        <w:tc>
-          <w:tcPr>
-            <w:tcW w:type="dxa" w:w="7075"/>
-            <w:tcBorders>
-              <w:top w:val="single" w:color="B7C4D6" w:sz="4"/>
-              <w:left w:val="single" w:color="B7C4D6" w:sz="4"/>
-              <w:bottom w:val="single" w:color="B7C4D6" w:sz="4"/>
-              <w:right w:val="single" w:color="B7C4D6" w:sz="4"/>
-            </w:tcBorders>
-            <w:tcMar>
-              <w:top w:type="dxa" w:w="60"/>
-              <w:left w:type="dxa" w:w="100"/>
-              <w:bottom w:type="dxa" w:w="60"/>
-              <w:right w:type="dxa" w:w="100"/>
-            </w:tcMar>
-          </w:tcPr>
-          <w:p>
-            <w:r>
-              <w:rPr>
-                <w:rFonts w:ascii="Calibri" w:cs="Calibri" w:eastAsia="Calibri" w:hAnsi="Calibri"/>
-                <w:b w:val="false"/>
-                <w:bCs w:val="false"/>
-                <w:sz w:val="20"/>
-                <w:szCs w:val="20"/>
-              </w:rPr>
-              <w:t xml:space="preserve">Banco de dados PostgreSQL inacessível. Verificar: docker compose ps db.</w:t>
+              <w:t xml:space="preserve">A chave não pertence ao grupo informado.</w:t>
             </w:r>
           </w:p>
         </w:tc>
@@ -31737,6 +32468,18 @@
       <w:pPr>
         <w:spacing w:after="60"/>
       </w:pPr>
+    </w:p>
+    <w:p>
+      <w:pPr>
+        <w:pStyle w:val="Heading1"/>
+        <w:pageBreakBefore/>
+      </w:pPr>
+      <w:r>
+        <w:rPr>
+          <w:rFonts w:ascii="Calibri" w:cs="Calibri" w:eastAsia="Calibri" w:hAnsi="Calibri"/>
+        </w:rPr>
+        <w:t xml:space="preserve">SEÇÃO 29 — Erros Comuns e Soluções</w:t>
+      </w:r>
     </w:p>
     <w:p>
       <w:pPr>
@@ -31747,7 +32490,7 @@
         <w:rPr>
           <w:rFonts w:ascii="Calibri" w:cs="Calibri" w:eastAsia="Calibri" w:hAnsi="Calibri"/>
         </w:rPr>
-        <w:t xml:space="preserve">Erros de processamento de IA</w:t>
+        <w:t xml:space="preserve">Erros de sessão / autenticação</w:t>
       </w:r>
     </w:p>
     <w:tbl>
@@ -31864,7 +32607,7 @@
                 <w:sz w:val="20"/>
                 <w:szCs w:val="20"/>
               </w:rPr>
-              <w:t xml:space="preserve">OpenAI API error / Insufficient credits</w:t>
+              <w:t xml:space="preserve">HTTP 401 / Não autorizado</w:t>
             </w:r>
           </w:p>
         </w:tc>
@@ -31893,7 +32636,7 @@
                 <w:sz w:val="20"/>
                 <w:szCs w:val="20"/>
               </w:rPr>
-              <w:t xml:space="preserve">Créditos OpenAI esgotados ou chave inválida. Verificar em /admin → aba IA.</w:t>
+              <w:t xml:space="preserve">Sessão expirada. Usuário deve fazer login novamente.</w:t>
             </w:r>
           </w:p>
         </w:tc>
@@ -31928,7 +32671,7 @@
                 <w:sz w:val="20"/>
                 <w:szCs w:val="20"/>
               </w:rPr>
-              <w:t xml:space="preserve">Créditos do plano esgotados</w:t>
+              <w:t xml:space="preserve">HTTP 403 / Acesso negado</w:t>
             </w:r>
           </w:p>
         </w:tc>
@@ -31957,7 +32700,7 @@
                 <w:sz w:val="20"/>
                 <w:szCs w:val="20"/>
               </w:rPr>
-              <w:t xml:space="preserve">Limite mensal do usuário atingido. Admin pode ajustar o plano em /admin/assinaturas.</w:t>
+              <w:t xml:space="preserve">Usuário logado não tem permissão para o recurso (grupo, memo de outro usuário, rota admin).</w:t>
             </w:r>
           </w:p>
         </w:tc>
@@ -31992,7 +32735,7 @@
                 <w:sz w:val="20"/>
                 <w:szCs w:val="20"/>
               </w:rPr>
-              <w:t xml:space="preserve">Transcription failed</w:t>
+              <w:t xml:space="preserve">Cookie mm_access ausente</w:t>
             </w:r>
           </w:p>
         </w:tc>
@@ -32021,7 +32764,7 @@
                 <w:sz w:val="20"/>
                 <w:szCs w:val="20"/>
               </w:rPr>
-              <w:t xml:space="preserve">FFmpeg não instalado ou arquivo de áudio/vídeo corrompido.</w:t>
+              <w:t xml:space="preserve">Usuário não logou ou cookie foi apagado. Refazer login.</w:t>
             </w:r>
           </w:p>
         </w:tc>
@@ -32041,7 +32784,7 @@
         <w:rPr>
           <w:rFonts w:ascii="Calibri" w:cs="Calibri" w:eastAsia="Calibri" w:hAnsi="Calibri"/>
         </w:rPr>
-        <w:t xml:space="preserve">Erros de armazenamento</w:t>
+        <w:t xml:space="preserve">Erros de API / servidor</w:t>
       </w:r>
     </w:p>
     <w:tbl>
@@ -32158,7 +32901,7 @@
                 <w:sz w:val="20"/>
                 <w:szCs w:val="20"/>
               </w:rPr>
-              <w:t xml:space="preserve">S3 upload failed</w:t>
+              <w:t xml:space="preserve">Não foi possível conectar à API</w:t>
             </w:r>
           </w:p>
         </w:tc>
@@ -32187,7 +32930,7 @@
                 <w:sz w:val="20"/>
                 <w:szCs w:val="20"/>
               </w:rPr>
-              <w:t xml:space="preserve">Credenciais S3/MinIO inválidas ou bucket inexistente. Verificar variáveis S3_* no .env.</w:t>
+              <w:t xml:space="preserve">Container da API parado. Executar: docker compose ps e docker compose up -d api.</w:t>
             </w:r>
           </w:p>
         </w:tc>
@@ -32222,7 +32965,7 @@
                 <w:sz w:val="20"/>
                 <w:szCs w:val="20"/>
               </w:rPr>
-              <w:t xml:space="preserve">WebDAV put failed</w:t>
+              <w:t xml:space="preserve">HTTP 500 / Erro interno</w:t>
             </w:r>
           </w:p>
         </w:tc>
@@ -32251,7 +32994,7 @@
                 <w:sz w:val="20"/>
                 <w:szCs w:val="20"/>
               </w:rPr>
-              <w:t xml:space="preserve">Servidor WebDAV inacessível ou sem permissão de escrita na pasta de destino.</w:t>
+              <w:t xml:space="preserve">Exceção não tratada na API. Ver logs: docker compose logs api --tail=50.</w:t>
             </w:r>
           </w:p>
         </w:tc>
@@ -32286,7 +33029,7 @@
                 <w:sz w:val="20"/>
                 <w:szCs w:val="20"/>
               </w:rPr>
-              <w:t xml:space="preserve">Arquivo não encontrado no disco</w:t>
+              <w:t xml:space="preserve">Database connection error</w:t>
             </w:r>
           </w:p>
         </w:tc>
@@ -32315,7 +33058,7 @@
                 <w:sz w:val="20"/>
                 <w:szCs w:val="20"/>
               </w:rPr>
-              <w:t xml:space="preserve">Caminho no Batch Import inexistente ou sem permissão de leitura para o processo da API.</w:t>
+              <w:t xml:space="preserve">Banco de dados PostgreSQL inacessível. Verificar: docker compose ps db.</w:t>
             </w:r>
           </w:p>
         </w:tc>
@@ -32335,7 +33078,7 @@
         <w:rPr>
           <w:rFonts w:ascii="Calibri" w:cs="Calibri" w:eastAsia="Calibri" w:hAnsi="Calibri"/>
         </w:rPr>
-        <w:t xml:space="preserve">Erros de e-mail (Resend)</w:t>
+        <w:t xml:space="preserve">Erros de processamento de IA</w:t>
       </w:r>
     </w:p>
     <w:tbl>
@@ -32452,7 +33195,7 @@
                 <w:sz w:val="20"/>
                 <w:szCs w:val="20"/>
               </w:rPr>
-              <w:t xml:space="preserve">emailSendFailed: true após cadastro</w:t>
+              <w:t xml:space="preserve">OpenAI API error / Insufficient credits</w:t>
             </w:r>
           </w:p>
         </w:tc>
@@ -32481,7 +33224,7 @@
                 <w:sz w:val="20"/>
                 <w:szCs w:val="20"/>
               </w:rPr>
-              <w:t xml:space="preserve">Resend não enviou o e-mail. Verificar: domínio verificado na Resend, chave RESEND_API_KEY válida, e-mail remetente configurado.</w:t>
+              <w:t xml:space="preserve">Créditos OpenAI esgotados ou chave inválida. Verificar em /admin → aba IA.</w:t>
             </w:r>
           </w:p>
         </w:tc>
@@ -32516,7 +33259,7 @@
                 <w:sz w:val="20"/>
                 <w:szCs w:val="20"/>
               </w:rPr>
-              <w:t xml:space="preserve">E-mail de confirmação não chega</w:t>
+              <w:t xml:space="preserve">Créditos do plano esgotados</w:t>
             </w:r>
           </w:p>
         </w:tc>
@@ -32545,7 +33288,71 @@
                 <w:sz w:val="20"/>
                 <w:szCs w:val="20"/>
               </w:rPr>
-              <w:t xml:space="preserve">Verificar spam / Promoções. Reenviar pelo botão na tela de Login.</w:t>
+              <w:t xml:space="preserve">Limite mensal do usuário atingido. Admin pode ajustar o plano em /admin/assinaturas.</w:t>
+            </w:r>
+          </w:p>
+        </w:tc>
+      </w:tr>
+      <w:tr>
+        <w:trPr>
+          <w:cantSplit/>
+          <w:tblHeader w:val="false"/>
+        </w:trPr>
+        <w:tc>
+          <w:tcPr>
+            <w:tcW w:type="dxa" w:w="3031"/>
+            <w:tcBorders>
+              <w:top w:val="single" w:color="B7C4D6" w:sz="4"/>
+              <w:left w:val="single" w:color="B7C4D6" w:sz="4"/>
+              <w:bottom w:val="single" w:color="B7C4D6" w:sz="4"/>
+              <w:right w:val="single" w:color="B7C4D6" w:sz="4"/>
+            </w:tcBorders>
+            <w:tcMar>
+              <w:top w:type="dxa" w:w="60"/>
+              <w:left w:type="dxa" w:w="100"/>
+              <w:bottom w:type="dxa" w:w="60"/>
+              <w:right w:type="dxa" w:w="100"/>
+            </w:tcMar>
+          </w:tcPr>
+          <w:p>
+            <w:r>
+              <w:rPr>
+                <w:rFonts w:ascii="Calibri" w:cs="Calibri" w:eastAsia="Calibri" w:hAnsi="Calibri"/>
+                <w:b/>
+                <w:bCs/>
+                <w:sz w:val="20"/>
+                <w:szCs w:val="20"/>
+              </w:rPr>
+              <w:t xml:space="preserve">Transcription failed</w:t>
+            </w:r>
+          </w:p>
+        </w:tc>
+        <w:tc>
+          <w:tcPr>
+            <w:tcW w:type="dxa" w:w="7075"/>
+            <w:tcBorders>
+              <w:top w:val="single" w:color="B7C4D6" w:sz="4"/>
+              <w:left w:val="single" w:color="B7C4D6" w:sz="4"/>
+              <w:bottom w:val="single" w:color="B7C4D6" w:sz="4"/>
+              <w:right w:val="single" w:color="B7C4D6" w:sz="4"/>
+            </w:tcBorders>
+            <w:tcMar>
+              <w:top w:type="dxa" w:w="60"/>
+              <w:left w:type="dxa" w:w="100"/>
+              <w:bottom w:type="dxa" w:w="60"/>
+              <w:right w:type="dxa" w:w="100"/>
+            </w:tcMar>
+          </w:tcPr>
+          <w:p>
+            <w:r>
+              <w:rPr>
+                <w:rFonts w:ascii="Calibri" w:cs="Calibri" w:eastAsia="Calibri" w:hAnsi="Calibri"/>
+                <w:b w:val="false"/>
+                <w:bCs w:val="false"/>
+                <w:sz w:val="20"/>
+                <w:szCs w:val="20"/>
+              </w:rPr>
+              <w:t xml:space="preserve">FFmpeg não instalado ou arquivo de áudio/vídeo corrompido.</w:t>
             </w:r>
           </w:p>
         </w:tc>
@@ -32565,7 +33372,7 @@
         <w:rPr>
           <w:rFonts w:ascii="Calibri" w:cs="Calibri" w:eastAsia="Calibri" w:hAnsi="Calibri"/>
         </w:rPr>
-        <w:t xml:space="preserve">Erros de perguntas e queries</w:t>
+        <w:t xml:space="preserve">Erros de armazenamento</w:t>
       </w:r>
     </w:p>
     <w:tbl>
@@ -32682,7 +33489,7 @@
                 <w:sz w:val="20"/>
                 <w:szCs w:val="20"/>
               </w:rPr>
-              <w:t xml:space="preserve">Query #N "nome": invalid input syntax for type numeric</w:t>
+              <w:t xml:space="preserve">S3 upload failed</w:t>
             </w:r>
           </w:p>
         </w:tc>
@@ -32711,7 +33518,7 @@
                 <w:sz w:val="20"/>
                 <w:szCs w:val="20"/>
               </w:rPr>
-              <w:t xml:space="preserve">Campo numérico com texto. Query padrão já é tolerante; em query editada, trocar ::numeric por mymemory_parse_number(...).</w:t>
+              <w:t xml:space="preserve">Credenciais S3/MinIO inválidas ou bucket inexistente. Verificar variáveis S3_* no .env.</w:t>
             </w:r>
           </w:p>
         </w:tc>
@@ -32746,7 +33553,7 @@
                 <w:sz w:val="20"/>
                 <w:szCs w:val="20"/>
               </w:rPr>
-              <w:t xml:space="preserve">Query #N "nome": invalid input syntax for type date</w:t>
+              <w:t xml:space="preserve">WebDAV put failed</w:t>
             </w:r>
           </w:p>
         </w:tc>
@@ -32775,7 +33582,7 @@
                 <w:sz w:val="20"/>
                 <w:szCs w:val="20"/>
               </w:rPr>
-              <w:t xml:space="preserve">Campo de data com texto. Usar mymemory_parse_date(...) no lugar de ::date.</w:t>
+              <w:t xml:space="preserve">Servidor WebDAV inacessível ou sem permissão de escrita na pasta de destino.</w:t>
             </w:r>
           </w:p>
         </w:tc>
@@ -32810,7 +33617,7 @@
                 <w:sz w:val="20"/>
                 <w:szCs w:val="20"/>
               </w:rPr>
-              <w:t xml:space="preserve">Divide by zero (SQL Server)</w:t>
+              <w:t xml:space="preserve">Arquivo não encontrado no disco</w:t>
             </w:r>
           </w:p>
         </w:tc>
@@ -32839,135 +33646,7 @@
                 <w:sz w:val="20"/>
                 <w:szCs w:val="20"/>
               </w:rPr>
-              <w:t xml:space="preserve">Erro dentro da view do ERP. Abrir "ver etapas" para identificar a query e corrigir a view no banco.</w:t>
-            </w:r>
-          </w:p>
-        </w:tc>
-      </w:tr>
-      <w:tr>
-        <w:trPr>
-          <w:cantSplit/>
-          <w:tblHeader w:val="false"/>
-        </w:trPr>
-        <w:tc>
-          <w:tcPr>
-            <w:tcW w:type="dxa" w:w="3031"/>
-            <w:tcBorders>
-              <w:top w:val="single" w:color="B7C4D6" w:sz="4"/>
-              <w:left w:val="single" w:color="B7C4D6" w:sz="4"/>
-              <w:bottom w:val="single" w:color="B7C4D6" w:sz="4"/>
-              <w:right w:val="single" w:color="B7C4D6" w:sz="4"/>
-            </w:tcBorders>
-            <w:tcMar>
-              <w:top w:type="dxa" w:w="60"/>
-              <w:left w:type="dxa" w:w="100"/>
-              <w:bottom w:type="dxa" w:w="60"/>
-              <w:right w:type="dxa" w:w="100"/>
-            </w:tcMar>
-          </w:tcPr>
-          <w:p>
-            <w:r>
-              <w:rPr>
-                <w:rFonts w:ascii="Calibri" w:cs="Calibri" w:eastAsia="Calibri" w:hAnsi="Calibri"/>
-                <w:b/>
-                <w:bCs/>
-                <w:sz w:val="20"/>
-                <w:szCs w:val="20"/>
-              </w:rPr>
-              <w:t xml:space="preserve">Invalid column name 'X' (SQL Server)</w:t>
-            </w:r>
-          </w:p>
-        </w:tc>
-        <w:tc>
-          <w:tcPr>
-            <w:tcW w:type="dxa" w:w="7075"/>
-            <w:tcBorders>
-              <w:top w:val="single" w:color="B7C4D6" w:sz="4"/>
-              <w:left w:val="single" w:color="B7C4D6" w:sz="4"/>
-              <w:bottom w:val="single" w:color="B7C4D6" w:sz="4"/>
-              <w:right w:val="single" w:color="B7C4D6" w:sz="4"/>
-            </w:tcBorders>
-            <w:tcMar>
-              <w:top w:type="dxa" w:w="60"/>
-              <w:left w:type="dxa" w:w="100"/>
-              <w:bottom w:type="dxa" w:w="60"/>
-              <w:right w:type="dxa" w:w="100"/>
-            </w:tcMar>
-          </w:tcPr>
-          <w:p>
-            <w:r>
-              <w:rPr>
-                <w:rFonts w:ascii="Calibri" w:cs="Calibri" w:eastAsia="Calibri" w:hAnsi="Calibri"/>
-                <w:b w:val="false"/>
-                <w:bCs w:val="false"/>
-                <w:sz w:val="20"/>
-                <w:szCs w:val="20"/>
-              </w:rPr>
-              <w:t xml:space="preserve">Coluna inexistente na view/tabela do banco usado pela conexão. Conferir se a view é a mesma em todos os bancos (ex.: Demo × produção).</w:t>
-            </w:r>
-          </w:p>
-        </w:tc>
-      </w:tr>
-      <w:tr>
-        <w:trPr>
-          <w:cantSplit/>
-          <w:tblHeader w:val="false"/>
-        </w:trPr>
-        <w:tc>
-          <w:tcPr>
-            <w:tcW w:type="dxa" w:w="3031"/>
-            <w:tcBorders>
-              <w:top w:val="single" w:color="B7C4D6" w:sz="4"/>
-              <w:left w:val="single" w:color="B7C4D6" w:sz="4"/>
-              <w:bottom w:val="single" w:color="B7C4D6" w:sz="4"/>
-              <w:right w:val="single" w:color="B7C4D6" w:sz="4"/>
-            </w:tcBorders>
-            <w:tcMar>
-              <w:top w:type="dxa" w:w="60"/>
-              <w:left w:type="dxa" w:w="100"/>
-              <w:bottom w:type="dxa" w:w="60"/>
-              <w:right w:type="dxa" w:w="100"/>
-            </w:tcMar>
-          </w:tcPr>
-          <w:p>
-            <w:r>
-              <w:rPr>
-                <w:rFonts w:ascii="Calibri" w:cs="Calibri" w:eastAsia="Calibri" w:hAnsi="Calibri"/>
-                <w:b/>
-                <w:bCs/>
-                <w:sz w:val="20"/>
-                <w:szCs w:val="20"/>
-              </w:rPr>
-              <w:t xml:space="preserve">Resposta com filtro ignorado</w:t>
-            </w:r>
-          </w:p>
-        </w:tc>
-        <w:tc>
-          <w:tcPr>
-            <w:tcW w:type="dxa" w:w="7075"/>
-            <w:tcBorders>
-              <w:top w:val="single" w:color="B7C4D6" w:sz="4"/>
-              <w:left w:val="single" w:color="B7C4D6" w:sz="4"/>
-              <w:bottom w:val="single" w:color="B7C4D6" w:sz="4"/>
-              <w:right w:val="single" w:color="B7C4D6" w:sz="4"/>
-            </w:tcBorders>
-            <w:tcMar>
-              <w:top w:type="dxa" w:w="60"/>
-              <w:left w:type="dxa" w:w="100"/>
-              <w:bottom w:type="dxa" w:w="60"/>
-              <w:right w:type="dxa" w:w="100"/>
-            </w:tcMar>
-          </w:tcPr>
-          <w:p>
-            <w:r>
-              <w:rPr>
-                <w:rFonts w:ascii="Calibri" w:cs="Calibri" w:eastAsia="Calibri" w:hAnsi="Calibri"/>
-                <w:b w:val="false"/>
-                <w:bCs w:val="false"/>
-                <w:sz w:val="20"/>
-                <w:szCs w:val="20"/>
-              </w:rPr>
-              <w:t xml:space="preserve">Parâmetro com nome errado no SQL (nunca recebe valor). Conferir os nomes @param no trace.</w:t>
+              <w:t xml:space="preserve">Caminho no Batch Import inexistente ou sem permissão de leitura para o processo da API.</w:t>
             </w:r>
           </w:p>
         </w:tc>
@@ -32977,18 +33656,6 @@
       <w:pPr>
         <w:spacing w:after="60"/>
       </w:pPr>
-    </w:p>
-    <w:p>
-      <w:pPr>
-        <w:pStyle w:val="Heading1"/>
-        <w:pageBreakBefore/>
-      </w:pPr>
-      <w:r>
-        <w:rPr>
-          <w:rFonts w:ascii="Calibri" w:cs="Calibri" w:eastAsia="Calibri" w:hAnsi="Calibri"/>
-        </w:rPr>
-        <w:t xml:space="preserve">SEÇÃO 29 — Referência Rápida Admin</w:t>
-      </w:r>
     </w:p>
     <w:p>
       <w:pPr>
@@ -32999,7 +33666,7 @@
         <w:rPr>
           <w:rFonts w:ascii="Calibri" w:cs="Calibri" w:eastAsia="Calibri" w:hAnsi="Calibri"/>
         </w:rPr>
-        <w:t xml:space="preserve">Variáveis de ambiente (.env) essenciais</w:t>
+        <w:t xml:space="preserve">Erros de e-mail (Resend)</w:t>
       </w:r>
     </w:p>
     <w:tbl>
@@ -33050,7 +33717,7 @@
                 <w:sz w:val="20"/>
                 <w:szCs w:val="20"/>
               </w:rPr>
-              <w:t xml:space="preserve">Campo / Elemento</w:t>
+              <w:t xml:space="preserve">Mensagem / Sintoma</w:t>
             </w:r>
           </w:p>
         </w:tc>
@@ -33081,7 +33748,7 @@
                 <w:sz w:val="20"/>
                 <w:szCs w:val="20"/>
               </w:rPr>
-              <w:t xml:space="preserve">Descrição</w:t>
+              <w:t xml:space="preserve">Causa e solução</w:t>
             </w:r>
           </w:p>
         </w:tc>
@@ -33116,7 +33783,7 @@
                 <w:sz w:val="20"/>
                 <w:szCs w:val="20"/>
               </w:rPr>
-              <w:t xml:space="preserve">DATABASE_URL</w:t>
+              <w:t xml:space="preserve">emailSendFailed: true após cadastro</w:t>
             </w:r>
           </w:p>
         </w:tc>
@@ -33145,7 +33812,7 @@
                 <w:sz w:val="20"/>
                 <w:szCs w:val="20"/>
               </w:rPr>
-              <w:t xml:space="preserve">Connection string do PostgreSQL.</w:t>
+              <w:t xml:space="preserve">Resend não enviou o e-mail. Verificar: domínio verificado na Resend, chave RESEND_API_KEY válida, e-mail remetente configurado.</w:t>
             </w:r>
           </w:p>
         </w:tc>
@@ -33180,7 +33847,7 @@
                 <w:sz w:val="20"/>
                 <w:szCs w:val="20"/>
               </w:rPr>
-              <w:t xml:space="preserve">OPENAI_API_KEY</w:t>
+              <w:t xml:space="preserve">E-mail de confirmação não chega</w:t>
             </w:r>
           </w:p>
         </w:tc>
@@ -33209,519 +33876,7 @@
                 <w:sz w:val="20"/>
                 <w:szCs w:val="20"/>
               </w:rPr>
-              <w:t xml:space="preserve">Chave da API OpenAI.</w:t>
-            </w:r>
-          </w:p>
-        </w:tc>
-      </w:tr>
-      <w:tr>
-        <w:trPr>
-          <w:cantSplit/>
-          <w:tblHeader w:val="false"/>
-        </w:trPr>
-        <w:tc>
-          <w:tcPr>
-            <w:tcW w:type="dxa" w:w="3031"/>
-            <w:tcBorders>
-              <w:top w:val="single" w:color="B7C4D6" w:sz="4"/>
-              <w:left w:val="single" w:color="B7C4D6" w:sz="4"/>
-              <w:bottom w:val="single" w:color="B7C4D6" w:sz="4"/>
-              <w:right w:val="single" w:color="B7C4D6" w:sz="4"/>
-            </w:tcBorders>
-            <w:tcMar>
-              <w:top w:type="dxa" w:w="60"/>
-              <w:left w:type="dxa" w:w="100"/>
-              <w:bottom w:type="dxa" w:w="60"/>
-              <w:right w:type="dxa" w:w="100"/>
-            </w:tcMar>
-          </w:tcPr>
-          <w:p>
-            <w:r>
-              <w:rPr>
-                <w:rFonts w:ascii="Calibri" w:cs="Calibri" w:eastAsia="Calibri" w:hAnsi="Calibri"/>
-                <w:b/>
-                <w:bCs/>
-                <w:sz w:val="20"/>
-                <w:szCs w:val="20"/>
-              </w:rPr>
-              <w:t xml:space="preserve">RESEND_API_KEY</w:t>
-            </w:r>
-          </w:p>
-        </w:tc>
-        <w:tc>
-          <w:tcPr>
-            <w:tcW w:type="dxa" w:w="7075"/>
-            <w:tcBorders>
-              <w:top w:val="single" w:color="B7C4D6" w:sz="4"/>
-              <w:left w:val="single" w:color="B7C4D6" w:sz="4"/>
-              <w:bottom w:val="single" w:color="B7C4D6" w:sz="4"/>
-              <w:right w:val="single" w:color="B7C4D6" w:sz="4"/>
-            </w:tcBorders>
-            <w:tcMar>
-              <w:top w:type="dxa" w:w="60"/>
-              <w:left w:type="dxa" w:w="100"/>
-              <w:bottom w:type="dxa" w:w="60"/>
-              <w:right w:type="dxa" w:w="100"/>
-            </w:tcMar>
-          </w:tcPr>
-          <w:p>
-            <w:r>
-              <w:rPr>
-                <w:rFonts w:ascii="Calibri" w:cs="Calibri" w:eastAsia="Calibri" w:hAnsi="Calibri"/>
-                <w:b w:val="false"/>
-                <w:bCs w:val="false"/>
-                <w:sz w:val="20"/>
-                <w:szCs w:val="20"/>
-              </w:rPr>
-              <w:t xml:space="preserve">Chave da Resend para envio de e-mails.</w:t>
-            </w:r>
-          </w:p>
-        </w:tc>
-      </w:tr>
-      <w:tr>
-        <w:trPr>
-          <w:cantSplit/>
-          <w:tblHeader w:val="false"/>
-        </w:trPr>
-        <w:tc>
-          <w:tcPr>
-            <w:tcW w:type="dxa" w:w="3031"/>
-            <w:tcBorders>
-              <w:top w:val="single" w:color="B7C4D6" w:sz="4"/>
-              <w:left w:val="single" w:color="B7C4D6" w:sz="4"/>
-              <w:bottom w:val="single" w:color="B7C4D6" w:sz="4"/>
-              <w:right w:val="single" w:color="B7C4D6" w:sz="4"/>
-            </w:tcBorders>
-            <w:tcMar>
-              <w:top w:type="dxa" w:w="60"/>
-              <w:left w:type="dxa" w:w="100"/>
-              <w:bottom w:type="dxa" w:w="60"/>
-              <w:right w:type="dxa" w:w="100"/>
-            </w:tcMar>
-          </w:tcPr>
-          <w:p>
-            <w:r>
-              <w:rPr>
-                <w:rFonts w:ascii="Calibri" w:cs="Calibri" w:eastAsia="Calibri" w:hAnsi="Calibri"/>
-                <w:b/>
-                <w:bCs/>
-                <w:sz w:val="20"/>
-                <w:szCs w:val="20"/>
-              </w:rPr>
-              <w:t xml:space="preserve">EMAIL_FROM</w:t>
-            </w:r>
-          </w:p>
-        </w:tc>
-        <w:tc>
-          <w:tcPr>
-            <w:tcW w:type="dxa" w:w="7075"/>
-            <w:tcBorders>
-              <w:top w:val="single" w:color="B7C4D6" w:sz="4"/>
-              <w:left w:val="single" w:color="B7C4D6" w:sz="4"/>
-              <w:bottom w:val="single" w:color="B7C4D6" w:sz="4"/>
-              <w:right w:val="single" w:color="B7C4D6" w:sz="4"/>
-            </w:tcBorders>
-            <w:tcMar>
-              <w:top w:type="dxa" w:w="60"/>
-              <w:left w:type="dxa" w:w="100"/>
-              <w:bottom w:type="dxa" w:w="60"/>
-              <w:right w:type="dxa" w:w="100"/>
-            </w:tcMar>
-          </w:tcPr>
-          <w:p>
-            <w:r>
-              <w:rPr>
-                <w:rFonts w:ascii="Calibri" w:cs="Calibri" w:eastAsia="Calibri" w:hAnsi="Calibri"/>
-                <w:b w:val="false"/>
-                <w:bCs w:val="false"/>
-                <w:sz w:val="20"/>
-                <w:szCs w:val="20"/>
-              </w:rPr>
-              <w:t xml:space="preserve">E-mail remetente verificado na Resend.</w:t>
-            </w:r>
-          </w:p>
-        </w:tc>
-      </w:tr>
-      <w:tr>
-        <w:trPr>
-          <w:cantSplit/>
-          <w:tblHeader w:val="false"/>
-        </w:trPr>
-        <w:tc>
-          <w:tcPr>
-            <w:tcW w:type="dxa" w:w="3031"/>
-            <w:tcBorders>
-              <w:top w:val="single" w:color="B7C4D6" w:sz="4"/>
-              <w:left w:val="single" w:color="B7C4D6" w:sz="4"/>
-              <w:bottom w:val="single" w:color="B7C4D6" w:sz="4"/>
-              <w:right w:val="single" w:color="B7C4D6" w:sz="4"/>
-            </w:tcBorders>
-            <w:tcMar>
-              <w:top w:type="dxa" w:w="60"/>
-              <w:left w:type="dxa" w:w="100"/>
-              <w:bottom w:type="dxa" w:w="60"/>
-              <w:right w:type="dxa" w:w="100"/>
-            </w:tcMar>
-          </w:tcPr>
-          <w:p>
-            <w:r>
-              <w:rPr>
-                <w:rFonts w:ascii="Calibri" w:cs="Calibri" w:eastAsia="Calibri" w:hAnsi="Calibri"/>
-                <w:b/>
-                <w:bCs/>
-                <w:sz w:val="20"/>
-                <w:szCs w:val="20"/>
-              </w:rPr>
-              <w:t xml:space="preserve">JWT_SECRET</w:t>
-            </w:r>
-          </w:p>
-        </w:tc>
-        <w:tc>
-          <w:tcPr>
-            <w:tcW w:type="dxa" w:w="7075"/>
-            <w:tcBorders>
-              <w:top w:val="single" w:color="B7C4D6" w:sz="4"/>
-              <w:left w:val="single" w:color="B7C4D6" w:sz="4"/>
-              <w:bottom w:val="single" w:color="B7C4D6" w:sz="4"/>
-              <w:right w:val="single" w:color="B7C4D6" w:sz="4"/>
-            </w:tcBorders>
-            <w:tcMar>
-              <w:top w:type="dxa" w:w="60"/>
-              <w:left w:type="dxa" w:w="100"/>
-              <w:bottom w:type="dxa" w:w="60"/>
-              <w:right w:type="dxa" w:w="100"/>
-            </w:tcMar>
-          </w:tcPr>
-          <w:p>
-            <w:r>
-              <w:rPr>
-                <w:rFonts w:ascii="Calibri" w:cs="Calibri" w:eastAsia="Calibri" w:hAnsi="Calibri"/>
-                <w:b w:val="false"/>
-                <w:bCs w:val="false"/>
-                <w:sz w:val="20"/>
-                <w:szCs w:val="20"/>
-              </w:rPr>
-              <w:t xml:space="preserve">Segredo para assinar tokens de sessão.</w:t>
-            </w:r>
-          </w:p>
-        </w:tc>
-      </w:tr>
-      <w:tr>
-        <w:trPr>
-          <w:cantSplit/>
-          <w:tblHeader w:val="false"/>
-        </w:trPr>
-        <w:tc>
-          <w:tcPr>
-            <w:tcW w:type="dxa" w:w="3031"/>
-            <w:tcBorders>
-              <w:top w:val="single" w:color="B7C4D6" w:sz="4"/>
-              <w:left w:val="single" w:color="B7C4D6" w:sz="4"/>
-              <w:bottom w:val="single" w:color="B7C4D6" w:sz="4"/>
-              <w:right w:val="single" w:color="B7C4D6" w:sz="4"/>
-            </w:tcBorders>
-            <w:tcMar>
-              <w:top w:type="dxa" w:w="60"/>
-              <w:left w:type="dxa" w:w="100"/>
-              <w:bottom w:type="dxa" w:w="60"/>
-              <w:right w:type="dxa" w:w="100"/>
-            </w:tcMar>
-          </w:tcPr>
-          <w:p>
-            <w:r>
-              <w:rPr>
-                <w:rFonts w:ascii="Calibri" w:cs="Calibri" w:eastAsia="Calibri" w:hAnsi="Calibri"/>
-                <w:b/>
-                <w:bCs/>
-                <w:sz w:val="20"/>
-                <w:szCs w:val="20"/>
-              </w:rPr>
-              <w:t xml:space="preserve">STORAGE_MODE</w:t>
-            </w:r>
-          </w:p>
-        </w:tc>
-        <w:tc>
-          <w:tcPr>
-            <w:tcW w:type="dxa" w:w="7075"/>
-            <w:tcBorders>
-              <w:top w:val="single" w:color="B7C4D6" w:sz="4"/>
-              <w:left w:val="single" w:color="B7C4D6" w:sz="4"/>
-              <w:bottom w:val="single" w:color="B7C4D6" w:sz="4"/>
-              <w:right w:val="single" w:color="B7C4D6" w:sz="4"/>
-            </w:tcBorders>
-            <w:tcMar>
-              <w:top w:type="dxa" w:w="60"/>
-              <w:left w:type="dxa" w:w="100"/>
-              <w:bottom w:type="dxa" w:w="60"/>
-              <w:right w:type="dxa" w:w="100"/>
-            </w:tcMar>
-          </w:tcPr>
-          <w:p>
-            <w:r>
-              <w:rPr>
-                <w:rFonts w:ascii="Calibri" w:cs="Calibri" w:eastAsia="Calibri" w:hAnsi="Calibri"/>
-                <w:b w:val="false"/>
-                <w:bCs w:val="false"/>
-                <w:sz w:val="20"/>
-                <w:szCs w:val="20"/>
-              </w:rPr>
-              <w:t xml:space="preserve">local ou s3.</w:t>
-            </w:r>
-          </w:p>
-        </w:tc>
-      </w:tr>
-      <w:tr>
-        <w:trPr>
-          <w:cantSplit/>
-          <w:tblHeader w:val="false"/>
-        </w:trPr>
-        <w:tc>
-          <w:tcPr>
-            <w:tcW w:type="dxa" w:w="3031"/>
-            <w:tcBorders>
-              <w:top w:val="single" w:color="B7C4D6" w:sz="4"/>
-              <w:left w:val="single" w:color="B7C4D6" w:sz="4"/>
-              <w:bottom w:val="single" w:color="B7C4D6" w:sz="4"/>
-              <w:right w:val="single" w:color="B7C4D6" w:sz="4"/>
-            </w:tcBorders>
-            <w:tcMar>
-              <w:top w:type="dxa" w:w="60"/>
-              <w:left w:type="dxa" w:w="100"/>
-              <w:bottom w:type="dxa" w:w="60"/>
-              <w:right w:type="dxa" w:w="100"/>
-            </w:tcMar>
-          </w:tcPr>
-          <w:p>
-            <w:r>
-              <w:rPr>
-                <w:rFonts w:ascii="Calibri" w:cs="Calibri" w:eastAsia="Calibri" w:hAnsi="Calibri"/>
-                <w:b/>
-                <w:bCs/>
-                <w:sz w:val="20"/>
-                <w:szCs w:val="20"/>
-              </w:rPr>
-              <w:t xml:space="preserve">S3_* / AWS_*</w:t>
-            </w:r>
-          </w:p>
-        </w:tc>
-        <w:tc>
-          <w:tcPr>
-            <w:tcW w:type="dxa" w:w="7075"/>
-            <w:tcBorders>
-              <w:top w:val="single" w:color="B7C4D6" w:sz="4"/>
-              <w:left w:val="single" w:color="B7C4D6" w:sz="4"/>
-              <w:bottom w:val="single" w:color="B7C4D6" w:sz="4"/>
-              <w:right w:val="single" w:color="B7C4D6" w:sz="4"/>
-            </w:tcBorders>
-            <w:tcMar>
-              <w:top w:type="dxa" w:w="60"/>
-              <w:left w:type="dxa" w:w="100"/>
-              <w:bottom w:type="dxa" w:w="60"/>
-              <w:right w:type="dxa" w:w="100"/>
-            </w:tcMar>
-          </w:tcPr>
-          <w:p>
-            <w:r>
-              <w:rPr>
-                <w:rFonts w:ascii="Calibri" w:cs="Calibri" w:eastAsia="Calibri" w:hAnsi="Calibri"/>
-                <w:b w:val="false"/>
-                <w:bCs w:val="false"/>
-                <w:sz w:val="20"/>
-                <w:szCs w:val="20"/>
-              </w:rPr>
-              <w:t xml:space="preserve">Credenciais e bucket S3/MinIO (se STORAGE_MODE=s3).</w:t>
-            </w:r>
-          </w:p>
-        </w:tc>
-      </w:tr>
-      <w:tr>
-        <w:trPr>
-          <w:cantSplit/>
-          <w:tblHeader w:val="false"/>
-        </w:trPr>
-        <w:tc>
-          <w:tcPr>
-            <w:tcW w:type="dxa" w:w="3031"/>
-            <w:tcBorders>
-              <w:top w:val="single" w:color="B7C4D6" w:sz="4"/>
-              <w:left w:val="single" w:color="B7C4D6" w:sz="4"/>
-              <w:bottom w:val="single" w:color="B7C4D6" w:sz="4"/>
-              <w:right w:val="single" w:color="B7C4D6" w:sz="4"/>
-            </w:tcBorders>
-            <w:tcMar>
-              <w:top w:type="dxa" w:w="60"/>
-              <w:left w:type="dxa" w:w="100"/>
-              <w:bottom w:type="dxa" w:w="60"/>
-              <w:right w:type="dxa" w:w="100"/>
-            </w:tcMar>
-          </w:tcPr>
-          <w:p>
-            <w:r>
-              <w:rPr>
-                <w:rFonts w:ascii="Calibri" w:cs="Calibri" w:eastAsia="Calibri" w:hAnsi="Calibri"/>
-                <w:b/>
-                <w:bCs/>
-                <w:sz w:val="20"/>
-                <w:szCs w:val="20"/>
-              </w:rPr>
-              <w:t xml:space="preserve">STORAGE_ENCRYPTION_KEY</w:t>
-            </w:r>
-          </w:p>
-        </w:tc>
-        <w:tc>
-          <w:tcPr>
-            <w:tcW w:type="dxa" w:w="7075"/>
-            <w:tcBorders>
-              <w:top w:val="single" w:color="B7C4D6" w:sz="4"/>
-              <w:left w:val="single" w:color="B7C4D6" w:sz="4"/>
-              <w:bottom w:val="single" w:color="B7C4D6" w:sz="4"/>
-              <w:right w:val="single" w:color="B7C4D6" w:sz="4"/>
-            </w:tcBorders>
-            <w:tcMar>
-              <w:top w:type="dxa" w:w="60"/>
-              <w:left w:type="dxa" w:w="100"/>
-              <w:bottom w:type="dxa" w:w="60"/>
-              <w:right w:type="dxa" w:w="100"/>
-            </w:tcMar>
-          </w:tcPr>
-          <w:p>
-            <w:r>
-              <w:rPr>
-                <w:rFonts w:ascii="Calibri" w:cs="Calibri" w:eastAsia="Calibri" w:hAnsi="Calibri"/>
-                <w:b w:val="false"/>
-                <w:bCs w:val="false"/>
-                <w:sz w:val="20"/>
-                <w:szCs w:val="20"/>
-              </w:rPr>
-              <w:t xml:space="preserve">Chave AES-256 para criptografar senhas WebDAV. 64 hex chars.</w:t>
-            </w:r>
-          </w:p>
-        </w:tc>
-      </w:tr>
-      <w:tr>
-        <w:trPr>
-          <w:cantSplit/>
-          <w:tblHeader w:val="false"/>
-        </w:trPr>
-        <w:tc>
-          <w:tcPr>
-            <w:tcW w:type="dxa" w:w="3031"/>
-            <w:tcBorders>
-              <w:top w:val="single" w:color="B7C4D6" w:sz="4"/>
-              <w:left w:val="single" w:color="B7C4D6" w:sz="4"/>
-              <w:bottom w:val="single" w:color="B7C4D6" w:sz="4"/>
-              <w:right w:val="single" w:color="B7C4D6" w:sz="4"/>
-            </w:tcBorders>
-            <w:tcMar>
-              <w:top w:type="dxa" w:w="60"/>
-              <w:left w:type="dxa" w:w="100"/>
-              <w:bottom w:type="dxa" w:w="60"/>
-              <w:right w:type="dxa" w:w="100"/>
-            </w:tcMar>
-          </w:tcPr>
-          <w:p>
-            <w:r>
-              <w:rPr>
-                <w:rFonts w:ascii="Calibri" w:cs="Calibri" w:eastAsia="Calibri" w:hAnsi="Calibri"/>
-                <w:b/>
-                <w:bCs/>
-                <w:sz w:val="20"/>
-                <w:szCs w:val="20"/>
-              </w:rPr>
-              <w:t xml:space="preserve">Migrations</w:t>
-            </w:r>
-          </w:p>
-        </w:tc>
-        <w:tc>
-          <w:tcPr>
-            <w:tcW w:type="dxa" w:w="7075"/>
-            <w:tcBorders>
-              <w:top w:val="single" w:color="B7C4D6" w:sz="4"/>
-              <w:left w:val="single" w:color="B7C4D6" w:sz="4"/>
-              <w:bottom w:val="single" w:color="B7C4D6" w:sz="4"/>
-              <w:right w:val="single" w:color="B7C4D6" w:sz="4"/>
-            </w:tcBorders>
-            <w:tcMar>
-              <w:top w:type="dxa" w:w="60"/>
-              <w:left w:type="dxa" w:w="100"/>
-              <w:bottom w:type="dxa" w:w="60"/>
-              <w:right w:type="dxa" w:w="100"/>
-            </w:tcMar>
-          </w:tcPr>
-          <w:p>
-            <w:r>
-              <w:rPr>
-                <w:rFonts w:ascii="Calibri" w:cs="Calibri" w:eastAsia="Calibri" w:hAnsi="Calibri"/>
-                <w:b w:val="false"/>
-                <w:bCs w:val="false"/>
-                <w:sz w:val="20"/>
-                <w:szCs w:val="20"/>
-              </w:rPr>
-              <w:t xml:space="preserve">Aplicadas automaticamente quando a API sobe (inclui as funções mymemory_parse_date e mymemory_parse_number).</w:t>
-            </w:r>
-          </w:p>
-        </w:tc>
-      </w:tr>
-      <w:tr>
-        <w:trPr>
-          <w:cantSplit/>
-          <w:tblHeader w:val="false"/>
-        </w:trPr>
-        <w:tc>
-          <w:tcPr>
-            <w:tcW w:type="dxa" w:w="3031"/>
-            <w:tcBorders>
-              <w:top w:val="single" w:color="B7C4D6" w:sz="4"/>
-              <w:left w:val="single" w:color="B7C4D6" w:sz="4"/>
-              <w:bottom w:val="single" w:color="B7C4D6" w:sz="4"/>
-              <w:right w:val="single" w:color="B7C4D6" w:sz="4"/>
-            </w:tcBorders>
-            <w:tcMar>
-              <w:top w:type="dxa" w:w="60"/>
-              <w:left w:type="dxa" w:w="100"/>
-              <w:bottom w:type="dxa" w:w="60"/>
-              <w:right w:type="dxa" w:w="100"/>
-            </w:tcMar>
-          </w:tcPr>
-          <w:p>
-            <w:r>
-              <w:rPr>
-                <w:rFonts w:ascii="Calibri" w:cs="Calibri" w:eastAsia="Calibri" w:hAnsi="Calibri"/>
-                <w:b/>
-                <w:bCs/>
-                <w:sz w:val="20"/>
-                <w:szCs w:val="20"/>
-              </w:rPr>
-              <w:t xml:space="preserve">USE_DEV_FALLBACK</w:t>
-            </w:r>
-          </w:p>
-        </w:tc>
-        <w:tc>
-          <w:tcPr>
-            <w:tcW w:type="dxa" w:w="7075"/>
-            <w:tcBorders>
-              <w:top w:val="single" w:color="B7C4D6" w:sz="4"/>
-              <w:left w:val="single" w:color="B7C4D6" w:sz="4"/>
-              <w:bottom w:val="single" w:color="B7C4D6" w:sz="4"/>
-              <w:right w:val="single" w:color="B7C4D6" w:sz="4"/>
-            </w:tcBorders>
-            <w:tcMar>
-              <w:top w:type="dxa" w:w="60"/>
-              <w:left w:type="dxa" w:w="100"/>
-              <w:bottom w:type="dxa" w:w="60"/>
-              <w:right w:type="dxa" w:w="100"/>
-            </w:tcMar>
-          </w:tcPr>
-          <w:p>
-            <w:r>
-              <w:rPr>
-                <w:rFonts w:ascii="Calibri" w:cs="Calibri" w:eastAsia="Calibri" w:hAnsi="Calibri"/>
-                <w:b w:val="false"/>
-                <w:bCs w:val="false"/>
-                <w:sz w:val="20"/>
-                <w:szCs w:val="20"/>
-              </w:rPr>
-              <w:t xml:space="preserve">1 para desativar auth em dev local (não usar em prod!).</w:t>
+              <w:t xml:space="preserve">Verificar spam / Promoções. Reenviar pelo botão na tela de Login.</w:t>
             </w:r>
           </w:p>
         </w:tc>
@@ -33741,7 +33896,7 @@
         <w:rPr>
           <w:rFonts w:ascii="Calibri" w:cs="Calibri" w:eastAsia="Calibri" w:hAnsi="Calibri"/>
         </w:rPr>
-        <w:t xml:space="preserve">Comandos úteis (servidor)</w:t>
+        <w:t xml:space="preserve">Erros de perguntas e queries</w:t>
       </w:r>
     </w:p>
     <w:tbl>
@@ -33792,7 +33947,7 @@
                 <w:sz w:val="20"/>
                 <w:szCs w:val="20"/>
               </w:rPr>
-              <w:t xml:space="preserve">Campo / Elemento</w:t>
+              <w:t xml:space="preserve">Mensagem / Sintoma</w:t>
             </w:r>
           </w:p>
         </w:tc>
@@ -33823,7 +33978,7 @@
                 <w:sz w:val="20"/>
                 <w:szCs w:val="20"/>
               </w:rPr>
-              <w:t xml:space="preserve">Descrição</w:t>
+              <w:t xml:space="preserve">Causa e solução</w:t>
             </w:r>
           </w:p>
         </w:tc>
@@ -33858,7 +34013,7 @@
                 <w:sz w:val="20"/>
                 <w:szCs w:val="20"/>
               </w:rPr>
-              <w:t xml:space="preserve">docker compose ps</w:t>
+              <w:t xml:space="preserve">Query #N "nome": invalid input syntax for type numeric</w:t>
             </w:r>
           </w:p>
         </w:tc>
@@ -33887,7 +34042,7 @@
                 <w:sz w:val="20"/>
                 <w:szCs w:val="20"/>
               </w:rPr>
-              <w:t xml:space="preserve">Ver status dos containers.</w:t>
+              <w:t xml:space="preserve">Campo numérico com texto. Query padrão já é tolerante; em query editada, trocar ::numeric por mymemory_parse_number(...).</w:t>
             </w:r>
           </w:p>
         </w:tc>
@@ -33922,7 +34077,7 @@
                 <w:sz w:val="20"/>
                 <w:szCs w:val="20"/>
               </w:rPr>
-              <w:t xml:space="preserve">docker compose logs api --tail=50</w:t>
+              <w:t xml:space="preserve">Query #N "nome": invalid input syntax for type date</w:t>
             </w:r>
           </w:p>
         </w:tc>
@@ -33951,7 +34106,7 @@
                 <w:sz w:val="20"/>
                 <w:szCs w:val="20"/>
               </w:rPr>
-              <w:t xml:space="preserve">Ver últimos logs da API.</w:t>
+              <w:t xml:space="preserve">Campo de data com texto. Usar mymemory_parse_date(...) no lugar de ::date.</w:t>
             </w:r>
           </w:p>
         </w:tc>
@@ -33986,7 +34141,7 @@
                 <w:sz w:val="20"/>
                 <w:szCs w:val="20"/>
               </w:rPr>
-              <w:t xml:space="preserve">docker compose up -d</w:t>
+              <w:t xml:space="preserve">Divide by zero (SQL Server)</w:t>
             </w:r>
           </w:p>
         </w:tc>
@@ -34015,7 +34170,7 @@
                 <w:sz w:val="20"/>
                 <w:szCs w:val="20"/>
               </w:rPr>
-              <w:t xml:space="preserve">Iniciar/reiniciar todos os containers.</w:t>
+              <w:t xml:space="preserve">Erro dentro da view do ERP. Abrir "ver etapas" para identificar a query e corrigir a view no banco.</w:t>
             </w:r>
           </w:p>
         </w:tc>
@@ -34050,7 +34205,7 @@
                 <w:sz w:val="20"/>
                 <w:szCs w:val="20"/>
               </w:rPr>
-              <w:t xml:space="preserve">docker compose pull &amp;&amp; docker compose up -d</w:t>
+              <w:t xml:space="preserve">Invalid column name 'X' (SQL Server)</w:t>
             </w:r>
           </w:p>
         </w:tc>
@@ -34079,7 +34234,7 @@
                 <w:sz w:val="20"/>
                 <w:szCs w:val="20"/>
               </w:rPr>
-              <w:t xml:space="preserve">Atualizar para a versão mais recente (após deploy).</w:t>
+              <w:t xml:space="preserve">Coluna inexistente na view/tabela do banco usado pela conexão. Conferir se a view é a mesma em todos os bancos (ex.: Demo × produção).</w:t>
             </w:r>
           </w:p>
         </w:tc>
@@ -34114,7 +34269,7 @@
                 <w:sz w:val="20"/>
                 <w:szCs w:val="20"/>
               </w:rPr>
-              <w:t xml:space="preserve">npm run migration:run --workspace=@mymemory/api</w:t>
+              <w:t xml:space="preserve">Resposta com filtro ignorado</w:t>
             </w:r>
           </w:p>
         </w:tc>
@@ -34143,71 +34298,7 @@
                 <w:sz w:val="20"/>
                 <w:szCs w:val="20"/>
               </w:rPr>
-              <w:t xml:space="preserve">Executar migrações pendentes do banco.</w:t>
-            </w:r>
-          </w:p>
-        </w:tc>
-      </w:tr>
-      <w:tr>
-        <w:trPr>
-          <w:cantSplit/>
-          <w:tblHeader w:val="false"/>
-        </w:trPr>
-        <w:tc>
-          <w:tcPr>
-            <w:tcW w:type="dxa" w:w="3031"/>
-            <w:tcBorders>
-              <w:top w:val="single" w:color="B7C4D6" w:sz="4"/>
-              <w:left w:val="single" w:color="B7C4D6" w:sz="4"/>
-              <w:bottom w:val="single" w:color="B7C4D6" w:sz="4"/>
-              <w:right w:val="single" w:color="B7C4D6" w:sz="4"/>
-            </w:tcBorders>
-            <w:tcMar>
-              <w:top w:type="dxa" w:w="60"/>
-              <w:left w:type="dxa" w:w="100"/>
-              <w:bottom w:type="dxa" w:w="60"/>
-              <w:right w:type="dxa" w:w="100"/>
-            </w:tcMar>
-          </w:tcPr>
-          <w:p>
-            <w:r>
-              <w:rPr>
-                <w:rFonts w:ascii="Calibri" w:cs="Calibri" w:eastAsia="Calibri" w:hAnsi="Calibri"/>
-                <w:b/>
-                <w:bCs/>
-                <w:sz w:val="20"/>
-                <w:szCs w:val="20"/>
-              </w:rPr>
-              <w:t xml:space="preserve">npm run migration:show --workspace=@mymemory/api</w:t>
-            </w:r>
-          </w:p>
-        </w:tc>
-        <w:tc>
-          <w:tcPr>
-            <w:tcW w:type="dxa" w:w="7075"/>
-            <w:tcBorders>
-              <w:top w:val="single" w:color="B7C4D6" w:sz="4"/>
-              <w:left w:val="single" w:color="B7C4D6" w:sz="4"/>
-              <w:bottom w:val="single" w:color="B7C4D6" w:sz="4"/>
-              <w:right w:val="single" w:color="B7C4D6" w:sz="4"/>
-            </w:tcBorders>
-            <w:tcMar>
-              <w:top w:type="dxa" w:w="60"/>
-              <w:left w:type="dxa" w:w="100"/>
-              <w:bottom w:type="dxa" w:w="60"/>
-              <w:right w:type="dxa" w:w="100"/>
-            </w:tcMar>
-          </w:tcPr>
-          <w:p>
-            <w:r>
-              <w:rPr>
-                <w:rFonts w:ascii="Calibri" w:cs="Calibri" w:eastAsia="Calibri" w:hAnsi="Calibri"/>
-                <w:b w:val="false"/>
-                <w:bCs w:val="false"/>
-                <w:sz w:val="20"/>
-                <w:szCs w:val="20"/>
-              </w:rPr>
-              <w:t xml:space="preserve">Ver status de todas as migrações.</w:t>
+              <w:t xml:space="preserve">Parâmetro com nome errado no SQL (nunca recebe valor). Conferir os nomes @param no trace.</w:t>
             </w:r>
           </w:p>
         </w:tc>
@@ -34217,6 +34308,18 @@
       <w:pPr>
         <w:spacing w:after="60"/>
       </w:pPr>
+    </w:p>
+    <w:p>
+      <w:pPr>
+        <w:pStyle w:val="Heading1"/>
+        <w:pageBreakBefore/>
+      </w:pPr>
+      <w:r>
+        <w:rPr>
+          <w:rFonts w:ascii="Calibri" w:cs="Calibri" w:eastAsia="Calibri" w:hAnsi="Calibri"/>
+        </w:rPr>
+        <w:t xml:space="preserve">SEÇÃO 30 — Referência Rápida Admin</w:t>
+      </w:r>
     </w:p>
     <w:p>
       <w:pPr>
@@ -34227,7 +34330,7 @@
         <w:rPr>
           <w:rFonts w:ascii="Calibri" w:cs="Calibri" w:eastAsia="Calibri" w:hAnsi="Calibri"/>
         </w:rPr>
-        <w:t xml:space="preserve">Deploy padrão</w:t>
+        <w:t xml:space="preserve">Variáveis de ambiente (.env) essenciais</w:t>
       </w:r>
     </w:p>
     <w:tbl>
@@ -34344,7 +34447,7 @@
                 <w:sz w:val="20"/>
                 <w:szCs w:val="20"/>
               </w:rPr>
-              <w:t xml:space="preserve">1. Commit no master</w:t>
+              <w:t xml:space="preserve">DATABASE_URL</w:t>
             </w:r>
           </w:p>
         </w:tc>
@@ -34373,7 +34476,7 @@
                 <w:sz w:val="20"/>
                 <w:szCs w:val="20"/>
               </w:rPr>
-              <w:t xml:space="preserve">git add . &amp;&amp; git commit -m '...'</w:t>
+              <w:t xml:space="preserve">Connection string do PostgreSQL.</w:t>
             </w:r>
           </w:p>
         </w:tc>
@@ -34408,7 +34511,7 @@
                 <w:sz w:val="20"/>
                 <w:szCs w:val="20"/>
               </w:rPr>
-              <w:t xml:space="preserve">2. Push master</w:t>
+              <w:t xml:space="preserve">OPENAI_API_KEY</w:t>
             </w:r>
           </w:p>
         </w:tc>
@@ -34437,7 +34540,7 @@
                 <w:sz w:val="20"/>
                 <w:szCs w:val="20"/>
               </w:rPr>
-              <w:t xml:space="preserve">git push origin master</w:t>
+              <w:t xml:space="preserve">Chave da API OpenAI.</w:t>
             </w:r>
           </w:p>
         </w:tc>
@@ -34472,7 +34575,7 @@
                 <w:sz w:val="20"/>
                 <w:szCs w:val="20"/>
               </w:rPr>
-              <w:t xml:space="preserve">3. Merge para production</w:t>
+              <w:t xml:space="preserve">RESEND_API_KEY</w:t>
             </w:r>
           </w:p>
         </w:tc>
@@ -34501,7 +34604,7 @@
                 <w:sz w:val="20"/>
                 <w:szCs w:val="20"/>
               </w:rPr>
-              <w:t xml:space="preserve">git checkout production &amp;&amp; git merge master &amp;&amp; git push origin production</w:t>
+              <w:t xml:space="preserve">Chave da Resend para envio de e-mails.</w:t>
             </w:r>
           </w:p>
         </w:tc>
@@ -34536,7 +34639,7 @@
                 <w:sz w:val="20"/>
                 <w:szCs w:val="20"/>
               </w:rPr>
-              <w:t xml:space="preserve">4. GitHub Actions dispara</w:t>
+              <w:t xml:space="preserve">EMAIL_FROM</w:t>
             </w:r>
           </w:p>
         </w:tc>
@@ -34565,7 +34668,7 @@
                 <w:sz w:val="20"/>
                 <w:szCs w:val="20"/>
               </w:rPr>
-              <w:t xml:space="preserve">Ver progresso na aba Actions do repositório no GitHub.</w:t>
+              <w:t xml:space="preserve">E-mail remetente verificado na Resend.</w:t>
             </w:r>
           </w:p>
         </w:tc>
@@ -34600,7 +34703,7 @@
                 <w:sz w:val="20"/>
                 <w:szCs w:val="20"/>
               </w:rPr>
-              <w:t xml:space="preserve">5. Deploy automático</w:t>
+              <w:t xml:space="preserve">JWT_SECRET</w:t>
             </w:r>
           </w:p>
         </w:tc>
@@ -34629,7 +34732,327 @@
                 <w:sz w:val="20"/>
                 <w:szCs w:val="20"/>
               </w:rPr>
-              <w:t xml:space="preserve">API e Web são reconstruídos e reiniciados no servidor via docker compose.</w:t>
+              <w:t xml:space="preserve">Segredo para assinar tokens de sessão.</w:t>
+            </w:r>
+          </w:p>
+        </w:tc>
+      </w:tr>
+      <w:tr>
+        <w:trPr>
+          <w:cantSplit/>
+          <w:tblHeader w:val="false"/>
+        </w:trPr>
+        <w:tc>
+          <w:tcPr>
+            <w:tcW w:type="dxa" w:w="3031"/>
+            <w:tcBorders>
+              <w:top w:val="single" w:color="B7C4D6" w:sz="4"/>
+              <w:left w:val="single" w:color="B7C4D6" w:sz="4"/>
+              <w:bottom w:val="single" w:color="B7C4D6" w:sz="4"/>
+              <w:right w:val="single" w:color="B7C4D6" w:sz="4"/>
+            </w:tcBorders>
+            <w:tcMar>
+              <w:top w:type="dxa" w:w="60"/>
+              <w:left w:type="dxa" w:w="100"/>
+              <w:bottom w:type="dxa" w:w="60"/>
+              <w:right w:type="dxa" w:w="100"/>
+            </w:tcMar>
+          </w:tcPr>
+          <w:p>
+            <w:r>
+              <w:rPr>
+                <w:rFonts w:ascii="Calibri" w:cs="Calibri" w:eastAsia="Calibri" w:hAnsi="Calibri"/>
+                <w:b/>
+                <w:bCs/>
+                <w:sz w:val="20"/>
+                <w:szCs w:val="20"/>
+              </w:rPr>
+              <w:t xml:space="preserve">STORAGE_MODE</w:t>
+            </w:r>
+          </w:p>
+        </w:tc>
+        <w:tc>
+          <w:tcPr>
+            <w:tcW w:type="dxa" w:w="7075"/>
+            <w:tcBorders>
+              <w:top w:val="single" w:color="B7C4D6" w:sz="4"/>
+              <w:left w:val="single" w:color="B7C4D6" w:sz="4"/>
+              <w:bottom w:val="single" w:color="B7C4D6" w:sz="4"/>
+              <w:right w:val="single" w:color="B7C4D6" w:sz="4"/>
+            </w:tcBorders>
+            <w:tcMar>
+              <w:top w:type="dxa" w:w="60"/>
+              <w:left w:type="dxa" w:w="100"/>
+              <w:bottom w:type="dxa" w:w="60"/>
+              <w:right w:type="dxa" w:w="100"/>
+            </w:tcMar>
+          </w:tcPr>
+          <w:p>
+            <w:r>
+              <w:rPr>
+                <w:rFonts w:ascii="Calibri" w:cs="Calibri" w:eastAsia="Calibri" w:hAnsi="Calibri"/>
+                <w:b w:val="false"/>
+                <w:bCs w:val="false"/>
+                <w:sz w:val="20"/>
+                <w:szCs w:val="20"/>
+              </w:rPr>
+              <w:t xml:space="preserve">local ou s3.</w:t>
+            </w:r>
+          </w:p>
+        </w:tc>
+      </w:tr>
+      <w:tr>
+        <w:trPr>
+          <w:cantSplit/>
+          <w:tblHeader w:val="false"/>
+        </w:trPr>
+        <w:tc>
+          <w:tcPr>
+            <w:tcW w:type="dxa" w:w="3031"/>
+            <w:tcBorders>
+              <w:top w:val="single" w:color="B7C4D6" w:sz="4"/>
+              <w:left w:val="single" w:color="B7C4D6" w:sz="4"/>
+              <w:bottom w:val="single" w:color="B7C4D6" w:sz="4"/>
+              <w:right w:val="single" w:color="B7C4D6" w:sz="4"/>
+            </w:tcBorders>
+            <w:tcMar>
+              <w:top w:type="dxa" w:w="60"/>
+              <w:left w:type="dxa" w:w="100"/>
+              <w:bottom w:type="dxa" w:w="60"/>
+              <w:right w:type="dxa" w:w="100"/>
+            </w:tcMar>
+          </w:tcPr>
+          <w:p>
+            <w:r>
+              <w:rPr>
+                <w:rFonts w:ascii="Calibri" w:cs="Calibri" w:eastAsia="Calibri" w:hAnsi="Calibri"/>
+                <w:b/>
+                <w:bCs/>
+                <w:sz w:val="20"/>
+                <w:szCs w:val="20"/>
+              </w:rPr>
+              <w:t xml:space="preserve">S3_* / AWS_*</w:t>
+            </w:r>
+          </w:p>
+        </w:tc>
+        <w:tc>
+          <w:tcPr>
+            <w:tcW w:type="dxa" w:w="7075"/>
+            <w:tcBorders>
+              <w:top w:val="single" w:color="B7C4D6" w:sz="4"/>
+              <w:left w:val="single" w:color="B7C4D6" w:sz="4"/>
+              <w:bottom w:val="single" w:color="B7C4D6" w:sz="4"/>
+              <w:right w:val="single" w:color="B7C4D6" w:sz="4"/>
+            </w:tcBorders>
+            <w:tcMar>
+              <w:top w:type="dxa" w:w="60"/>
+              <w:left w:type="dxa" w:w="100"/>
+              <w:bottom w:type="dxa" w:w="60"/>
+              <w:right w:type="dxa" w:w="100"/>
+            </w:tcMar>
+          </w:tcPr>
+          <w:p>
+            <w:r>
+              <w:rPr>
+                <w:rFonts w:ascii="Calibri" w:cs="Calibri" w:eastAsia="Calibri" w:hAnsi="Calibri"/>
+                <w:b w:val="false"/>
+                <w:bCs w:val="false"/>
+                <w:sz w:val="20"/>
+                <w:szCs w:val="20"/>
+              </w:rPr>
+              <w:t xml:space="preserve">Credenciais e bucket S3/MinIO (se STORAGE_MODE=s3).</w:t>
+            </w:r>
+          </w:p>
+        </w:tc>
+      </w:tr>
+      <w:tr>
+        <w:trPr>
+          <w:cantSplit/>
+          <w:tblHeader w:val="false"/>
+        </w:trPr>
+        <w:tc>
+          <w:tcPr>
+            <w:tcW w:type="dxa" w:w="3031"/>
+            <w:tcBorders>
+              <w:top w:val="single" w:color="B7C4D6" w:sz="4"/>
+              <w:left w:val="single" w:color="B7C4D6" w:sz="4"/>
+              <w:bottom w:val="single" w:color="B7C4D6" w:sz="4"/>
+              <w:right w:val="single" w:color="B7C4D6" w:sz="4"/>
+            </w:tcBorders>
+            <w:tcMar>
+              <w:top w:type="dxa" w:w="60"/>
+              <w:left w:type="dxa" w:w="100"/>
+              <w:bottom w:type="dxa" w:w="60"/>
+              <w:right w:type="dxa" w:w="100"/>
+            </w:tcMar>
+          </w:tcPr>
+          <w:p>
+            <w:r>
+              <w:rPr>
+                <w:rFonts w:ascii="Calibri" w:cs="Calibri" w:eastAsia="Calibri" w:hAnsi="Calibri"/>
+                <w:b/>
+                <w:bCs/>
+                <w:sz w:val="20"/>
+                <w:szCs w:val="20"/>
+              </w:rPr>
+              <w:t xml:space="preserve">STORAGE_ENCRYPTION_KEY</w:t>
+            </w:r>
+          </w:p>
+        </w:tc>
+        <w:tc>
+          <w:tcPr>
+            <w:tcW w:type="dxa" w:w="7075"/>
+            <w:tcBorders>
+              <w:top w:val="single" w:color="B7C4D6" w:sz="4"/>
+              <w:left w:val="single" w:color="B7C4D6" w:sz="4"/>
+              <w:bottom w:val="single" w:color="B7C4D6" w:sz="4"/>
+              <w:right w:val="single" w:color="B7C4D6" w:sz="4"/>
+            </w:tcBorders>
+            <w:tcMar>
+              <w:top w:type="dxa" w:w="60"/>
+              <w:left w:type="dxa" w:w="100"/>
+              <w:bottom w:type="dxa" w:w="60"/>
+              <w:right w:type="dxa" w:w="100"/>
+            </w:tcMar>
+          </w:tcPr>
+          <w:p>
+            <w:r>
+              <w:rPr>
+                <w:rFonts w:ascii="Calibri" w:cs="Calibri" w:eastAsia="Calibri" w:hAnsi="Calibri"/>
+                <w:b w:val="false"/>
+                <w:bCs w:val="false"/>
+                <w:sz w:val="20"/>
+                <w:szCs w:val="20"/>
+              </w:rPr>
+              <w:t xml:space="preserve">Chave AES-256 para criptografar senhas WebDAV. 64 hex chars.</w:t>
+            </w:r>
+          </w:p>
+        </w:tc>
+      </w:tr>
+      <w:tr>
+        <w:trPr>
+          <w:cantSplit/>
+          <w:tblHeader w:val="false"/>
+        </w:trPr>
+        <w:tc>
+          <w:tcPr>
+            <w:tcW w:type="dxa" w:w="3031"/>
+            <w:tcBorders>
+              <w:top w:val="single" w:color="B7C4D6" w:sz="4"/>
+              <w:left w:val="single" w:color="B7C4D6" w:sz="4"/>
+              <w:bottom w:val="single" w:color="B7C4D6" w:sz="4"/>
+              <w:right w:val="single" w:color="B7C4D6" w:sz="4"/>
+            </w:tcBorders>
+            <w:tcMar>
+              <w:top w:type="dxa" w:w="60"/>
+              <w:left w:type="dxa" w:w="100"/>
+              <w:bottom w:type="dxa" w:w="60"/>
+              <w:right w:type="dxa" w:w="100"/>
+            </w:tcMar>
+          </w:tcPr>
+          <w:p>
+            <w:r>
+              <w:rPr>
+                <w:rFonts w:ascii="Calibri" w:cs="Calibri" w:eastAsia="Calibri" w:hAnsi="Calibri"/>
+                <w:b/>
+                <w:bCs/>
+                <w:sz w:val="20"/>
+                <w:szCs w:val="20"/>
+              </w:rPr>
+              <w:t xml:space="preserve">Migrations</w:t>
+            </w:r>
+          </w:p>
+        </w:tc>
+        <w:tc>
+          <w:tcPr>
+            <w:tcW w:type="dxa" w:w="7075"/>
+            <w:tcBorders>
+              <w:top w:val="single" w:color="B7C4D6" w:sz="4"/>
+              <w:left w:val="single" w:color="B7C4D6" w:sz="4"/>
+              <w:bottom w:val="single" w:color="B7C4D6" w:sz="4"/>
+              <w:right w:val="single" w:color="B7C4D6" w:sz="4"/>
+            </w:tcBorders>
+            <w:tcMar>
+              <w:top w:type="dxa" w:w="60"/>
+              <w:left w:type="dxa" w:w="100"/>
+              <w:bottom w:type="dxa" w:w="60"/>
+              <w:right w:type="dxa" w:w="100"/>
+            </w:tcMar>
+          </w:tcPr>
+          <w:p>
+            <w:r>
+              <w:rPr>
+                <w:rFonts w:ascii="Calibri" w:cs="Calibri" w:eastAsia="Calibri" w:hAnsi="Calibri"/>
+                <w:b w:val="false"/>
+                <w:bCs w:val="false"/>
+                <w:sz w:val="20"/>
+                <w:szCs w:val="20"/>
+              </w:rPr>
+              <w:t xml:space="preserve">Aplicadas automaticamente quando a API sobe (inclui as funções mymemory_parse_date e mymemory_parse_number).</w:t>
+            </w:r>
+          </w:p>
+        </w:tc>
+      </w:tr>
+      <w:tr>
+        <w:trPr>
+          <w:cantSplit/>
+          <w:tblHeader w:val="false"/>
+        </w:trPr>
+        <w:tc>
+          <w:tcPr>
+            <w:tcW w:type="dxa" w:w="3031"/>
+            <w:tcBorders>
+              <w:top w:val="single" w:color="B7C4D6" w:sz="4"/>
+              <w:left w:val="single" w:color="B7C4D6" w:sz="4"/>
+              <w:bottom w:val="single" w:color="B7C4D6" w:sz="4"/>
+              <w:right w:val="single" w:color="B7C4D6" w:sz="4"/>
+            </w:tcBorders>
+            <w:tcMar>
+              <w:top w:type="dxa" w:w="60"/>
+              <w:left w:type="dxa" w:w="100"/>
+              <w:bottom w:type="dxa" w:w="60"/>
+              <w:right w:type="dxa" w:w="100"/>
+            </w:tcMar>
+          </w:tcPr>
+          <w:p>
+            <w:r>
+              <w:rPr>
+                <w:rFonts w:ascii="Calibri" w:cs="Calibri" w:eastAsia="Calibri" w:hAnsi="Calibri"/>
+                <w:b/>
+                <w:bCs/>
+                <w:sz w:val="20"/>
+                <w:szCs w:val="20"/>
+              </w:rPr>
+              <w:t xml:space="preserve">USE_DEV_FALLBACK</w:t>
+            </w:r>
+          </w:p>
+        </w:tc>
+        <w:tc>
+          <w:tcPr>
+            <w:tcW w:type="dxa" w:w="7075"/>
+            <w:tcBorders>
+              <w:top w:val="single" w:color="B7C4D6" w:sz="4"/>
+              <w:left w:val="single" w:color="B7C4D6" w:sz="4"/>
+              <w:bottom w:val="single" w:color="B7C4D6" w:sz="4"/>
+              <w:right w:val="single" w:color="B7C4D6" w:sz="4"/>
+            </w:tcBorders>
+            <w:tcMar>
+              <w:top w:type="dxa" w:w="60"/>
+              <w:left w:type="dxa" w:w="100"/>
+              <w:bottom w:type="dxa" w:w="60"/>
+              <w:right w:type="dxa" w:w="100"/>
+            </w:tcMar>
+          </w:tcPr>
+          <w:p>
+            <w:r>
+              <w:rPr>
+                <w:rFonts w:ascii="Calibri" w:cs="Calibri" w:eastAsia="Calibri" w:hAnsi="Calibri"/>
+                <w:b w:val="false"/>
+                <w:bCs w:val="false"/>
+                <w:sz w:val="20"/>
+                <w:szCs w:val="20"/>
+              </w:rPr>
+              <w:t xml:space="preserve">1 para desativar auth em dev local (não usar em prod!).</w:t>
             </w:r>
           </w:p>
         </w:tc>
@@ -34649,7 +35072,7 @@
         <w:rPr>
           <w:rFonts w:ascii="Calibri" w:cs="Calibri" w:eastAsia="Calibri" w:hAnsi="Calibri"/>
         </w:rPr>
-        <w:t xml:space="preserve">Rotas de todos os admins</w:t>
+        <w:t xml:space="preserve">Comandos úteis (servidor)</w:t>
       </w:r>
     </w:p>
     <w:tbl>
@@ -34766,7 +35189,7 @@
                 <w:sz w:val="20"/>
                 <w:szCs w:val="20"/>
               </w:rPr>
-              <w:t xml:space="preserve">/admin</w:t>
+              <w:t xml:space="preserve">docker compose ps</w:t>
             </w:r>
           </w:p>
         </w:tc>
@@ -34795,7 +35218,7 @@
                 <w:sz w:val="20"/>
                 <w:szCs w:val="20"/>
               </w:rPr>
-              <w:t xml:space="preserve">Painel principal (planos, custos, diagnósticos, etc.)</w:t>
+              <w:t xml:space="preserve">Ver status dos containers.</w:t>
             </w:r>
           </w:p>
         </w:tc>
@@ -34830,7 +35253,7 @@
                 <w:sz w:val="20"/>
                 <w:szCs w:val="20"/>
               </w:rPr>
-              <w:t xml:space="preserve">/admin/midia</w:t>
+              <w:t xml:space="preserve">docker compose logs api --tail=50</w:t>
             </w:r>
           </w:p>
         </w:tc>
@@ -34859,7 +35282,7 @@
                 <w:sz w:val="20"/>
                 <w:szCs w:val="20"/>
               </w:rPr>
-              <w:t xml:space="preserve">Mídia por plano (limites e opções por tipo)</w:t>
+              <w:t xml:space="preserve">Ver últimos logs da API.</w:t>
             </w:r>
           </w:p>
         </w:tc>
@@ -34894,7 +35317,7 @@
                 <w:sz w:val="20"/>
                 <w:szCs w:val="20"/>
               </w:rPr>
-              <w:t xml:space="preserve">/admin/documento-ia</w:t>
+              <w:t xml:space="preserve">docker compose up -d</w:t>
             </w:r>
           </w:p>
         </w:tc>
@@ -34923,7 +35346,7 @@
                 <w:sz w:val="20"/>
                 <w:szCs w:val="20"/>
               </w:rPr>
-              <w:t xml:space="preserve">Roteamento de documentos para os extratores de texto</w:t>
+              <w:t xml:space="preserve">Iniciar/reiniciar todos os containers.</w:t>
             </w:r>
           </w:p>
         </w:tc>
@@ -34958,7 +35381,7 @@
                 <w:sz w:val="20"/>
                 <w:szCs w:val="20"/>
               </w:rPr>
-              <w:t xml:space="preserve">/admin/cad-pipeline</w:t>
+              <w:t xml:space="preserve">docker compose pull &amp;&amp; docker compose up -d</w:t>
             </w:r>
           </w:p>
         </w:tc>
@@ -34987,7 +35410,7 @@
                 <w:sz w:val="20"/>
                 <w:szCs w:val="20"/>
               </w:rPr>
-              <w:t xml:space="preserve">Processamento CAD/BIM (.ifc)</w:t>
+              <w:t xml:space="preserve">Atualizar para a versão mais recente (após deploy).</w:t>
             </w:r>
           </w:p>
         </w:tc>
@@ -35022,7 +35445,7 @@
                 <w:sz w:val="20"/>
                 <w:szCs w:val="20"/>
               </w:rPr>
-              <w:t xml:space="preserve">/admin/system-config</w:t>
+              <w:t xml:space="preserve">npm run migration:run --workspace=@mymemory/api</w:t>
             </w:r>
           </w:p>
         </w:tc>
@@ -35051,7 +35474,7 @@
                 <w:sz w:val="20"/>
                 <w:szCs w:val="20"/>
               </w:rPr>
-              <w:t xml:space="preserve">Configurações globais do sistema</w:t>
+              <w:t xml:space="preserve">Executar migrações pendentes do banco.</w:t>
             </w:r>
           </w:p>
         </w:tc>
@@ -35086,7 +35509,7 @@
                 <w:sz w:val="20"/>
                 <w:szCs w:val="20"/>
               </w:rPr>
-              <w:t xml:space="preserve">/admin/llm-prompt</w:t>
+              <w:t xml:space="preserve">npm run migration:show --workspace=@mymemory/api</w:t>
             </w:r>
           </w:p>
         </w:tc>
@@ -35115,7 +35538,109 @@
                 <w:sz w:val="20"/>
                 <w:szCs w:val="20"/>
               </w:rPr>
-              <w:t xml:space="preserve">Último prompt enviado à IA (diagnóstico)</w:t>
+              <w:t xml:space="preserve">Ver status de todas as migrações.</w:t>
+            </w:r>
+          </w:p>
+        </w:tc>
+      </w:tr>
+    </w:tbl>
+    <w:p>
+      <w:pPr>
+        <w:spacing w:after="60"/>
+      </w:pPr>
+    </w:p>
+    <w:p>
+      <w:pPr>
+        <w:pStyle w:val="Heading2"/>
+        <w:keepNext/>
+      </w:pPr>
+      <w:r>
+        <w:rPr>
+          <w:rFonts w:ascii="Calibri" w:cs="Calibri" w:eastAsia="Calibri" w:hAnsi="Calibri"/>
+        </w:rPr>
+        <w:t xml:space="preserve">Deploy padrão</w:t>
+      </w:r>
+    </w:p>
+    <w:tbl>
+      <w:tblPr>
+        <w:tblW w:type="dxa" w:w="10106"/>
+        <w:tblBorders>
+          <w:top w:val="single" w:color="auto" w:sz="4"/>
+          <w:left w:val="single" w:color="auto" w:sz="4"/>
+          <w:bottom w:val="single" w:color="auto" w:sz="4"/>
+          <w:right w:val="single" w:color="auto" w:sz="4"/>
+          <w:insideH w:val="single" w:color="auto" w:sz="4"/>
+          <w:insideV w:val="single" w:color="auto" w:sz="4"/>
+        </w:tblBorders>
+      </w:tblPr>
+      <w:tblGrid>
+        <w:gridCol w:w="3031"/>
+        <w:gridCol w:w="7075"/>
+      </w:tblGrid>
+      <w:tr>
+        <w:trPr>
+          <w:cantSplit/>
+          <w:tblHeader/>
+        </w:trPr>
+        <w:tc>
+          <w:tcPr>
+            <w:tcW w:type="dxa" w:w="3031"/>
+            <w:tcBorders>
+              <w:top w:val="single" w:color="B7C4D6" w:sz="4"/>
+              <w:left w:val="single" w:color="B7C4D6" w:sz="4"/>
+              <w:bottom w:val="single" w:color="B7C4D6" w:sz="4"/>
+              <w:right w:val="single" w:color="B7C4D6" w:sz="4"/>
+            </w:tcBorders>
+            <w:shd w:fill="D0E4FF" w:color="auto" w:val="clear"/>
+            <w:tcMar>
+              <w:top w:type="dxa" w:w="60"/>
+              <w:left w:type="dxa" w:w="100"/>
+              <w:bottom w:type="dxa" w:w="60"/>
+              <w:right w:type="dxa" w:w="100"/>
+            </w:tcMar>
+          </w:tcPr>
+          <w:p>
+            <w:r>
+              <w:rPr>
+                <w:rFonts w:ascii="Calibri" w:cs="Calibri" w:eastAsia="Calibri" w:hAnsi="Calibri"/>
+                <w:b/>
+                <w:bCs/>
+                <w:color w:val="1E3A5F"/>
+                <w:sz w:val="20"/>
+                <w:szCs w:val="20"/>
+              </w:rPr>
+              <w:t xml:space="preserve">Campo / Elemento</w:t>
+            </w:r>
+          </w:p>
+        </w:tc>
+        <w:tc>
+          <w:tcPr>
+            <w:tcW w:type="dxa" w:w="7075"/>
+            <w:tcBorders>
+              <w:top w:val="single" w:color="B7C4D6" w:sz="4"/>
+              <w:left w:val="single" w:color="B7C4D6" w:sz="4"/>
+              <w:bottom w:val="single" w:color="B7C4D6" w:sz="4"/>
+              <w:right w:val="single" w:color="B7C4D6" w:sz="4"/>
+            </w:tcBorders>
+            <w:shd w:fill="D0E4FF" w:color="auto" w:val="clear"/>
+            <w:tcMar>
+              <w:top w:type="dxa" w:w="60"/>
+              <w:left w:type="dxa" w:w="100"/>
+              <w:bottom w:type="dxa" w:w="60"/>
+              <w:right w:type="dxa" w:w="100"/>
+            </w:tcMar>
+          </w:tcPr>
+          <w:p>
+            <w:r>
+              <w:rPr>
+                <w:rFonts w:ascii="Calibri" w:cs="Calibri" w:eastAsia="Calibri" w:hAnsi="Calibri"/>
+                <w:b/>
+                <w:bCs/>
+                <w:color w:val="1E3A5F"/>
+                <w:sz w:val="20"/>
+                <w:szCs w:val="20"/>
+              </w:rPr>
+              <w:t xml:space="preserve">Descrição</w:t>
             </w:r>
           </w:p>
         </w:tc>
@@ -35150,7 +35675,7 @@
                 <w:sz w:val="20"/>
                 <w:szCs w:val="20"/>
               </w:rPr>
-              <w:t xml:space="preserve">/admin/assinaturas</w:t>
+              <w:t xml:space="preserve">1. Commit no master</w:t>
             </w:r>
           </w:p>
         </w:tc>
@@ -35179,7 +35704,7 @@
                 <w:sz w:val="20"/>
                 <w:szCs w:val="20"/>
               </w:rPr>
-              <w:t xml:space="preserve">Assinaturas de usuários e grupos</w:t>
+              <w:t xml:space="preserve">git add . &amp;&amp; git commit -m '...'</w:t>
             </w:r>
           </w:p>
         </w:tc>
@@ -35214,7 +35739,7 @@
                 <w:sz w:val="20"/>
                 <w:szCs w:val="20"/>
               </w:rPr>
-              <w:t xml:space="preserve">/admin/storage</w:t>
+              <w:t xml:space="preserve">2. Push master</w:t>
             </w:r>
           </w:p>
         </w:tc>
@@ -35243,7 +35768,877 @@
                 <w:sz w:val="20"/>
                 <w:szCs w:val="20"/>
               </w:rPr>
+              <w:t xml:space="preserve">git push origin master</w:t>
+            </w:r>
+          </w:p>
+        </w:tc>
+      </w:tr>
+      <w:tr>
+        <w:trPr>
+          <w:cantSplit/>
+          <w:tblHeader w:val="false"/>
+        </w:trPr>
+        <w:tc>
+          <w:tcPr>
+            <w:tcW w:type="dxa" w:w="3031"/>
+            <w:tcBorders>
+              <w:top w:val="single" w:color="B7C4D6" w:sz="4"/>
+              <w:left w:val="single" w:color="B7C4D6" w:sz="4"/>
+              <w:bottom w:val="single" w:color="B7C4D6" w:sz="4"/>
+              <w:right w:val="single" w:color="B7C4D6" w:sz="4"/>
+            </w:tcBorders>
+            <w:tcMar>
+              <w:top w:type="dxa" w:w="60"/>
+              <w:left w:type="dxa" w:w="100"/>
+              <w:bottom w:type="dxa" w:w="60"/>
+              <w:right w:type="dxa" w:w="100"/>
+            </w:tcMar>
+          </w:tcPr>
+          <w:p>
+            <w:r>
+              <w:rPr>
+                <w:rFonts w:ascii="Calibri" w:cs="Calibri" w:eastAsia="Calibri" w:hAnsi="Calibri"/>
+                <w:b/>
+                <w:bCs/>
+                <w:sz w:val="20"/>
+                <w:szCs w:val="20"/>
+              </w:rPr>
+              <w:t xml:space="preserve">3. Merge para production</w:t>
+            </w:r>
+          </w:p>
+        </w:tc>
+        <w:tc>
+          <w:tcPr>
+            <w:tcW w:type="dxa" w:w="7075"/>
+            <w:tcBorders>
+              <w:top w:val="single" w:color="B7C4D6" w:sz="4"/>
+              <w:left w:val="single" w:color="B7C4D6" w:sz="4"/>
+              <w:bottom w:val="single" w:color="B7C4D6" w:sz="4"/>
+              <w:right w:val="single" w:color="B7C4D6" w:sz="4"/>
+            </w:tcBorders>
+            <w:tcMar>
+              <w:top w:type="dxa" w:w="60"/>
+              <w:left w:type="dxa" w:w="100"/>
+              <w:bottom w:type="dxa" w:w="60"/>
+              <w:right w:type="dxa" w:w="100"/>
+            </w:tcMar>
+          </w:tcPr>
+          <w:p>
+            <w:r>
+              <w:rPr>
+                <w:rFonts w:ascii="Calibri" w:cs="Calibri" w:eastAsia="Calibri" w:hAnsi="Calibri"/>
+                <w:b w:val="false"/>
+                <w:bCs w:val="false"/>
+                <w:sz w:val="20"/>
+                <w:szCs w:val="20"/>
+              </w:rPr>
+              <w:t xml:space="preserve">git checkout production &amp;&amp; git merge master &amp;&amp; git push origin production</w:t>
+            </w:r>
+          </w:p>
+        </w:tc>
+      </w:tr>
+      <w:tr>
+        <w:trPr>
+          <w:cantSplit/>
+          <w:tblHeader w:val="false"/>
+        </w:trPr>
+        <w:tc>
+          <w:tcPr>
+            <w:tcW w:type="dxa" w:w="3031"/>
+            <w:tcBorders>
+              <w:top w:val="single" w:color="B7C4D6" w:sz="4"/>
+              <w:left w:val="single" w:color="B7C4D6" w:sz="4"/>
+              <w:bottom w:val="single" w:color="B7C4D6" w:sz="4"/>
+              <w:right w:val="single" w:color="B7C4D6" w:sz="4"/>
+            </w:tcBorders>
+            <w:tcMar>
+              <w:top w:type="dxa" w:w="60"/>
+              <w:left w:type="dxa" w:w="100"/>
+              <w:bottom w:type="dxa" w:w="60"/>
+              <w:right w:type="dxa" w:w="100"/>
+            </w:tcMar>
+          </w:tcPr>
+          <w:p>
+            <w:r>
+              <w:rPr>
+                <w:rFonts w:ascii="Calibri" w:cs="Calibri" w:eastAsia="Calibri" w:hAnsi="Calibri"/>
+                <w:b/>
+                <w:bCs/>
+                <w:sz w:val="20"/>
+                <w:szCs w:val="20"/>
+              </w:rPr>
+              <w:t xml:space="preserve">4. GitHub Actions dispara</w:t>
+            </w:r>
+          </w:p>
+        </w:tc>
+        <w:tc>
+          <w:tcPr>
+            <w:tcW w:type="dxa" w:w="7075"/>
+            <w:tcBorders>
+              <w:top w:val="single" w:color="B7C4D6" w:sz="4"/>
+              <w:left w:val="single" w:color="B7C4D6" w:sz="4"/>
+              <w:bottom w:val="single" w:color="B7C4D6" w:sz="4"/>
+              <w:right w:val="single" w:color="B7C4D6" w:sz="4"/>
+            </w:tcBorders>
+            <w:tcMar>
+              <w:top w:type="dxa" w:w="60"/>
+              <w:left w:type="dxa" w:w="100"/>
+              <w:bottom w:type="dxa" w:w="60"/>
+              <w:right w:type="dxa" w:w="100"/>
+            </w:tcMar>
+          </w:tcPr>
+          <w:p>
+            <w:r>
+              <w:rPr>
+                <w:rFonts w:ascii="Calibri" w:cs="Calibri" w:eastAsia="Calibri" w:hAnsi="Calibri"/>
+                <w:b w:val="false"/>
+                <w:bCs w:val="false"/>
+                <w:sz w:val="20"/>
+                <w:szCs w:val="20"/>
+              </w:rPr>
+              <w:t xml:space="preserve">Ver progresso na aba Actions do repositório no GitHub.</w:t>
+            </w:r>
+          </w:p>
+        </w:tc>
+      </w:tr>
+      <w:tr>
+        <w:trPr>
+          <w:cantSplit/>
+          <w:tblHeader w:val="false"/>
+        </w:trPr>
+        <w:tc>
+          <w:tcPr>
+            <w:tcW w:type="dxa" w:w="3031"/>
+            <w:tcBorders>
+              <w:top w:val="single" w:color="B7C4D6" w:sz="4"/>
+              <w:left w:val="single" w:color="B7C4D6" w:sz="4"/>
+              <w:bottom w:val="single" w:color="B7C4D6" w:sz="4"/>
+              <w:right w:val="single" w:color="B7C4D6" w:sz="4"/>
+            </w:tcBorders>
+            <w:tcMar>
+              <w:top w:type="dxa" w:w="60"/>
+              <w:left w:type="dxa" w:w="100"/>
+              <w:bottom w:type="dxa" w:w="60"/>
+              <w:right w:type="dxa" w:w="100"/>
+            </w:tcMar>
+          </w:tcPr>
+          <w:p>
+            <w:r>
+              <w:rPr>
+                <w:rFonts w:ascii="Calibri" w:cs="Calibri" w:eastAsia="Calibri" w:hAnsi="Calibri"/>
+                <w:b/>
+                <w:bCs/>
+                <w:sz w:val="20"/>
+                <w:szCs w:val="20"/>
+              </w:rPr>
+              <w:t xml:space="preserve">5. Deploy automático</w:t>
+            </w:r>
+          </w:p>
+        </w:tc>
+        <w:tc>
+          <w:tcPr>
+            <w:tcW w:type="dxa" w:w="7075"/>
+            <w:tcBorders>
+              <w:top w:val="single" w:color="B7C4D6" w:sz="4"/>
+              <w:left w:val="single" w:color="B7C4D6" w:sz="4"/>
+              <w:bottom w:val="single" w:color="B7C4D6" w:sz="4"/>
+              <w:right w:val="single" w:color="B7C4D6" w:sz="4"/>
+            </w:tcBorders>
+            <w:tcMar>
+              <w:top w:type="dxa" w:w="60"/>
+              <w:left w:type="dxa" w:w="100"/>
+              <w:bottom w:type="dxa" w:w="60"/>
+              <w:right w:type="dxa" w:w="100"/>
+            </w:tcMar>
+          </w:tcPr>
+          <w:p>
+            <w:r>
+              <w:rPr>
+                <w:rFonts w:ascii="Calibri" w:cs="Calibri" w:eastAsia="Calibri" w:hAnsi="Calibri"/>
+                <w:b w:val="false"/>
+                <w:bCs w:val="false"/>
+                <w:sz w:val="20"/>
+                <w:szCs w:val="20"/>
+              </w:rPr>
+              <w:t xml:space="preserve">API e Web são reconstruídos e reiniciados no servidor via docker compose.</w:t>
+            </w:r>
+          </w:p>
+        </w:tc>
+      </w:tr>
+    </w:tbl>
+    <w:p>
+      <w:pPr>
+        <w:spacing w:after="60"/>
+      </w:pPr>
+    </w:p>
+    <w:p>
+      <w:pPr>
+        <w:pStyle w:val="Heading2"/>
+        <w:keepNext/>
+      </w:pPr>
+      <w:r>
+        <w:rPr>
+          <w:rFonts w:ascii="Calibri" w:cs="Calibri" w:eastAsia="Calibri" w:hAnsi="Calibri"/>
+        </w:rPr>
+        <w:t xml:space="preserve">Rotas de todos os admins</w:t>
+      </w:r>
+    </w:p>
+    <w:tbl>
+      <w:tblPr>
+        <w:tblW w:type="dxa" w:w="10106"/>
+        <w:tblBorders>
+          <w:top w:val="single" w:color="auto" w:sz="4"/>
+          <w:left w:val="single" w:color="auto" w:sz="4"/>
+          <w:bottom w:val="single" w:color="auto" w:sz="4"/>
+          <w:right w:val="single" w:color="auto" w:sz="4"/>
+          <w:insideH w:val="single" w:color="auto" w:sz="4"/>
+          <w:insideV w:val="single" w:color="auto" w:sz="4"/>
+        </w:tblBorders>
+      </w:tblPr>
+      <w:tblGrid>
+        <w:gridCol w:w="3031"/>
+        <w:gridCol w:w="7075"/>
+      </w:tblGrid>
+      <w:tr>
+        <w:trPr>
+          <w:cantSplit/>
+          <w:tblHeader/>
+        </w:trPr>
+        <w:tc>
+          <w:tcPr>
+            <w:tcW w:type="dxa" w:w="3031"/>
+            <w:tcBorders>
+              <w:top w:val="single" w:color="B7C4D6" w:sz="4"/>
+              <w:left w:val="single" w:color="B7C4D6" w:sz="4"/>
+              <w:bottom w:val="single" w:color="B7C4D6" w:sz="4"/>
+              <w:right w:val="single" w:color="B7C4D6" w:sz="4"/>
+            </w:tcBorders>
+            <w:shd w:fill="D0E4FF" w:color="auto" w:val="clear"/>
+            <w:tcMar>
+              <w:top w:type="dxa" w:w="60"/>
+              <w:left w:type="dxa" w:w="100"/>
+              <w:bottom w:type="dxa" w:w="60"/>
+              <w:right w:type="dxa" w:w="100"/>
+            </w:tcMar>
+          </w:tcPr>
+          <w:p>
+            <w:r>
+              <w:rPr>
+                <w:rFonts w:ascii="Calibri" w:cs="Calibri" w:eastAsia="Calibri" w:hAnsi="Calibri"/>
+                <w:b/>
+                <w:bCs/>
+                <w:color w:val="1E3A5F"/>
+                <w:sz w:val="20"/>
+                <w:szCs w:val="20"/>
+              </w:rPr>
+              <w:t xml:space="preserve">Campo / Elemento</w:t>
+            </w:r>
+          </w:p>
+        </w:tc>
+        <w:tc>
+          <w:tcPr>
+            <w:tcW w:type="dxa" w:w="7075"/>
+            <w:tcBorders>
+              <w:top w:val="single" w:color="B7C4D6" w:sz="4"/>
+              <w:left w:val="single" w:color="B7C4D6" w:sz="4"/>
+              <w:bottom w:val="single" w:color="B7C4D6" w:sz="4"/>
+              <w:right w:val="single" w:color="B7C4D6" w:sz="4"/>
+            </w:tcBorders>
+            <w:shd w:fill="D0E4FF" w:color="auto" w:val="clear"/>
+            <w:tcMar>
+              <w:top w:type="dxa" w:w="60"/>
+              <w:left w:type="dxa" w:w="100"/>
+              <w:bottom w:type="dxa" w:w="60"/>
+              <w:right w:type="dxa" w:w="100"/>
+            </w:tcMar>
+          </w:tcPr>
+          <w:p>
+            <w:r>
+              <w:rPr>
+                <w:rFonts w:ascii="Calibri" w:cs="Calibri" w:eastAsia="Calibri" w:hAnsi="Calibri"/>
+                <w:b/>
+                <w:bCs/>
+                <w:color w:val="1E3A5F"/>
+                <w:sz w:val="20"/>
+                <w:szCs w:val="20"/>
+              </w:rPr>
+              <w:t xml:space="preserve">Descrição</w:t>
+            </w:r>
+          </w:p>
+        </w:tc>
+      </w:tr>
+      <w:tr>
+        <w:trPr>
+          <w:cantSplit/>
+          <w:tblHeader w:val="false"/>
+        </w:trPr>
+        <w:tc>
+          <w:tcPr>
+            <w:tcW w:type="dxa" w:w="3031"/>
+            <w:tcBorders>
+              <w:top w:val="single" w:color="B7C4D6" w:sz="4"/>
+              <w:left w:val="single" w:color="B7C4D6" w:sz="4"/>
+              <w:bottom w:val="single" w:color="B7C4D6" w:sz="4"/>
+              <w:right w:val="single" w:color="B7C4D6" w:sz="4"/>
+            </w:tcBorders>
+            <w:tcMar>
+              <w:top w:type="dxa" w:w="60"/>
+              <w:left w:type="dxa" w:w="100"/>
+              <w:bottom w:type="dxa" w:w="60"/>
+              <w:right w:type="dxa" w:w="100"/>
+            </w:tcMar>
+          </w:tcPr>
+          <w:p>
+            <w:r>
+              <w:rPr>
+                <w:rFonts w:ascii="Calibri" w:cs="Calibri" w:eastAsia="Calibri" w:hAnsi="Calibri"/>
+                <w:b/>
+                <w:bCs/>
+                <w:sz w:val="20"/>
+                <w:szCs w:val="20"/>
+              </w:rPr>
+              <w:t xml:space="preserve">/admin</w:t>
+            </w:r>
+          </w:p>
+        </w:tc>
+        <w:tc>
+          <w:tcPr>
+            <w:tcW w:type="dxa" w:w="7075"/>
+            <w:tcBorders>
+              <w:top w:val="single" w:color="B7C4D6" w:sz="4"/>
+              <w:left w:val="single" w:color="B7C4D6" w:sz="4"/>
+              <w:bottom w:val="single" w:color="B7C4D6" w:sz="4"/>
+              <w:right w:val="single" w:color="B7C4D6" w:sz="4"/>
+            </w:tcBorders>
+            <w:tcMar>
+              <w:top w:type="dxa" w:w="60"/>
+              <w:left w:type="dxa" w:w="100"/>
+              <w:bottom w:type="dxa" w:w="60"/>
+              <w:right w:type="dxa" w:w="100"/>
+            </w:tcMar>
+          </w:tcPr>
+          <w:p>
+            <w:r>
+              <w:rPr>
+                <w:rFonts w:ascii="Calibri" w:cs="Calibri" w:eastAsia="Calibri" w:hAnsi="Calibri"/>
+                <w:b w:val="false"/>
+                <w:bCs w:val="false"/>
+                <w:sz w:val="20"/>
+                <w:szCs w:val="20"/>
+              </w:rPr>
+              <w:t xml:space="preserve">Painel principal (planos, custos, diagnósticos, etc.)</w:t>
+            </w:r>
+          </w:p>
+        </w:tc>
+      </w:tr>
+      <w:tr>
+        <w:trPr>
+          <w:cantSplit/>
+          <w:tblHeader w:val="false"/>
+        </w:trPr>
+        <w:tc>
+          <w:tcPr>
+            <w:tcW w:type="dxa" w:w="3031"/>
+            <w:tcBorders>
+              <w:top w:val="single" w:color="B7C4D6" w:sz="4"/>
+              <w:left w:val="single" w:color="B7C4D6" w:sz="4"/>
+              <w:bottom w:val="single" w:color="B7C4D6" w:sz="4"/>
+              <w:right w:val="single" w:color="B7C4D6" w:sz="4"/>
+            </w:tcBorders>
+            <w:tcMar>
+              <w:top w:type="dxa" w:w="60"/>
+              <w:left w:type="dxa" w:w="100"/>
+              <w:bottom w:type="dxa" w:w="60"/>
+              <w:right w:type="dxa" w:w="100"/>
+            </w:tcMar>
+          </w:tcPr>
+          <w:p>
+            <w:r>
+              <w:rPr>
+                <w:rFonts w:ascii="Calibri" w:cs="Calibri" w:eastAsia="Calibri" w:hAnsi="Calibri"/>
+                <w:b/>
+                <w:bCs/>
+                <w:sz w:val="20"/>
+                <w:szCs w:val="20"/>
+              </w:rPr>
+              <w:t xml:space="preserve">/admin/midia</w:t>
+            </w:r>
+          </w:p>
+        </w:tc>
+        <w:tc>
+          <w:tcPr>
+            <w:tcW w:type="dxa" w:w="7075"/>
+            <w:tcBorders>
+              <w:top w:val="single" w:color="B7C4D6" w:sz="4"/>
+              <w:left w:val="single" w:color="B7C4D6" w:sz="4"/>
+              <w:bottom w:val="single" w:color="B7C4D6" w:sz="4"/>
+              <w:right w:val="single" w:color="B7C4D6" w:sz="4"/>
+            </w:tcBorders>
+            <w:tcMar>
+              <w:top w:type="dxa" w:w="60"/>
+              <w:left w:type="dxa" w:w="100"/>
+              <w:bottom w:type="dxa" w:w="60"/>
+              <w:right w:type="dxa" w:w="100"/>
+            </w:tcMar>
+          </w:tcPr>
+          <w:p>
+            <w:r>
+              <w:rPr>
+                <w:rFonts w:ascii="Calibri" w:cs="Calibri" w:eastAsia="Calibri" w:hAnsi="Calibri"/>
+                <w:b w:val="false"/>
+                <w:bCs w:val="false"/>
+                <w:sz w:val="20"/>
+                <w:szCs w:val="20"/>
+              </w:rPr>
+              <w:t xml:space="preserve">Mídia por plano (limites e opções por tipo)</w:t>
+            </w:r>
+          </w:p>
+        </w:tc>
+      </w:tr>
+      <w:tr>
+        <w:trPr>
+          <w:cantSplit/>
+          <w:tblHeader w:val="false"/>
+        </w:trPr>
+        <w:tc>
+          <w:tcPr>
+            <w:tcW w:type="dxa" w:w="3031"/>
+            <w:tcBorders>
+              <w:top w:val="single" w:color="B7C4D6" w:sz="4"/>
+              <w:left w:val="single" w:color="B7C4D6" w:sz="4"/>
+              <w:bottom w:val="single" w:color="B7C4D6" w:sz="4"/>
+              <w:right w:val="single" w:color="B7C4D6" w:sz="4"/>
+            </w:tcBorders>
+            <w:tcMar>
+              <w:top w:type="dxa" w:w="60"/>
+              <w:left w:type="dxa" w:w="100"/>
+              <w:bottom w:type="dxa" w:w="60"/>
+              <w:right w:type="dxa" w:w="100"/>
+            </w:tcMar>
+          </w:tcPr>
+          <w:p>
+            <w:r>
+              <w:rPr>
+                <w:rFonts w:ascii="Calibri" w:cs="Calibri" w:eastAsia="Calibri" w:hAnsi="Calibri"/>
+                <w:b/>
+                <w:bCs/>
+                <w:sz w:val="20"/>
+                <w:szCs w:val="20"/>
+              </w:rPr>
+              <w:t xml:space="preserve">/admin/documento-ia</w:t>
+            </w:r>
+          </w:p>
+        </w:tc>
+        <w:tc>
+          <w:tcPr>
+            <w:tcW w:type="dxa" w:w="7075"/>
+            <w:tcBorders>
+              <w:top w:val="single" w:color="B7C4D6" w:sz="4"/>
+              <w:left w:val="single" w:color="B7C4D6" w:sz="4"/>
+              <w:bottom w:val="single" w:color="B7C4D6" w:sz="4"/>
+              <w:right w:val="single" w:color="B7C4D6" w:sz="4"/>
+            </w:tcBorders>
+            <w:tcMar>
+              <w:top w:type="dxa" w:w="60"/>
+              <w:left w:type="dxa" w:w="100"/>
+              <w:bottom w:type="dxa" w:w="60"/>
+              <w:right w:type="dxa" w:w="100"/>
+            </w:tcMar>
+          </w:tcPr>
+          <w:p>
+            <w:r>
+              <w:rPr>
+                <w:rFonts w:ascii="Calibri" w:cs="Calibri" w:eastAsia="Calibri" w:hAnsi="Calibri"/>
+                <w:b w:val="false"/>
+                <w:bCs w:val="false"/>
+                <w:sz w:val="20"/>
+                <w:szCs w:val="20"/>
+              </w:rPr>
+              <w:t xml:space="preserve">Roteamento de documentos para os extratores de texto</w:t>
+            </w:r>
+          </w:p>
+        </w:tc>
+      </w:tr>
+      <w:tr>
+        <w:trPr>
+          <w:cantSplit/>
+          <w:tblHeader w:val="false"/>
+        </w:trPr>
+        <w:tc>
+          <w:tcPr>
+            <w:tcW w:type="dxa" w:w="3031"/>
+            <w:tcBorders>
+              <w:top w:val="single" w:color="B7C4D6" w:sz="4"/>
+              <w:left w:val="single" w:color="B7C4D6" w:sz="4"/>
+              <w:bottom w:val="single" w:color="B7C4D6" w:sz="4"/>
+              <w:right w:val="single" w:color="B7C4D6" w:sz="4"/>
+            </w:tcBorders>
+            <w:tcMar>
+              <w:top w:type="dxa" w:w="60"/>
+              <w:left w:type="dxa" w:w="100"/>
+              <w:bottom w:type="dxa" w:w="60"/>
+              <w:right w:type="dxa" w:w="100"/>
+            </w:tcMar>
+          </w:tcPr>
+          <w:p>
+            <w:r>
+              <w:rPr>
+                <w:rFonts w:ascii="Calibri" w:cs="Calibri" w:eastAsia="Calibri" w:hAnsi="Calibri"/>
+                <w:b/>
+                <w:bCs/>
+                <w:sz w:val="20"/>
+                <w:szCs w:val="20"/>
+              </w:rPr>
+              <w:t xml:space="preserve">/admin/cad-pipeline</w:t>
+            </w:r>
+          </w:p>
+        </w:tc>
+        <w:tc>
+          <w:tcPr>
+            <w:tcW w:type="dxa" w:w="7075"/>
+            <w:tcBorders>
+              <w:top w:val="single" w:color="B7C4D6" w:sz="4"/>
+              <w:left w:val="single" w:color="B7C4D6" w:sz="4"/>
+              <w:bottom w:val="single" w:color="B7C4D6" w:sz="4"/>
+              <w:right w:val="single" w:color="B7C4D6" w:sz="4"/>
+            </w:tcBorders>
+            <w:tcMar>
+              <w:top w:type="dxa" w:w="60"/>
+              <w:left w:type="dxa" w:w="100"/>
+              <w:bottom w:type="dxa" w:w="60"/>
+              <w:right w:type="dxa" w:w="100"/>
+            </w:tcMar>
+          </w:tcPr>
+          <w:p>
+            <w:r>
+              <w:rPr>
+                <w:rFonts w:ascii="Calibri" w:cs="Calibri" w:eastAsia="Calibri" w:hAnsi="Calibri"/>
+                <w:b w:val="false"/>
+                <w:bCs w:val="false"/>
+                <w:sz w:val="20"/>
+                <w:szCs w:val="20"/>
+              </w:rPr>
+              <w:t xml:space="preserve">Processamento CAD/BIM (.ifc)</w:t>
+            </w:r>
+          </w:p>
+        </w:tc>
+      </w:tr>
+      <w:tr>
+        <w:trPr>
+          <w:cantSplit/>
+          <w:tblHeader w:val="false"/>
+        </w:trPr>
+        <w:tc>
+          <w:tcPr>
+            <w:tcW w:type="dxa" w:w="3031"/>
+            <w:tcBorders>
+              <w:top w:val="single" w:color="B7C4D6" w:sz="4"/>
+              <w:left w:val="single" w:color="B7C4D6" w:sz="4"/>
+              <w:bottom w:val="single" w:color="B7C4D6" w:sz="4"/>
+              <w:right w:val="single" w:color="B7C4D6" w:sz="4"/>
+            </w:tcBorders>
+            <w:tcMar>
+              <w:top w:type="dxa" w:w="60"/>
+              <w:left w:type="dxa" w:w="100"/>
+              <w:bottom w:type="dxa" w:w="60"/>
+              <w:right w:type="dxa" w:w="100"/>
+            </w:tcMar>
+          </w:tcPr>
+          <w:p>
+            <w:r>
+              <w:rPr>
+                <w:rFonts w:ascii="Calibri" w:cs="Calibri" w:eastAsia="Calibri" w:hAnsi="Calibri"/>
+                <w:b/>
+                <w:bCs/>
+                <w:sz w:val="20"/>
+                <w:szCs w:val="20"/>
+              </w:rPr>
+              <w:t xml:space="preserve">/admin/system-config</w:t>
+            </w:r>
+          </w:p>
+        </w:tc>
+        <w:tc>
+          <w:tcPr>
+            <w:tcW w:type="dxa" w:w="7075"/>
+            <w:tcBorders>
+              <w:top w:val="single" w:color="B7C4D6" w:sz="4"/>
+              <w:left w:val="single" w:color="B7C4D6" w:sz="4"/>
+              <w:bottom w:val="single" w:color="B7C4D6" w:sz="4"/>
+              <w:right w:val="single" w:color="B7C4D6" w:sz="4"/>
+            </w:tcBorders>
+            <w:tcMar>
+              <w:top w:type="dxa" w:w="60"/>
+              <w:left w:type="dxa" w:w="100"/>
+              <w:bottom w:type="dxa" w:w="60"/>
+              <w:right w:type="dxa" w:w="100"/>
+            </w:tcMar>
+          </w:tcPr>
+          <w:p>
+            <w:r>
+              <w:rPr>
+                <w:rFonts w:ascii="Calibri" w:cs="Calibri" w:eastAsia="Calibri" w:hAnsi="Calibri"/>
+                <w:b w:val="false"/>
+                <w:bCs w:val="false"/>
+                <w:sz w:val="20"/>
+                <w:szCs w:val="20"/>
+              </w:rPr>
+              <w:t xml:space="preserve">Configurações globais do sistema</w:t>
+            </w:r>
+          </w:p>
+        </w:tc>
+      </w:tr>
+      <w:tr>
+        <w:trPr>
+          <w:cantSplit/>
+          <w:tblHeader w:val="false"/>
+        </w:trPr>
+        <w:tc>
+          <w:tcPr>
+            <w:tcW w:type="dxa" w:w="3031"/>
+            <w:tcBorders>
+              <w:top w:val="single" w:color="B7C4D6" w:sz="4"/>
+              <w:left w:val="single" w:color="B7C4D6" w:sz="4"/>
+              <w:bottom w:val="single" w:color="B7C4D6" w:sz="4"/>
+              <w:right w:val="single" w:color="B7C4D6" w:sz="4"/>
+            </w:tcBorders>
+            <w:tcMar>
+              <w:top w:type="dxa" w:w="60"/>
+              <w:left w:type="dxa" w:w="100"/>
+              <w:bottom w:type="dxa" w:w="60"/>
+              <w:right w:type="dxa" w:w="100"/>
+            </w:tcMar>
+          </w:tcPr>
+          <w:p>
+            <w:r>
+              <w:rPr>
+                <w:rFonts w:ascii="Calibri" w:cs="Calibri" w:eastAsia="Calibri" w:hAnsi="Calibri"/>
+                <w:b/>
+                <w:bCs/>
+                <w:sz w:val="20"/>
+                <w:szCs w:val="20"/>
+              </w:rPr>
+              <w:t xml:space="preserve">/admin/llm-prompt</w:t>
+            </w:r>
+          </w:p>
+        </w:tc>
+        <w:tc>
+          <w:tcPr>
+            <w:tcW w:type="dxa" w:w="7075"/>
+            <w:tcBorders>
+              <w:top w:val="single" w:color="B7C4D6" w:sz="4"/>
+              <w:left w:val="single" w:color="B7C4D6" w:sz="4"/>
+              <w:bottom w:val="single" w:color="B7C4D6" w:sz="4"/>
+              <w:right w:val="single" w:color="B7C4D6" w:sz="4"/>
+            </w:tcBorders>
+            <w:tcMar>
+              <w:top w:type="dxa" w:w="60"/>
+              <w:left w:type="dxa" w:w="100"/>
+              <w:bottom w:type="dxa" w:w="60"/>
+              <w:right w:type="dxa" w:w="100"/>
+            </w:tcMar>
+          </w:tcPr>
+          <w:p>
+            <w:r>
+              <w:rPr>
+                <w:rFonts w:ascii="Calibri" w:cs="Calibri" w:eastAsia="Calibri" w:hAnsi="Calibri"/>
+                <w:b w:val="false"/>
+                <w:bCs w:val="false"/>
+                <w:sz w:val="20"/>
+                <w:szCs w:val="20"/>
+              </w:rPr>
+              <w:t xml:space="preserve">Último prompt enviado à IA (diagnóstico)</w:t>
+            </w:r>
+          </w:p>
+        </w:tc>
+      </w:tr>
+      <w:tr>
+        <w:trPr>
+          <w:cantSplit/>
+          <w:tblHeader w:val="false"/>
+        </w:trPr>
+        <w:tc>
+          <w:tcPr>
+            <w:tcW w:type="dxa" w:w="3031"/>
+            <w:tcBorders>
+              <w:top w:val="single" w:color="B7C4D6" w:sz="4"/>
+              <w:left w:val="single" w:color="B7C4D6" w:sz="4"/>
+              <w:bottom w:val="single" w:color="B7C4D6" w:sz="4"/>
+              <w:right w:val="single" w:color="B7C4D6" w:sz="4"/>
+            </w:tcBorders>
+            <w:tcMar>
+              <w:top w:type="dxa" w:w="60"/>
+              <w:left w:type="dxa" w:w="100"/>
+              <w:bottom w:type="dxa" w:w="60"/>
+              <w:right w:type="dxa" w:w="100"/>
+            </w:tcMar>
+          </w:tcPr>
+          <w:p>
+            <w:r>
+              <w:rPr>
+                <w:rFonts w:ascii="Calibri" w:cs="Calibri" w:eastAsia="Calibri" w:hAnsi="Calibri"/>
+                <w:b/>
+                <w:bCs/>
+                <w:sz w:val="20"/>
+                <w:szCs w:val="20"/>
+              </w:rPr>
+              <w:t xml:space="preserve">/admin/assinaturas</w:t>
+            </w:r>
+          </w:p>
+        </w:tc>
+        <w:tc>
+          <w:tcPr>
+            <w:tcW w:type="dxa" w:w="7075"/>
+            <w:tcBorders>
+              <w:top w:val="single" w:color="B7C4D6" w:sz="4"/>
+              <w:left w:val="single" w:color="B7C4D6" w:sz="4"/>
+              <w:bottom w:val="single" w:color="B7C4D6" w:sz="4"/>
+              <w:right w:val="single" w:color="B7C4D6" w:sz="4"/>
+            </w:tcBorders>
+            <w:tcMar>
+              <w:top w:type="dxa" w:w="60"/>
+              <w:left w:type="dxa" w:w="100"/>
+              <w:bottom w:type="dxa" w:w="60"/>
+              <w:right w:type="dxa" w:w="100"/>
+            </w:tcMar>
+          </w:tcPr>
+          <w:p>
+            <w:r>
+              <w:rPr>
+                <w:rFonts w:ascii="Calibri" w:cs="Calibri" w:eastAsia="Calibri" w:hAnsi="Calibri"/>
+                <w:b w:val="false"/>
+                <w:bCs w:val="false"/>
+                <w:sz w:val="20"/>
+                <w:szCs w:val="20"/>
+              </w:rPr>
+              <w:t xml:space="preserve">Assinaturas de usuários e grupos</w:t>
+            </w:r>
+          </w:p>
+        </w:tc>
+      </w:tr>
+      <w:tr>
+        <w:trPr>
+          <w:cantSplit/>
+          <w:tblHeader w:val="false"/>
+        </w:trPr>
+        <w:tc>
+          <w:tcPr>
+            <w:tcW w:type="dxa" w:w="3031"/>
+            <w:tcBorders>
+              <w:top w:val="single" w:color="B7C4D6" w:sz="4"/>
+              <w:left w:val="single" w:color="B7C4D6" w:sz="4"/>
+              <w:bottom w:val="single" w:color="B7C4D6" w:sz="4"/>
+              <w:right w:val="single" w:color="B7C4D6" w:sz="4"/>
+            </w:tcBorders>
+            <w:tcMar>
+              <w:top w:type="dxa" w:w="60"/>
+              <w:left w:type="dxa" w:w="100"/>
+              <w:bottom w:type="dxa" w:w="60"/>
+              <w:right w:type="dxa" w:w="100"/>
+            </w:tcMar>
+          </w:tcPr>
+          <w:p>
+            <w:r>
+              <w:rPr>
+                <w:rFonts w:ascii="Calibri" w:cs="Calibri" w:eastAsia="Calibri" w:hAnsi="Calibri"/>
+                <w:b/>
+                <w:bCs/>
+                <w:sz w:val="20"/>
+                <w:szCs w:val="20"/>
+              </w:rPr>
+              <w:t xml:space="preserve">/admin/storage</w:t>
+            </w:r>
+          </w:p>
+        </w:tc>
+        <w:tc>
+          <w:tcPr>
+            <w:tcW w:type="dxa" w:w="7075"/>
+            <w:tcBorders>
+              <w:top w:val="single" w:color="B7C4D6" w:sz="4"/>
+              <w:left w:val="single" w:color="B7C4D6" w:sz="4"/>
+              <w:bottom w:val="single" w:color="B7C4D6" w:sz="4"/>
+              <w:right w:val="single" w:color="B7C4D6" w:sz="4"/>
+            </w:tcBorders>
+            <w:tcMar>
+              <w:top w:type="dxa" w:w="60"/>
+              <w:left w:type="dxa" w:w="100"/>
+              <w:bottom w:type="dxa" w:w="60"/>
+              <w:right w:type="dxa" w:w="100"/>
+            </w:tcMar>
+          </w:tcPr>
+          <w:p>
+            <w:r>
+              <w:rPr>
+                <w:rFonts w:ascii="Calibri" w:cs="Calibri" w:eastAsia="Calibri" w:hAnsi="Calibri"/>
+                <w:b w:val="false"/>
+                <w:bCs w:val="false"/>
+                <w:sz w:val="20"/>
+                <w:szCs w:val="20"/>
+              </w:rPr>
               <w:t xml:space="preserve">Storage WebDAV por grupo</w:t>
+            </w:r>
+          </w:p>
+        </w:tc>
+      </w:tr>
+      <w:tr>
+        <w:trPr>
+          <w:cantSplit/>
+          <w:tblHeader w:val="false"/>
+        </w:trPr>
+        <w:tc>
+          <w:tcPr>
+            <w:tcW w:type="dxa" w:w="3031"/>
+            <w:tcBorders>
+              <w:top w:val="single" w:color="B7C4D6" w:sz="4"/>
+              <w:left w:val="single" w:color="B7C4D6" w:sz="4"/>
+              <w:bottom w:val="single" w:color="B7C4D6" w:sz="4"/>
+              <w:right w:val="single" w:color="B7C4D6" w:sz="4"/>
+            </w:tcBorders>
+            <w:tcMar>
+              <w:top w:type="dxa" w:w="60"/>
+              <w:left w:type="dxa" w:w="100"/>
+              <w:bottom w:type="dxa" w:w="60"/>
+              <w:right w:type="dxa" w:w="100"/>
+            </w:tcMar>
+          </w:tcPr>
+          <w:p>
+            <w:r>
+              <w:rPr>
+                <w:rFonts w:ascii="Calibri" w:cs="Calibri" w:eastAsia="Calibri" w:hAnsi="Calibri"/>
+                <w:b/>
+                <w:bCs/>
+                <w:sz w:val="20"/>
+                <w:szCs w:val="20"/>
+              </w:rPr>
+              <w:t xml:space="preserve">/admin/conhecimento</w:t>
+            </w:r>
+          </w:p>
+        </w:tc>
+        <w:tc>
+          <w:tcPr>
+            <w:tcW w:type="dxa" w:w="7075"/>
+            <w:tcBorders>
+              <w:top w:val="single" w:color="B7C4D6" w:sz="4"/>
+              <w:left w:val="single" w:color="B7C4D6" w:sz="4"/>
+              <w:bottom w:val="single" w:color="B7C4D6" w:sz="4"/>
+              <w:right w:val="single" w:color="B7C4D6" w:sz="4"/>
+            </w:tcBorders>
+            <w:tcMar>
+              <w:top w:type="dxa" w:w="60"/>
+              <w:left w:type="dxa" w:w="100"/>
+              <w:bottom w:type="dxa" w:w="60"/>
+              <w:right w:type="dxa" w:w="100"/>
+            </w:tcMar>
+          </w:tcPr>
+          <w:p>
+            <w:r>
+              <w:rPr>
+                <w:rFonts w:ascii="Calibri" w:cs="Calibri" w:eastAsia="Calibri" w:hAnsi="Calibri"/>
+                <w:b w:val="false"/>
+                <w:bCs w:val="false"/>
+                <w:sz w:val="20"/>
+                <w:szCs w:val="20"/>
+              </w:rPr>
+              <w:t xml:space="preserve">Importar conhecimento em trechos para um grupo</w:t>
             </w:r>
           </w:p>
         </w:tc>
@@ -35399,7 +36794,7 @@
         <w:pStyle w:val="ListParagraph"/>
         <w:numPr>
           <w:ilvl w:val="0"/>
-          <w:numId w:val="14"/>
+          <w:numId w:val="16"/>
         </w:numPr>
         <w:spacing w:after="60"/>
       </w:pPr>
@@ -35417,7 +36812,7 @@
         <w:pStyle w:val="ListParagraph"/>
         <w:numPr>
           <w:ilvl w:val="0"/>
-          <w:numId w:val="14"/>
+          <w:numId w:val="16"/>
         </w:numPr>
         <w:spacing w:after="60"/>
       </w:pPr>
@@ -35435,7 +36830,7 @@
         <w:pStyle w:val="ListParagraph"/>
         <w:numPr>
           <w:ilvl w:val="0"/>
-          <w:numId w:val="14"/>
+          <w:numId w:val="16"/>
         </w:numPr>
         <w:spacing w:after="60"/>
       </w:pPr>
@@ -35453,7 +36848,7 @@
         <w:pStyle w:val="ListParagraph"/>
         <w:numPr>
           <w:ilvl w:val="0"/>
-          <w:numId w:val="14"/>
+          <w:numId w:val="16"/>
         </w:numPr>
         <w:spacing w:after="60"/>
       </w:pPr>
@@ -35471,7 +36866,7 @@
         <w:pStyle w:val="ListParagraph"/>
         <w:numPr>
           <w:ilvl w:val="0"/>
-          <w:numId w:val="14"/>
+          <w:numId w:val="16"/>
         </w:numPr>
         <w:spacing w:after="60"/>
       </w:pPr>
@@ -35790,6 +37185,18 @@
     </w:lvlOverride>
   </w:num>
   <w:num w:numId="14">
+    <w:abstractNumId w:val="3"/>
+    <w:lvlOverride w:ilvl="0">
+      <w:startOverride w:val="1"/>
+    </w:lvlOverride>
+  </w:num>
+  <w:num w:numId="15">
+    <w:abstractNumId w:val="3"/>
+    <w:lvlOverride w:ilvl="0">
+      <w:startOverride w:val="1"/>
+    </w:lvlOverride>
+  </w:num>
+  <w:num w:numId="16">
     <w:abstractNumId w:val="3"/>
     <w:lvlOverride w:ilvl="0">
       <w:startOverride w:val="1"/>

</xml_diff>

<commit_message>
feat(campos): renomear campo atualiza memos gravados, campo dono e queries; manual com dono no Catalogar e pergunta por membro
Co-Authored-By: Claude Opus 5.5 <noreply@anthropic.com>
</commit_message>
<xml_diff>
--- a/MyMemory_Manual_Operacional_v2.docx
+++ b/MyMemory_Manual_Operacional_v2.docx
@@ -2117,6 +2117,198 @@
                 <w:sz w:val="20"/>
                 <w:szCs w:val="20"/>
               </w:rPr>
+              <w:t xml:space="preserve">Campo dono aplicado também no Catalogar e na edição; pergunta que cita um membro ("agenda do Suporte") mostra os memos dele</w:t>
+            </w:r>
+          </w:p>
+        </w:tc>
+        <w:tc>
+          <w:tcPr>
+            <w:tcW w:type="dxa" w:w="7075"/>
+            <w:tcBorders>
+              <w:top w:val="single" w:color="B7C4D6" w:sz="4"/>
+              <w:left w:val="single" w:color="B7C4D6" w:sz="4"/>
+              <w:bottom w:val="single" w:color="B7C4D6" w:sz="4"/>
+              <w:right w:val="single" w:color="B7C4D6" w:sz="4"/>
+            </w:tcBorders>
+            <w:tcMar>
+              <w:top w:type="dxa" w:w="60"/>
+              <w:left w:type="dxa" w:w="100"/>
+              <w:bottom w:type="dxa" w:w="60"/>
+              <w:right w:type="dxa" w:w="100"/>
+            </w:tcMar>
+          </w:tcPr>
+          <w:p>
+            <w:r>
+              <w:rPr>
+                <w:rFonts w:ascii="Calibri" w:cs="Calibri" w:eastAsia="Calibri" w:hAnsi="Calibri"/>
+                <w:b w:val="false"/>
+                <w:bCs w:val="false"/>
+                <w:sz w:val="20"/>
+                <w:szCs w:val="20"/>
+              </w:rPr>
+              <w:t xml:space="preserve">Seção 17</w:t>
+            </w:r>
+          </w:p>
+        </w:tc>
+      </w:tr>
+      <w:tr>
+        <w:trPr>
+          <w:cantSplit/>
+          <w:tblHeader w:val="false"/>
+        </w:trPr>
+        <w:tc>
+          <w:tcPr>
+            <w:tcW w:type="dxa" w:w="3031"/>
+            <w:tcBorders>
+              <w:top w:val="single" w:color="B7C4D6" w:sz="4"/>
+              <w:left w:val="single" w:color="B7C4D6" w:sz="4"/>
+              <w:bottom w:val="single" w:color="B7C4D6" w:sz="4"/>
+              <w:right w:val="single" w:color="B7C4D6" w:sz="4"/>
+            </w:tcBorders>
+            <w:tcMar>
+              <w:top w:type="dxa" w:w="60"/>
+              <w:left w:type="dxa" w:w="100"/>
+              <w:bottom w:type="dxa" w:w="60"/>
+              <w:right w:type="dxa" w:w="100"/>
+            </w:tcMar>
+          </w:tcPr>
+          <w:p>
+            <w:r>
+              <w:rPr>
+                <w:rFonts w:ascii="Calibri" w:cs="Calibri" w:eastAsia="Calibri" w:hAnsi="Calibri"/>
+                <w:b/>
+                <w:bCs/>
+                <w:sz w:val="20"/>
+                <w:szCs w:val="20"/>
+              </w:rPr>
+              <w:t xml:space="preserve">Renomear um campo atualiza os memos já gravados e as queries da categoria</w:t>
+            </w:r>
+          </w:p>
+        </w:tc>
+        <w:tc>
+          <w:tcPr>
+            <w:tcW w:type="dxa" w:w="7075"/>
+            <w:tcBorders>
+              <w:top w:val="single" w:color="B7C4D6" w:sz="4"/>
+              <w:left w:val="single" w:color="B7C4D6" w:sz="4"/>
+              <w:bottom w:val="single" w:color="B7C4D6" w:sz="4"/>
+              <w:right w:val="single" w:color="B7C4D6" w:sz="4"/>
+            </w:tcBorders>
+            <w:tcMar>
+              <w:top w:type="dxa" w:w="60"/>
+              <w:left w:type="dxa" w:w="100"/>
+              <w:bottom w:type="dxa" w:w="60"/>
+              <w:right w:type="dxa" w:w="100"/>
+            </w:tcMar>
+          </w:tcPr>
+          <w:p>
+            <w:r>
+              <w:rPr>
+                <w:rFonts w:ascii="Calibri" w:cs="Calibri" w:eastAsia="Calibri" w:hAnsi="Calibri"/>
+                <w:b w:val="false"/>
+                <w:bCs w:val="false"/>
+                <w:sz w:val="20"/>
+                <w:szCs w:val="20"/>
+              </w:rPr>
+              <w:t xml:space="preserve">Seção 17</w:t>
+            </w:r>
+          </w:p>
+        </w:tc>
+      </w:tr>
+      <w:tr>
+        <w:trPr>
+          <w:cantSplit/>
+          <w:tblHeader w:val="false"/>
+        </w:trPr>
+        <w:tc>
+          <w:tcPr>
+            <w:tcW w:type="dxa" w:w="3031"/>
+            <w:tcBorders>
+              <w:top w:val="single" w:color="B7C4D6" w:sz="4"/>
+              <w:left w:val="single" w:color="B7C4D6" w:sz="4"/>
+              <w:bottom w:val="single" w:color="B7C4D6" w:sz="4"/>
+              <w:right w:val="single" w:color="B7C4D6" w:sz="4"/>
+            </w:tcBorders>
+            <w:tcMar>
+              <w:top w:type="dxa" w:w="60"/>
+              <w:left w:type="dxa" w:w="100"/>
+              <w:bottom w:type="dxa" w:w="60"/>
+              <w:right w:type="dxa" w:w="100"/>
+            </w:tcMar>
+          </w:tcPr>
+          <w:p>
+            <w:r>
+              <w:rPr>
+                <w:rFonts w:ascii="Calibri" w:cs="Calibri" w:eastAsia="Calibri" w:hAnsi="Calibri"/>
+                <w:b/>
+                <w:bCs/>
+                <w:sz w:val="20"/>
+                <w:szCs w:val="20"/>
+              </w:rPr>
+              <w:t xml:space="preserve">Extração mais fiel: endereços e nomes copiados como no texto, tempo sempre com unidade, "eu/me" = autor do memo</w:t>
+            </w:r>
+          </w:p>
+        </w:tc>
+        <w:tc>
+          <w:tcPr>
+            <w:tcW w:type="dxa" w:w="7075"/>
+            <w:tcBorders>
+              <w:top w:val="single" w:color="B7C4D6" w:sz="4"/>
+              <w:left w:val="single" w:color="B7C4D6" w:sz="4"/>
+              <w:bottom w:val="single" w:color="B7C4D6" w:sz="4"/>
+              <w:right w:val="single" w:color="B7C4D6" w:sz="4"/>
+            </w:tcBorders>
+            <w:tcMar>
+              <w:top w:type="dxa" w:w="60"/>
+              <w:left w:type="dxa" w:w="100"/>
+              <w:bottom w:type="dxa" w:w="60"/>
+              <w:right w:type="dxa" w:w="100"/>
+            </w:tcMar>
+          </w:tcPr>
+          <w:p>
+            <w:r>
+              <w:rPr>
+                <w:rFonts w:ascii="Calibri" w:cs="Calibri" w:eastAsia="Calibri" w:hAnsi="Calibri"/>
+                <w:b w:val="false"/>
+                <w:bCs w:val="false"/>
+                <w:sz w:val="20"/>
+                <w:szCs w:val="20"/>
+              </w:rPr>
+              <w:t xml:space="preserve">Seção 17</w:t>
+            </w:r>
+          </w:p>
+        </w:tc>
+      </w:tr>
+      <w:tr>
+        <w:trPr>
+          <w:cantSplit/>
+          <w:tblHeader w:val="false"/>
+        </w:trPr>
+        <w:tc>
+          <w:tcPr>
+            <w:tcW w:type="dxa" w:w="3031"/>
+            <w:tcBorders>
+              <w:top w:val="single" w:color="B7C4D6" w:sz="4"/>
+              <w:left w:val="single" w:color="B7C4D6" w:sz="4"/>
+              <w:bottom w:val="single" w:color="B7C4D6" w:sz="4"/>
+              <w:right w:val="single" w:color="B7C4D6" w:sz="4"/>
+            </w:tcBorders>
+            <w:tcMar>
+              <w:top w:type="dxa" w:w="60"/>
+              <w:left w:type="dxa" w:w="100"/>
+              <w:bottom w:type="dxa" w:w="60"/>
+              <w:right w:type="dxa" w:w="100"/>
+            </w:tcMar>
+          </w:tcPr>
+          <w:p>
+            <w:r>
+              <w:rPr>
+                <w:rFonts w:ascii="Calibri" w:cs="Calibri" w:eastAsia="Calibri" w:hAnsi="Calibri"/>
+                <w:b/>
+                <w:bCs/>
+                <w:sz w:val="20"/>
+                <w:szCs w:val="20"/>
+              </w:rPr>
               <w:t xml:space="preserve">Autenticação por chave de API para integrações externas (ex.: Softing-erp) com contexto da tela</w:t>
             </w:r>
           </w:p>
@@ -23179,6 +23371,121 @@
     </w:p>
     <w:p>
       <w:pPr>
+        <w:pStyle w:val="ListParagraph"/>
+        <w:numPr>
+          <w:ilvl w:val="0"/>
+          <w:numId w:val="2"/>
+        </w:numPr>
+        <w:spacing w:after="60"/>
+      </w:pPr>
+      <w:r>
+        <w:rPr>
+          <w:rFonts w:ascii="Calibri" w:cs="Calibri" w:eastAsia="Calibri" w:hAnsi="Calibri"/>
+          <w:sz w:val="21"/>
+          <w:szCs w:val="21"/>
+        </w:rPr>
+        <w:t xml:space="preserve">A IA copia nomes, endereços e números como estão no texto (não "corrige" uma rua por outra), grava tempos sempre com unidade ("2 horas") e não mistura duração do evento com antecedência do aviso.</w:t>
+      </w:r>
+    </w:p>
+    <w:p>
+      <w:pPr>
+        <w:pStyle w:val="ListParagraph"/>
+        <w:numPr>
+          <w:ilvl w:val="0"/>
+          <w:numId w:val="2"/>
+        </w:numPr>
+        <w:spacing w:after="60"/>
+      </w:pPr>
+      <w:r>
+        <w:rPr>
+          <w:rFonts w:ascii="Calibri" w:cs="Calibri" w:eastAsia="Calibri" w:hAnsi="Calibri"/>
+          <w:sz w:val="21"/>
+          <w:szCs w:val="21"/>
+        </w:rPr>
+        <w:t xml:space="preserve">"Eu", "me", "meu" no texto referem-se ao autor do memo (quem está catalogando): campos de pessoa que se refiram a ele recebem o nome ou e-mail do autor.</w:t>
+      </w:r>
+    </w:p>
+    <w:p>
+      <w:pPr>
+        <w:pStyle w:val="ListParagraph"/>
+        <w:numPr>
+          <w:ilvl w:val="0"/>
+          <w:numId w:val="2"/>
+        </w:numPr>
+        <w:spacing w:after="60"/>
+      </w:pPr>
+      <w:r>
+        <w:rPr>
+          <w:rFonts w:ascii="Calibri" w:cs="Calibri" w:eastAsia="Calibri" w:hAnsi="Calibri"/>
+          <w:sz w:val="21"/>
+          <w:szCs w:val="21"/>
+        </w:rPr>
+        <w:t xml:space="preserve">Quando dois campos podem ser confundidos, diga na descrição de cada um quem é quem. Exemplo na Agenda — Dono Agenda: "Pessoa dona da agenda, que vai cumprir o compromisso. Em 'agendar para X' ou 'agenda do X', X é o dono. Em primeira pessoa ou sem indicação, use o autor do memo." Com quem: "Outras pessoas ou empresas que participam do compromisso, a contraparte do dono (ex.: 'reunião com Maria', 'reunião com a Petrobras'). Nunca a pessoa depois de 'agendar para'."</w:t>
+      </w:r>
+    </w:p>
+    <w:p>
+      <w:pPr>
+        <w:pStyle w:val="Heading2"/>
+        <w:keepNext/>
+      </w:pPr>
+      <w:r>
+        <w:rPr>
+          <w:rFonts w:ascii="Calibri" w:cs="Calibri" w:eastAsia="Calibri" w:hAnsi="Calibri"/>
+        </w:rPr>
+        <w:t xml:space="preserve">Renomear um campo</w:t>
+      </w:r>
+    </w:p>
+    <w:p>
+      <w:pPr>
+        <w:spacing w:after="120"/>
+      </w:pPr>
+      <w:r>
+        <w:rPr>
+          <w:rFonts w:ascii="Calibri" w:cs="Calibri" w:eastAsia="Calibri" w:hAnsi="Calibri"/>
+          <w:sz w:val="21"/>
+          <w:szCs w:val="21"/>
+        </w:rPr>
+        <w:t xml:space="preserve">Ao trocar o nome de um campo (✎), o sistema leva o novo nome a tudo o que já existe na categoria: os memos já gravados, o campo dono da categoria, os parâmetros das queries e o nome entre aspas simples (ex.: 'Proprietario') no SQL das queries de memos escritas à mão. Ao final, uma mensagem informa quantos memos e queries foram atualizados.</w:t>
+      </w:r>
+    </w:p>
+    <w:p>
+      <w:pPr>
+        <w:pStyle w:val="ListParagraph"/>
+        <w:numPr>
+          <w:ilvl w:val="0"/>
+          <w:numId w:val="2"/>
+        </w:numPr>
+        <w:spacing w:after="60"/>
+      </w:pPr>
+      <w:r>
+        <w:rPr>
+          <w:rFonts w:ascii="Calibri" w:cs="Calibri" w:eastAsia="Calibri" w:hAnsi="Calibri"/>
+          <w:sz w:val="21"/>
+          <w:szCs w:val="21"/>
+        </w:rPr>
+        <w:t xml:space="preserve">Prefira nomes que não se confundam com outras categorias (ex.: "Dono Agenda" em vez de "Proprietario", que também aparece em imóveis e veículos).</w:t>
+      </w:r>
+    </w:p>
+    <w:p>
+      <w:pPr>
+        <w:pStyle w:val="ListParagraph"/>
+        <w:numPr>
+          <w:ilvl w:val="0"/>
+          <w:numId w:val="2"/>
+        </w:numPr>
+        <w:spacing w:after="60"/>
+      </w:pPr>
+      <w:r>
+        <w:rPr>
+          <w:rFonts w:ascii="Calibri" w:cs="Calibri" w:eastAsia="Calibri" w:hAnsi="Calibri"/>
+          <w:sz w:val="21"/>
+          <w:szCs w:val="21"/>
+        </w:rPr>
+        <w:t xml:space="preserve">Queries de ERP (SQL Server) não são alteradas: os nomes ali são colunas do banco do ERP.</w:t>
+      </w:r>
+    </w:p>
+    <w:p>
+      <w:pPr>
         <w:pStyle w:val="Heading2"/>
         <w:keepNext/>
       </w:pPr>
@@ -23846,7 +24153,7 @@
           <w:sz w:val="21"/>
           <w:szCs w:val="21"/>
         </w:rPr>
-        <w:t xml:space="preserve">Marcada a opção, escolha o "Campo dono do memo": o campo com o e-mail ou o nome da pessoa (crie um campo "Dono" ou "Proprietario" se não existir).</w:t>
+        <w:t xml:space="preserve">Marcada a opção, escolha o "Campo dono do memo": o campo com o e-mail ou o nome da pessoa (crie um campo como "Dono Agenda" se não existir).</w:t>
       </w:r>
     </w:p>
     <w:p>
@@ -23865,6 +24172,459 @@
           <w:szCs w:val="21"/>
         </w:rPr>
         <w:t xml:space="preserve">Na importação em lote, manual ou automática, o memo passa a ser do membro do grupo indicado nesse campo. Não identificado, vai para "Memos sem dono identificado" na Importação em Lote.</w:t>
+      </w:r>
+    </w:p>
+    <w:p>
+      <w:pPr>
+        <w:pStyle w:val="ListParagraph"/>
+        <w:numPr>
+          <w:ilvl w:val="0"/>
+          <w:numId w:val="2"/>
+        </w:numPr>
+        <w:spacing w:after="60"/>
+      </w:pPr>
+      <w:r>
+        <w:rPr>
+          <w:rFonts w:ascii="Calibri" w:cs="Calibri" w:eastAsia="Calibri" w:hAnsi="Calibri"/>
+          <w:sz w:val="21"/>
+          <w:szCs w:val="21"/>
+        </w:rPr>
+        <w:t xml:space="preserve">No Catalogar e ao editar um memo, vale a mesma regra: se o campo dono indicar outro membro do grupo, o memo passa a ser dele ao salvar. Vazio, o próprio autor ou nome não reconhecido: o memo continua de quem salvou (sem ir para a lista de pendentes).</w:t>
+      </w:r>
+    </w:p>
+    <w:p>
+      <w:pPr>
+        <w:pStyle w:val="ListParagraph"/>
+        <w:numPr>
+          <w:ilvl w:val="0"/>
+          <w:numId w:val="2"/>
+        </w:numPr>
+        <w:spacing w:after="60"/>
+      </w:pPr>
+      <w:r>
+        <w:rPr>
+          <w:rFonts w:ascii="Calibri" w:cs="Calibri" w:eastAsia="Calibri" w:hAnsi="Calibri"/>
+          <w:sz w:val="21"/>
+          <w:szCs w:val="21"/>
+        </w:rPr>
+        <w:t xml:space="preserve">Só o dono edita o memo: depois de passar para outro membro, quem catalogou não consegue mais editá-lo.</w:t>
+      </w:r>
+    </w:p>
+    <w:p>
+      <w:pPr>
+        <w:pStyle w:val="ListParagraph"/>
+        <w:numPr>
+          <w:ilvl w:val="0"/>
+          <w:numId w:val="2"/>
+        </w:numPr>
+        <w:spacing w:after="60"/>
+      </w:pPr>
+      <w:r>
+        <w:rPr>
+          <w:rFonts w:ascii="Calibri" w:cs="Calibri" w:eastAsia="Calibri" w:hAnsi="Calibri"/>
+          <w:sz w:val="21"/>
+          <w:szCs w:val="21"/>
+        </w:rPr>
+        <w:t xml:space="preserve">O membro é reconhecido pelo e-mail, pelo nome completo ou pelo primeiro nome (quando único no grupo), sem diferenciar acento e maiúsculas.</w:t>
+      </w:r>
+    </w:p>
+    <w:p>
+      <w:pPr>
+        <w:pStyle w:val="Heading3"/>
+        <w:keepNext/>
+      </w:pPr>
+      <w:r>
+        <w:rPr>
+          <w:rFonts w:ascii="Calibri" w:cs="Calibri" w:eastAsia="Calibri" w:hAnsi="Calibri"/>
+        </w:rPr>
+        <w:t xml:space="preserve">De quem são os memos na pergunta</w:t>
+      </w:r>
+    </w:p>
+    <w:tbl>
+      <w:tblPr>
+        <w:tblW w:type="dxa" w:w="10106"/>
+        <w:tblBorders>
+          <w:top w:val="single" w:color="auto" w:sz="4"/>
+          <w:left w:val="single" w:color="auto" w:sz="4"/>
+          <w:bottom w:val="single" w:color="auto" w:sz="4"/>
+          <w:right w:val="single" w:color="auto" w:sz="4"/>
+          <w:insideH w:val="single" w:color="auto" w:sz="4"/>
+          <w:insideV w:val="single" w:color="auto" w:sz="4"/>
+        </w:tblBorders>
+      </w:tblPr>
+      <w:tblGrid>
+        <w:gridCol w:w="3031"/>
+        <w:gridCol w:w="7075"/>
+      </w:tblGrid>
+      <w:tr>
+        <w:trPr>
+          <w:cantSplit/>
+          <w:tblHeader/>
+        </w:trPr>
+        <w:tc>
+          <w:tcPr>
+            <w:tcW w:type="dxa" w:w="3031"/>
+            <w:tcBorders>
+              <w:top w:val="single" w:color="B7C4D6" w:sz="4"/>
+              <w:left w:val="single" w:color="B7C4D6" w:sz="4"/>
+              <w:bottom w:val="single" w:color="B7C4D6" w:sz="4"/>
+              <w:right w:val="single" w:color="B7C4D6" w:sz="4"/>
+            </w:tcBorders>
+            <w:shd w:fill="D0E4FF" w:color="auto" w:val="clear"/>
+            <w:tcMar>
+              <w:top w:type="dxa" w:w="60"/>
+              <w:left w:type="dxa" w:w="100"/>
+              <w:bottom w:type="dxa" w:w="60"/>
+              <w:right w:type="dxa" w:w="100"/>
+            </w:tcMar>
+          </w:tcPr>
+          <w:p>
+            <w:r>
+              <w:rPr>
+                <w:rFonts w:ascii="Calibri" w:cs="Calibri" w:eastAsia="Calibri" w:hAnsi="Calibri"/>
+                <w:b/>
+                <w:bCs/>
+                <w:color w:val="1E3A5F"/>
+                <w:sz w:val="20"/>
+                <w:szCs w:val="20"/>
+              </w:rPr>
+              <w:t xml:space="preserve">Pergunta</w:t>
+            </w:r>
+          </w:p>
+        </w:tc>
+        <w:tc>
+          <w:tcPr>
+            <w:tcW w:type="dxa" w:w="7075"/>
+            <w:tcBorders>
+              <w:top w:val="single" w:color="B7C4D6" w:sz="4"/>
+              <w:left w:val="single" w:color="B7C4D6" w:sz="4"/>
+              <w:bottom w:val="single" w:color="B7C4D6" w:sz="4"/>
+              <w:right w:val="single" w:color="B7C4D6" w:sz="4"/>
+            </w:tcBorders>
+            <w:shd w:fill="D0E4FF" w:color="auto" w:val="clear"/>
+            <w:tcMar>
+              <w:top w:type="dxa" w:w="60"/>
+              <w:left w:type="dxa" w:w="100"/>
+              <w:bottom w:type="dxa" w:w="60"/>
+              <w:right w:type="dxa" w:w="100"/>
+            </w:tcMar>
+          </w:tcPr>
+          <w:p>
+            <w:r>
+              <w:rPr>
+                <w:rFonts w:ascii="Calibri" w:cs="Calibri" w:eastAsia="Calibri" w:hAnsi="Calibri"/>
+                <w:b/>
+                <w:bCs/>
+                <w:color w:val="1E3A5F"/>
+                <w:sz w:val="20"/>
+                <w:szCs w:val="20"/>
+              </w:rPr>
+              <w:t xml:space="preserve">Memos considerados nas categorias Pessoal</w:t>
+            </w:r>
+          </w:p>
+        </w:tc>
+      </w:tr>
+      <w:tr>
+        <w:trPr>
+          <w:cantSplit/>
+          <w:tblHeader w:val="false"/>
+        </w:trPr>
+        <w:tc>
+          <w:tcPr>
+            <w:tcW w:type="dxa" w:w="3031"/>
+            <w:tcBorders>
+              <w:top w:val="single" w:color="B7C4D6" w:sz="4"/>
+              <w:left w:val="single" w:color="B7C4D6" w:sz="4"/>
+              <w:bottom w:val="single" w:color="B7C4D6" w:sz="4"/>
+              <w:right w:val="single" w:color="B7C4D6" w:sz="4"/>
+            </w:tcBorders>
+            <w:tcMar>
+              <w:top w:type="dxa" w:w="60"/>
+              <w:left w:type="dxa" w:w="100"/>
+              <w:bottom w:type="dxa" w:w="60"/>
+              <w:right w:type="dxa" w:w="100"/>
+            </w:tcMar>
+          </w:tcPr>
+          <w:p>
+            <w:r>
+              <w:rPr>
+                <w:rFonts w:ascii="Calibri" w:cs="Calibri" w:eastAsia="Calibri" w:hAnsi="Calibri"/>
+                <w:b/>
+                <w:bCs/>
+                <w:sz w:val="20"/>
+                <w:szCs w:val="20"/>
+              </w:rPr>
+              <w:t xml:space="preserve">Sem citar ninguém ("qual minha agenda amanhã")</w:t>
+            </w:r>
+          </w:p>
+        </w:tc>
+        <w:tc>
+          <w:tcPr>
+            <w:tcW w:type="dxa" w:w="7075"/>
+            <w:tcBorders>
+              <w:top w:val="single" w:color="B7C4D6" w:sz="4"/>
+              <w:left w:val="single" w:color="B7C4D6" w:sz="4"/>
+              <w:bottom w:val="single" w:color="B7C4D6" w:sz="4"/>
+              <w:right w:val="single" w:color="B7C4D6" w:sz="4"/>
+            </w:tcBorders>
+            <w:tcMar>
+              <w:top w:type="dxa" w:w="60"/>
+              <w:left w:type="dxa" w:w="100"/>
+              <w:bottom w:type="dxa" w:w="60"/>
+              <w:right w:type="dxa" w:w="100"/>
+            </w:tcMar>
+          </w:tcPr>
+          <w:p>
+            <w:r>
+              <w:rPr>
+                <w:rFonts w:ascii="Calibri" w:cs="Calibri" w:eastAsia="Calibri" w:hAnsi="Calibri"/>
+                <w:b w:val="false"/>
+                <w:bCs w:val="false"/>
+                <w:sz w:val="20"/>
+                <w:szCs w:val="20"/>
+              </w:rPr>
+              <w:t xml:space="preserve">Os de quem pergunta.</w:t>
+            </w:r>
+          </w:p>
+        </w:tc>
+      </w:tr>
+      <w:tr>
+        <w:trPr>
+          <w:cantSplit/>
+          <w:tblHeader w:val="false"/>
+        </w:trPr>
+        <w:tc>
+          <w:tcPr>
+            <w:tcW w:type="dxa" w:w="3031"/>
+            <w:tcBorders>
+              <w:top w:val="single" w:color="B7C4D6" w:sz="4"/>
+              <w:left w:val="single" w:color="B7C4D6" w:sz="4"/>
+              <w:bottom w:val="single" w:color="B7C4D6" w:sz="4"/>
+              <w:right w:val="single" w:color="B7C4D6" w:sz="4"/>
+            </w:tcBorders>
+            <w:tcMar>
+              <w:top w:type="dxa" w:w="60"/>
+              <w:left w:type="dxa" w:w="100"/>
+              <w:bottom w:type="dxa" w:w="60"/>
+              <w:right w:type="dxa" w:w="100"/>
+            </w:tcMar>
+          </w:tcPr>
+          <w:p>
+            <w:r>
+              <w:rPr>
+                <w:rFonts w:ascii="Calibri" w:cs="Calibri" w:eastAsia="Calibri" w:hAnsi="Calibri"/>
+                <w:b/>
+                <w:bCs/>
+                <w:sz w:val="20"/>
+                <w:szCs w:val="20"/>
+              </w:rPr>
+              <w:t xml:space="preserve">Citando um membro ("qual a agenda do Suporte amanhã")</w:t>
+            </w:r>
+          </w:p>
+        </w:tc>
+        <w:tc>
+          <w:tcPr>
+            <w:tcW w:type="dxa" w:w="7075"/>
+            <w:tcBorders>
+              <w:top w:val="single" w:color="B7C4D6" w:sz="4"/>
+              <w:left w:val="single" w:color="B7C4D6" w:sz="4"/>
+              <w:bottom w:val="single" w:color="B7C4D6" w:sz="4"/>
+              <w:right w:val="single" w:color="B7C4D6" w:sz="4"/>
+            </w:tcBorders>
+            <w:tcMar>
+              <w:top w:type="dxa" w:w="60"/>
+              <w:left w:type="dxa" w:w="100"/>
+              <w:bottom w:type="dxa" w:w="60"/>
+              <w:right w:type="dxa" w:w="100"/>
+            </w:tcMar>
+          </w:tcPr>
+          <w:p>
+            <w:r>
+              <w:rPr>
+                <w:rFonts w:ascii="Calibri" w:cs="Calibri" w:eastAsia="Calibri" w:hAnsi="Calibri"/>
+                <w:b w:val="false"/>
+                <w:bCs w:val="false"/>
+                <w:sz w:val="20"/>
+                <w:szCs w:val="20"/>
+              </w:rPr>
+              <w:t xml:space="preserve">Os desse membro.</w:t>
+            </w:r>
+          </w:p>
+        </w:tc>
+      </w:tr>
+      <w:tr>
+        <w:trPr>
+          <w:cantSplit/>
+          <w:tblHeader w:val="false"/>
+        </w:trPr>
+        <w:tc>
+          <w:tcPr>
+            <w:tcW w:type="dxa" w:w="3031"/>
+            <w:tcBorders>
+              <w:top w:val="single" w:color="B7C4D6" w:sz="4"/>
+              <w:left w:val="single" w:color="B7C4D6" w:sz="4"/>
+              <w:bottom w:val="single" w:color="B7C4D6" w:sz="4"/>
+              <w:right w:val="single" w:color="B7C4D6" w:sz="4"/>
+            </w:tcBorders>
+            <w:tcMar>
+              <w:top w:type="dxa" w:w="60"/>
+              <w:left w:type="dxa" w:w="100"/>
+              <w:bottom w:type="dxa" w:w="60"/>
+              <w:right w:type="dxa" w:w="100"/>
+            </w:tcMar>
+          </w:tcPr>
+          <w:p>
+            <w:r>
+              <w:rPr>
+                <w:rFonts w:ascii="Calibri" w:cs="Calibri" w:eastAsia="Calibri" w:hAnsi="Calibri"/>
+                <w:b/>
+                <w:bCs/>
+                <w:sz w:val="20"/>
+                <w:szCs w:val="20"/>
+              </w:rPr>
+              <w:t xml:space="preserve">Citando mais de um membro, ou nome que serve a vários</w:t>
+            </w:r>
+          </w:p>
+        </w:tc>
+        <w:tc>
+          <w:tcPr>
+            <w:tcW w:type="dxa" w:w="7075"/>
+            <w:tcBorders>
+              <w:top w:val="single" w:color="B7C4D6" w:sz="4"/>
+              <w:left w:val="single" w:color="B7C4D6" w:sz="4"/>
+              <w:bottom w:val="single" w:color="B7C4D6" w:sz="4"/>
+              <w:right w:val="single" w:color="B7C4D6" w:sz="4"/>
+            </w:tcBorders>
+            <w:tcMar>
+              <w:top w:type="dxa" w:w="60"/>
+              <w:left w:type="dxa" w:w="100"/>
+              <w:bottom w:type="dxa" w:w="60"/>
+              <w:right w:type="dxa" w:w="100"/>
+            </w:tcMar>
+          </w:tcPr>
+          <w:p>
+            <w:r>
+              <w:rPr>
+                <w:rFonts w:ascii="Calibri" w:cs="Calibri" w:eastAsia="Calibri" w:hAnsi="Calibri"/>
+                <w:b w:val="false"/>
+                <w:bCs w:val="false"/>
+                <w:sz w:val="20"/>
+                <w:szCs w:val="20"/>
+              </w:rPr>
+              <w:t xml:space="preserve">Os de todos, com aviso na resposta.</w:t>
+            </w:r>
+          </w:p>
+        </w:tc>
+      </w:tr>
+      <w:tr>
+        <w:trPr>
+          <w:cantSplit/>
+          <w:tblHeader w:val="false"/>
+        </w:trPr>
+        <w:tc>
+          <w:tcPr>
+            <w:tcW w:type="dxa" w:w="3031"/>
+            <w:tcBorders>
+              <w:top w:val="single" w:color="B7C4D6" w:sz="4"/>
+              <w:left w:val="single" w:color="B7C4D6" w:sz="4"/>
+              <w:bottom w:val="single" w:color="B7C4D6" w:sz="4"/>
+              <w:right w:val="single" w:color="B7C4D6" w:sz="4"/>
+            </w:tcBorders>
+            <w:tcMar>
+              <w:top w:type="dxa" w:w="60"/>
+              <w:left w:type="dxa" w:w="100"/>
+              <w:bottom w:type="dxa" w:w="60"/>
+              <w:right w:type="dxa" w:w="100"/>
+            </w:tcMar>
+          </w:tcPr>
+          <w:p>
+            <w:r>
+              <w:rPr>
+                <w:rFonts w:ascii="Calibri" w:cs="Calibri" w:eastAsia="Calibri" w:hAnsi="Calibri"/>
+                <w:b/>
+                <w:bCs/>
+                <w:sz w:val="20"/>
+                <w:szCs w:val="20"/>
+              </w:rPr>
+              <w:t xml:space="preserve">"de todos", "do grupo", "da equipe"</w:t>
+            </w:r>
+          </w:p>
+        </w:tc>
+        <w:tc>
+          <w:tcPr>
+            <w:tcW w:type="dxa" w:w="7075"/>
+            <w:tcBorders>
+              <w:top w:val="single" w:color="B7C4D6" w:sz="4"/>
+              <w:left w:val="single" w:color="B7C4D6" w:sz="4"/>
+              <w:bottom w:val="single" w:color="B7C4D6" w:sz="4"/>
+              <w:right w:val="single" w:color="B7C4D6" w:sz="4"/>
+            </w:tcBorders>
+            <w:tcMar>
+              <w:top w:type="dxa" w:w="60"/>
+              <w:left w:type="dxa" w:w="100"/>
+              <w:bottom w:type="dxa" w:w="60"/>
+              <w:right w:type="dxa" w:w="100"/>
+            </w:tcMar>
+          </w:tcPr>
+          <w:p>
+            <w:r>
+              <w:rPr>
+                <w:rFonts w:ascii="Calibri" w:cs="Calibri" w:eastAsia="Calibri" w:hAnsi="Calibri"/>
+                <w:b w:val="false"/>
+                <w:bCs w:val="false"/>
+                <w:sz w:val="20"/>
+                <w:szCs w:val="20"/>
+              </w:rPr>
+              <w:t xml:space="preserve">Os de todos.</w:t>
+            </w:r>
+          </w:p>
+        </w:tc>
+      </w:tr>
+    </w:tbl>
+    <w:p>
+      <w:pPr>
+        <w:spacing w:after="60"/>
+      </w:pPr>
+    </w:p>
+    <w:p>
+      <w:pPr>
+        <w:spacing w:after="120"/>
+      </w:pPr>
+      <w:r>
+        <w:rPr>
+          <w:rFonts w:ascii="Calibri" w:cs="Calibri" w:eastAsia="Calibri" w:hAnsi="Calibri"/>
+          <w:sz w:val="21"/>
+          <w:szCs w:val="21"/>
+        </w:rPr>
+        <w:t xml:space="preserve">A resposta informa o escopo aplicado (ex.: Mostrando só os memos de Suporte em "Agenda").</w:t>
+      </w:r>
+    </w:p>
+    <w:p>
+      <w:pPr>
+        <w:pBdr>
+          <w:left w:val="single" w:color="7B3F00" w:sz="12" w:space="8"/>
+        </w:pBdr>
+        <w:spacing w:before="80" w:after="80"/>
+        <w:ind w:left="360"/>
+      </w:pPr>
+      <w:r>
+        <w:rPr>
+          <w:rFonts w:ascii="Calibri" w:cs="Calibri" w:eastAsia="Calibri" w:hAnsi="Calibri"/>
+          <w:b/>
+          <w:bCs/>
+          <w:color w:val="7B3F00"/>
+          <w:sz w:val="21"/>
+          <w:szCs w:val="21"/>
+        </w:rPr>
+        <w:t xml:space="preserve">NOTA: </w:t>
+      </w:r>
+      <w:r>
+        <w:rPr>
+          <w:rFonts w:ascii="Calibri" w:cs="Calibri" w:eastAsia="Calibri" w:hAnsi="Calibri"/>
+          <w:sz w:val="21"/>
+          <w:szCs w:val="21"/>
+        </w:rPr>
+        <w:t xml:space="preserve">Membro com nome de palavra comum (ex.: "Suporte") é reconhecido mesmo quando a palavra aparece em outro sentido ("agenda de suporte técnico").</w:t>
       </w:r>
     </w:p>
     <w:p>

</xml_diff>

<commit_message>
feat(perguntas): texto de memos comparado por palavras, expressão inteira num só campo, busca nos de todos quando os seus não trazem nada e confiança baixa em resposta vazia
Co-Authored-By: Claude Opus 5.5 <noreply@anthropic.com>
</commit_message>
<xml_diff>
--- a/MyMemory_Manual_Operacional_v2.docx
+++ b/MyMemory_Manual_Operacional_v2.docx
@@ -2309,6 +2309,134 @@
                 <w:sz w:val="20"/>
                 <w:szCs w:val="20"/>
               </w:rPr>
+              <w:t xml:space="preserve">Perguntas comparam texto dos memos por palavras ("sr. Wilson" acha "Sr. Wilson da FAPESP")</w:t>
+            </w:r>
+          </w:p>
+        </w:tc>
+        <w:tc>
+          <w:tcPr>
+            <w:tcW w:type="dxa" w:w="7075"/>
+            <w:tcBorders>
+              <w:top w:val="single" w:color="B7C4D6" w:sz="4"/>
+              <w:left w:val="single" w:color="B7C4D6" w:sz="4"/>
+              <w:bottom w:val="single" w:color="B7C4D6" w:sz="4"/>
+              <w:right w:val="single" w:color="B7C4D6" w:sz="4"/>
+            </w:tcBorders>
+            <w:tcMar>
+              <w:top w:type="dxa" w:w="60"/>
+              <w:left w:type="dxa" w:w="100"/>
+              <w:bottom w:type="dxa" w:w="60"/>
+              <w:right w:type="dxa" w:w="100"/>
+            </w:tcMar>
+          </w:tcPr>
+          <w:p>
+            <w:r>
+              <w:rPr>
+                <w:rFonts w:ascii="Calibri" w:cs="Calibri" w:eastAsia="Calibri" w:hAnsi="Calibri"/>
+                <w:b w:val="false"/>
+                <w:bCs w:val="false"/>
+                <w:sz w:val="20"/>
+                <w:szCs w:val="20"/>
+              </w:rPr>
+              <w:t xml:space="preserve">Seção 17</w:t>
+            </w:r>
+          </w:p>
+        </w:tc>
+      </w:tr>
+      <w:tr>
+        <w:trPr>
+          <w:cantSplit/>
+          <w:tblHeader w:val="false"/>
+        </w:trPr>
+        <w:tc>
+          <w:tcPr>
+            <w:tcW w:type="dxa" w:w="3031"/>
+            <w:tcBorders>
+              <w:top w:val="single" w:color="B7C4D6" w:sz="4"/>
+              <w:left w:val="single" w:color="B7C4D6" w:sz="4"/>
+              <w:bottom w:val="single" w:color="B7C4D6" w:sz="4"/>
+              <w:right w:val="single" w:color="B7C4D6" w:sz="4"/>
+            </w:tcBorders>
+            <w:tcMar>
+              <w:top w:type="dxa" w:w="60"/>
+              <w:left w:type="dxa" w:w="100"/>
+              <w:bottom w:type="dxa" w:w="60"/>
+              <w:right w:type="dxa" w:w="100"/>
+            </w:tcMar>
+          </w:tcPr>
+          <w:p>
+            <w:r>
+              <w:rPr>
+                <w:rFonts w:ascii="Calibri" w:cs="Calibri" w:eastAsia="Calibri" w:hAnsi="Calibri"/>
+                <w:b/>
+                <w:bCs/>
+                <w:sz w:val="20"/>
+                <w:szCs w:val="20"/>
+              </w:rPr>
+              <w:t xml:space="preserve">Sem resultado nos seus memos Pessoal, a pergunta busca nos de todos (com aviso); resposta vazia com confiança baixa</w:t>
+            </w:r>
+          </w:p>
+        </w:tc>
+        <w:tc>
+          <w:tcPr>
+            <w:tcW w:type="dxa" w:w="7075"/>
+            <w:tcBorders>
+              <w:top w:val="single" w:color="B7C4D6" w:sz="4"/>
+              <w:left w:val="single" w:color="B7C4D6" w:sz="4"/>
+              <w:bottom w:val="single" w:color="B7C4D6" w:sz="4"/>
+              <w:right w:val="single" w:color="B7C4D6" w:sz="4"/>
+            </w:tcBorders>
+            <w:tcMar>
+              <w:top w:type="dxa" w:w="60"/>
+              <w:left w:type="dxa" w:w="100"/>
+              <w:bottom w:type="dxa" w:w="60"/>
+              <w:right w:type="dxa" w:w="100"/>
+            </w:tcMar>
+          </w:tcPr>
+          <w:p>
+            <w:r>
+              <w:rPr>
+                <w:rFonts w:ascii="Calibri" w:cs="Calibri" w:eastAsia="Calibri" w:hAnsi="Calibri"/>
+                <w:b w:val="false"/>
+                <w:bCs w:val="false"/>
+                <w:sz w:val="20"/>
+                <w:szCs w:val="20"/>
+              </w:rPr>
+              <w:t xml:space="preserve">Seção 17</w:t>
+            </w:r>
+          </w:p>
+        </w:tc>
+      </w:tr>
+      <w:tr>
+        <w:trPr>
+          <w:cantSplit/>
+          <w:tblHeader w:val="false"/>
+        </w:trPr>
+        <w:tc>
+          <w:tcPr>
+            <w:tcW w:type="dxa" w:w="3031"/>
+            <w:tcBorders>
+              <w:top w:val="single" w:color="B7C4D6" w:sz="4"/>
+              <w:left w:val="single" w:color="B7C4D6" w:sz="4"/>
+              <w:bottom w:val="single" w:color="B7C4D6" w:sz="4"/>
+              <w:right w:val="single" w:color="B7C4D6" w:sz="4"/>
+            </w:tcBorders>
+            <w:tcMar>
+              <w:top w:type="dxa" w:w="60"/>
+              <w:left w:type="dxa" w:w="100"/>
+              <w:bottom w:type="dxa" w:w="60"/>
+              <w:right w:type="dxa" w:w="100"/>
+            </w:tcMar>
+          </w:tcPr>
+          <w:p>
+            <w:r>
+              <w:rPr>
+                <w:rFonts w:ascii="Calibri" w:cs="Calibri" w:eastAsia="Calibri" w:hAnsi="Calibri"/>
+                <w:b/>
+                <w:bCs/>
+                <w:sz w:val="20"/>
+                <w:szCs w:val="20"/>
+              </w:rPr>
               <w:t xml:space="preserve">Autenticação por chave de API para integrações externas (ex.: Softing-erp) com contexto da tela</w:t>
             </w:r>
           </w:p>
@@ -23159,7 +23287,7 @@
                 <w:sz w:val="20"/>
                 <w:szCs w:val="20"/>
               </w:rPr>
-              <w:t xml:space="preserve">Comparação "contém", sem acento e sem diferenciar maiúsculas.</w:t>
+              <w:t xml:space="preserve">Comparação por palavras: cada palavra da pergunta precisa aparecer inteira no campo, em qualquer ordem, sem acento e sem diferenciar maiúsculas. Tratamentos e palavras de ligação (sr., sra., dr., o, a, de, da, do, com…) são ignorados. Ex.: "sr. Wilson", "Wilson da FAPESP" e "FAPESP" acham "Sr. Wilson da FAPESP"; "Wilson" não acha "Wilsons Ltda". Vale para as queries de memos; nas queries de ERP (SQL Server) a comparação continua exata, salvo quando a pergunta pede "contendo".</w:t>
             </w:r>
           </w:p>
         </w:tc>
@@ -23703,7 +23831,7 @@
                 <w:sz w:val="20"/>
                 <w:szCs w:val="20"/>
               </w:rPr>
-              <w:t xml:space="preserve">Por padrão o sistema faz comparação exata; usa "contém" só quando a pergunta pede busca parcial ("contendo", "começa com").</w:t>
+              <w:t xml:space="preserve">Queries de memos: comparação por palavras (ver Tipos de campo). Queries de ERP: comparação exata; "contém" só quando a pergunta pede busca parcial ("contendo", "começa com").</w:t>
             </w:r>
           </w:p>
         </w:tc>
@@ -24597,6 +24725,60 @@
           <w:szCs w:val="21"/>
         </w:rPr>
         <w:t xml:space="preserve">A resposta informa o escopo aplicado (ex.: Mostrando só os memos de Suporte em "Agenda").</w:t>
+      </w:r>
+    </w:p>
+    <w:p>
+      <w:pPr>
+        <w:pStyle w:val="ListParagraph"/>
+        <w:numPr>
+          <w:ilvl w:val="0"/>
+          <w:numId w:val="2"/>
+        </w:numPr>
+        <w:spacing w:after="60"/>
+      </w:pPr>
+      <w:r>
+        <w:rPr>
+          <w:rFonts w:ascii="Calibri" w:cs="Calibri" w:eastAsia="Calibri" w:hAnsi="Calibri"/>
+          <w:sz w:val="21"/>
+          <w:szCs w:val="21"/>
+        </w:rPr>
+        <w:t xml:space="preserve">Se a pergunta não cita ninguém e nada é encontrado nos seus memos, a busca é refeita nos memos de todos e a resposta avisa: "Nada encontrado nos seus memos; mostrando os de todos."</w:t>
+      </w:r>
+    </w:p>
+    <w:p>
+      <w:pPr>
+        <w:pStyle w:val="ListParagraph"/>
+        <w:numPr>
+          <w:ilvl w:val="0"/>
+          <w:numId w:val="2"/>
+        </w:numPr>
+        <w:spacing w:after="60"/>
+      </w:pPr>
+      <w:r>
+        <w:rPr>
+          <w:rFonts w:ascii="Calibri" w:cs="Calibri" w:eastAsia="Calibri" w:hAnsi="Calibri"/>
+          <w:sz w:val="21"/>
+          <w:szCs w:val="21"/>
+        </w:rPr>
+        <w:t xml:space="preserve">Uma mesma expressão da pergunta ("sr. Wilson da FAPESP") é buscada inteira num só campo (o de descrição mais adequada, ex.: Com quem), nunca dividida entre dois campos.</w:t>
+      </w:r>
+    </w:p>
+    <w:p>
+      <w:pPr>
+        <w:pStyle w:val="ListParagraph"/>
+        <w:numPr>
+          <w:ilvl w:val="0"/>
+          <w:numId w:val="2"/>
+        </w:numPr>
+        <w:spacing w:after="60"/>
+      </w:pPr>
+      <w:r>
+        <w:rPr>
+          <w:rFonts w:ascii="Calibri" w:cs="Calibri" w:eastAsia="Calibri" w:hAnsi="Calibri"/>
+          <w:sz w:val="21"/>
+          <w:szCs w:val="21"/>
+        </w:rPr>
+        <w:t xml:space="preserve">Resposta sem nenhum resultado aparece com confiança baixa: não encontrar não é certeza de que o registro não existe. Tente "Ampliar busca" ou "de todos".</w:t>
       </w:r>
     </w:p>
     <w:p>

</xml_diff>

<commit_message>
feat(atualizavel): categoria Atualizável — alterar, concluir ou cancelar memos pela resposta do Perguntar, com Desfazer, resumo reescrito, histórico, lembretes e Query padrão sem encerrados
Co-Authored-By: Claude Opus 5.5 <noreply@anthropic.com>
</commit_message>
<xml_diff>
--- a/MyMemory_Manual_Operacional_v2.docx
+++ b/MyMemory_Manual_Operacional_v2.docx
@@ -2437,6 +2437,70 @@
                 <w:sz w:val="20"/>
                 <w:szCs w:val="20"/>
               </w:rPr>
+              <w:t xml:space="preserve">Categoria Atualizável: alterar, concluir ou cancelar memos (ex.: agenda) direto na resposta do Perguntar, com ↶ Desfazer</w:t>
+            </w:r>
+          </w:p>
+        </w:tc>
+        <w:tc>
+          <w:tcPr>
+            <w:tcW w:type="dxa" w:w="7075"/>
+            <w:tcBorders>
+              <w:top w:val="single" w:color="B7C4D6" w:sz="4"/>
+              <w:left w:val="single" w:color="B7C4D6" w:sz="4"/>
+              <w:bottom w:val="single" w:color="B7C4D6" w:sz="4"/>
+              <w:right w:val="single" w:color="B7C4D6" w:sz="4"/>
+            </w:tcBorders>
+            <w:tcMar>
+              <w:top w:type="dxa" w:w="60"/>
+              <w:left w:type="dxa" w:w="100"/>
+              <w:bottom w:type="dxa" w:w="60"/>
+              <w:right w:type="dxa" w:w="100"/>
+            </w:tcMar>
+          </w:tcPr>
+          <w:p>
+            <w:r>
+              <w:rPr>
+                <w:rFonts w:ascii="Calibri" w:cs="Calibri" w:eastAsia="Calibri" w:hAnsi="Calibri"/>
+                <w:b w:val="false"/>
+                <w:bCs w:val="false"/>
+                <w:sz w:val="20"/>
+                <w:szCs w:val="20"/>
+              </w:rPr>
+              <w:t xml:space="preserve">Seções 8 e 17</w:t>
+            </w:r>
+          </w:p>
+        </w:tc>
+      </w:tr>
+      <w:tr>
+        <w:trPr>
+          <w:cantSplit/>
+          <w:tblHeader w:val="false"/>
+        </w:trPr>
+        <w:tc>
+          <w:tcPr>
+            <w:tcW w:type="dxa" w:w="3031"/>
+            <w:tcBorders>
+              <w:top w:val="single" w:color="B7C4D6" w:sz="4"/>
+              <w:left w:val="single" w:color="B7C4D6" w:sz="4"/>
+              <w:bottom w:val="single" w:color="B7C4D6" w:sz="4"/>
+              <w:right w:val="single" w:color="B7C4D6" w:sz="4"/>
+            </w:tcBorders>
+            <w:tcMar>
+              <w:top w:type="dxa" w:w="60"/>
+              <w:left w:type="dxa" w:w="100"/>
+              <w:bottom w:type="dxa" w:w="60"/>
+              <w:right w:type="dxa" w:w="100"/>
+            </w:tcMar>
+          </w:tcPr>
+          <w:p>
+            <w:r>
+              <w:rPr>
+                <w:rFonts w:ascii="Calibri" w:cs="Calibri" w:eastAsia="Calibri" w:hAnsi="Calibri"/>
+                <w:b/>
+                <w:bCs/>
+                <w:sz w:val="20"/>
+                <w:szCs w:val="20"/>
+              </w:rPr>
               <w:t xml:space="preserve">Autenticação por chave de API para integrações externas (ex.: Softing-erp) com contexto da tela</w:t>
             </w:r>
           </w:p>
@@ -9792,6 +9856,175 @@
         <w:rPr>
           <w:rFonts w:ascii="Calibri" w:cs="Calibri" w:eastAsia="Calibri" w:hAnsi="Calibri"/>
         </w:rPr>
+        <w:t xml:space="preserve">Alterar, concluir ou cancelar pela resposta</w:t>
+      </w:r>
+    </w:p>
+    <w:p>
+      <w:pPr>
+        <w:spacing w:after="120"/>
+      </w:pPr>
+      <w:r>
+        <w:rPr>
+          <w:rFonts w:ascii="Calibri" w:cs="Calibri" w:eastAsia="Calibri" w:hAnsi="Calibri"/>
+          <w:sz w:val="21"/>
+          <w:szCs w:val="21"/>
+        </w:rPr>
+        <w:t xml:space="preserve">Em categorias marcadas como Atualizável (ex.: Agenda), os memos da resposta aparecem com ✎ ao lado do número e a linha da tabela fica clicável. Aparecem só para quem pode alterar: o dono do memo, quem o catalogou e owners/editores do grupo.</w:t>
+      </w:r>
+    </w:p>
+    <w:p>
+      <w:pPr>
+        <w:pStyle w:val="ListParagraph"/>
+        <w:numPr>
+          <w:ilvl w:val="0"/>
+          <w:numId w:val="8"/>
+        </w:numPr>
+        <w:spacing w:after="60"/>
+      </w:pPr>
+      <w:r>
+        <w:rPr>
+          <w:rFonts w:ascii="Calibri" w:cs="Calibri" w:eastAsia="Calibri" w:hAnsi="Calibri"/>
+          <w:sz w:val="21"/>
+          <w:szCs w:val="21"/>
+        </w:rPr>
+        <w:t xml:space="preserve">Toque (celular) ou clique (computador) na linha ou no ✎ — abre o cartão do memo com os campos preenchidos.</w:t>
+      </w:r>
+    </w:p>
+    <w:p>
+      <w:pPr>
+        <w:pStyle w:val="ListParagraph"/>
+        <w:numPr>
+          <w:ilvl w:val="0"/>
+          <w:numId w:val="8"/>
+        </w:numPr>
+        <w:spacing w:after="60"/>
+      </w:pPr>
+      <w:r>
+        <w:rPr>
+          <w:rFonts w:ascii="Calibri" w:cs="Calibri" w:eastAsia="Calibri" w:hAnsi="Calibri"/>
+          <w:sz w:val="21"/>
+          <w:szCs w:val="21"/>
+        </w:rPr>
+        <w:t xml:space="preserve">Mude os campos digitando ou pelo 🎤 de cada campo (encerra sozinho após 1,5 s de silêncio; no computador o texto aparece enquanto você fala). Hora falada ("15 horas", "15h30") vira 15:00/15:30; data vira dd/mm/aaaa.</w:t>
+      </w:r>
+    </w:p>
+    <w:p>
+      <w:pPr>
+        <w:pStyle w:val="ListParagraph"/>
+        <w:numPr>
+          <w:ilvl w:val="0"/>
+          <w:numId w:val="8"/>
+        </w:numPr>
+        <w:spacing w:after="60"/>
+      </w:pPr>
+      <w:r>
+        <w:rPr>
+          <w:rFonts w:ascii="Calibri" w:cs="Calibri" w:eastAsia="Calibri" w:hAnsi="Calibri"/>
+          <w:sz w:val="21"/>
+          <w:szCs w:val="21"/>
+        </w:rPr>
+        <w:t xml:space="preserve">Toque em "Salvar alterações". Não há confirmação extra: aparece "Alterado: … ↶ Desfazer" por 10 segundos.</w:t>
+      </w:r>
+    </w:p>
+    <w:p>
+      <w:pPr>
+        <w:pStyle w:val="ListParagraph"/>
+        <w:numPr>
+          <w:ilvl w:val="0"/>
+          <w:numId w:val="2"/>
+        </w:numPr>
+        <w:spacing w:after="60"/>
+      </w:pPr>
+      <w:r>
+        <w:rPr>
+          <w:rFonts w:ascii="Calibri" w:cs="Calibri" w:eastAsia="Calibri" w:hAnsi="Calibri"/>
+          <w:sz w:val="21"/>
+          <w:szCs w:val="21"/>
+        </w:rPr>
+        <w:t xml:space="preserve">"✓ Marcar como concluído" e "✕ Marcar como cancelado" mudam a situação com um toque (também com ↶ Desfazer). Memo concluído ou cancelado mostra "↺ Reativar".</w:t>
+      </w:r>
+    </w:p>
+    <w:p>
+      <w:pPr>
+        <w:pStyle w:val="ListParagraph"/>
+        <w:numPr>
+          <w:ilvl w:val="0"/>
+          <w:numId w:val="2"/>
+        </w:numPr>
+        <w:spacing w:after="60"/>
+      </w:pPr>
+      <w:r>
+        <w:rPr>
+          <w:rFonts w:ascii="Calibri" w:cs="Calibri" w:eastAsia="Calibri" w:hAnsi="Calibri"/>
+          <w:sz w:val="21"/>
+          <w:szCs w:val="21"/>
+        </w:rPr>
+        <w:t xml:space="preserve">O × do cartão (ou Esc) fecha sem alterar nada.</w:t>
+      </w:r>
+    </w:p>
+    <w:p>
+      <w:pPr>
+        <w:pStyle w:val="ListParagraph"/>
+        <w:numPr>
+          <w:ilvl w:val="0"/>
+          <w:numId w:val="2"/>
+        </w:numPr>
+        <w:spacing w:after="60"/>
+      </w:pPr>
+      <w:r>
+        <w:rPr>
+          <w:rFonts w:ascii="Calibri" w:cs="Calibri" w:eastAsia="Calibri" w:hAnsi="Calibri"/>
+          <w:sz w:val="21"/>
+          <w:szCs w:val="21"/>
+        </w:rPr>
+        <w:t xml:space="preserve">A linha alterada mostra os valores novos na própria resposta; cancelada ou concluída aparece riscada.</w:t>
+      </w:r>
+    </w:p>
+    <w:p>
+      <w:pPr>
+        <w:pStyle w:val="ListParagraph"/>
+        <w:numPr>
+          <w:ilvl w:val="0"/>
+          <w:numId w:val="2"/>
+        </w:numPr>
+        <w:spacing w:after="60"/>
+      </w:pPr>
+      <w:r>
+        <w:rPr>
+          <w:rFonts w:ascii="Calibri" w:cs="Calibri" w:eastAsia="Calibri" w:hAnsi="Calibri"/>
+          <w:sz w:val="21"/>
+          <w:szCs w:val="21"/>
+        </w:rPr>
+        <w:t xml:space="preserve">Depois de salvar, a IA reescreve o resumo do memo com os valores novos e o vetor do memo é refeito (busca semântica). O texto original do memo nunca é alterado.</w:t>
+      </w:r>
+    </w:p>
+    <w:p>
+      <w:pPr>
+        <w:pStyle w:val="ListParagraph"/>
+        <w:numPr>
+          <w:ilvl w:val="0"/>
+          <w:numId w:val="2"/>
+        </w:numPr>
+        <w:spacing w:after="60"/>
+      </w:pPr>
+      <w:r>
+        <w:rPr>
+          <w:rFonts w:ascii="Calibri" w:cs="Calibri" w:eastAsia="Calibri" w:hAnsi="Calibri"/>
+          <w:sz w:val="21"/>
+          <w:szCs w:val="21"/>
+        </w:rPr>
+        <w:t xml:space="preserve">Cada alteração fica registrada (quem, quando, antes e depois); o ↶ Desfazer usa esse registro.</w:t>
+      </w:r>
+    </w:p>
+    <w:p>
+      <w:pPr>
+        <w:pStyle w:val="Heading2"/>
+        <w:keepNext/>
+      </w:pPr>
+      <w:r>
+        <w:rPr>
+          <w:rFonts w:ascii="Calibri" w:cs="Calibri" w:eastAsia="Calibri" w:hAnsi="Calibri"/>
+        </w:rPr>
         <w:t xml:space="preserve">Avisos a partir da resposta</w:t>
       </w:r>
     </w:p>
@@ -10606,7 +10839,7 @@
         <w:pStyle w:val="ListParagraph"/>
         <w:numPr>
           <w:ilvl w:val="0"/>
-          <w:numId w:val="8"/>
+          <w:numId w:val="9"/>
         </w:numPr>
         <w:spacing w:after="60"/>
       </w:pPr>
@@ -10617,82 +10850,6 @@
           <w:szCs w:val="21"/>
         </w:rPr>
         <w:t xml:space="preserve">Fazer a pergunta normalmente e conferir se a resposta está correta.</w:t>
-      </w:r>
-    </w:p>
-    <w:p>
-      <w:pPr>
-        <w:pStyle w:val="ListParagraph"/>
-        <w:numPr>
-          <w:ilvl w:val="0"/>
-          <w:numId w:val="8"/>
-        </w:numPr>
-        <w:spacing w:after="60"/>
-      </w:pPr>
-      <w:r>
-        <w:rPr>
-          <w:rFonts w:ascii="Calibri" w:cs="Calibri" w:eastAsia="Calibri" w:hAnsi="Calibri"/>
-          <w:sz w:val="21"/>
-          <w:szCs w:val="21"/>
-        </w:rPr>
-        <w:t xml:space="preserve">Clicar no ícone de salvar do card.</w:t>
-      </w:r>
-    </w:p>
-    <w:p>
-      <w:pPr>
-        <w:pStyle w:val="ListParagraph"/>
-        <w:numPr>
-          <w:ilvl w:val="0"/>
-          <w:numId w:val="8"/>
-        </w:numPr>
-        <w:spacing w:after="60"/>
-      </w:pPr>
-      <w:r>
-        <w:rPr>
-          <w:rFonts w:ascii="Calibri" w:cs="Calibri" w:eastAsia="Calibri" w:hAnsi="Calibri"/>
-          <w:sz w:val="21"/>
-          <w:szCs w:val="21"/>
-        </w:rPr>
-        <w:t xml:space="preserve">Escolher "⚡ Com parâmetros". A opção "Salvar só o texto" mantém o comportamento antigo.</w:t>
-      </w:r>
-    </w:p>
-    <w:p>
-      <w:pPr>
-        <w:pBdr>
-          <w:left w:val="single" w:color="7B3F00" w:sz="12" w:space="8"/>
-        </w:pBdr>
-        <w:spacing w:before="80" w:after="80"/>
-        <w:ind w:left="360"/>
-      </w:pPr>
-      <w:r>
-        <w:rPr>
-          <w:rFonts w:ascii="Calibri" w:cs="Calibri" w:eastAsia="Calibri" w:hAnsi="Calibri"/>
-          <w:b/>
-          <w:bCs/>
-          <w:color w:val="7B3F00"/>
-          <w:sz w:val="21"/>
-          <w:szCs w:val="21"/>
-        </w:rPr>
-        <w:t xml:space="preserve">NOTA: </w:t>
-      </w:r>
-      <w:r>
-        <w:rPr>
-          <w:rFonts w:ascii="Calibri" w:cs="Calibri" w:eastAsia="Calibri" w:hAnsi="Calibri"/>
-          <w:sz w:val="21"/>
-          <w:szCs w:val="21"/>
-        </w:rPr>
-        <w:t xml:space="preserve">Só respostas estruturadas com parâmetros trocáveis oferecem a opção. Perguntas semânticas e híbridas sempre são salvas como texto.</w:t>
-      </w:r>
-    </w:p>
-    <w:p>
-      <w:pPr>
-        <w:pStyle w:val="Heading2"/>
-        <w:keepNext/>
-      </w:pPr>
-      <w:r>
-        <w:rPr>
-          <w:rFonts w:ascii="Calibri" w:cs="Calibri" w:eastAsia="Calibri" w:hAnsi="Calibri"/>
-        </w:rPr>
-        <w:t xml:space="preserve">Como usar</w:t>
       </w:r>
     </w:p>
     <w:p>
@@ -10710,7 +10867,7 @@
           <w:sz w:val="21"/>
           <w:szCs w:val="21"/>
         </w:rPr>
-        <w:t xml:space="preserve">Abrir "Perguntas salvas" e escolher uma pergunta marcada com ⚡.</w:t>
+        <w:t xml:space="preserve">Clicar no ícone de salvar do card.</w:t>
       </w:r>
     </w:p>
     <w:p>
@@ -10728,7 +10885,47 @@
           <w:sz w:val="21"/>
           <w:szCs w:val="21"/>
         </w:rPr>
-        <w:t xml:space="preserve">A frase aparece com os chips no lugar dos valores. Ex.: "faturamento do cliente [Cliente: Diguinho] [Período: nos últimos 6 meses]".</w:t>
+        <w:t xml:space="preserve">Escolher "⚡ Com parâmetros". A opção "Salvar só o texto" mantém o comportamento antigo.</w:t>
+      </w:r>
+    </w:p>
+    <w:p>
+      <w:pPr>
+        <w:pBdr>
+          <w:left w:val="single" w:color="7B3F00" w:sz="12" w:space="8"/>
+        </w:pBdr>
+        <w:spacing w:before="80" w:after="80"/>
+        <w:ind w:left="360"/>
+      </w:pPr>
+      <w:r>
+        <w:rPr>
+          <w:rFonts w:ascii="Calibri" w:cs="Calibri" w:eastAsia="Calibri" w:hAnsi="Calibri"/>
+          <w:b/>
+          <w:bCs/>
+          <w:color w:val="7B3F00"/>
+          <w:sz w:val="21"/>
+          <w:szCs w:val="21"/>
+        </w:rPr>
+        <w:t xml:space="preserve">NOTA: </w:t>
+      </w:r>
+      <w:r>
+        <w:rPr>
+          <w:rFonts w:ascii="Calibri" w:cs="Calibri" w:eastAsia="Calibri" w:hAnsi="Calibri"/>
+          <w:sz w:val="21"/>
+          <w:szCs w:val="21"/>
+        </w:rPr>
+        <w:t xml:space="preserve">Só respostas estruturadas com parâmetros trocáveis oferecem a opção. Perguntas semânticas e híbridas sempre são salvas como texto.</w:t>
+      </w:r>
+    </w:p>
+    <w:p>
+      <w:pPr>
+        <w:pStyle w:val="Heading2"/>
+        <w:keepNext/>
+      </w:pPr>
+      <w:r>
+        <w:rPr>
+          <w:rFonts w:ascii="Calibri" w:cs="Calibri" w:eastAsia="Calibri" w:hAnsi="Calibri"/>
+        </w:rPr>
+        <w:t xml:space="preserve">Como usar</w:t>
       </w:r>
     </w:p>
     <w:p>
@@ -10736,7 +10933,7 @@
         <w:pStyle w:val="ListParagraph"/>
         <w:numPr>
           <w:ilvl w:val="0"/>
-          <w:numId w:val="9"/>
+          <w:numId w:val="10"/>
         </w:numPr>
         <w:spacing w:after="60"/>
       </w:pPr>
@@ -10746,7 +10943,7 @@
           <w:sz w:val="21"/>
           <w:szCs w:val="21"/>
         </w:rPr>
-        <w:t xml:space="preserve">Clicar em um chip para trocar o valor.</w:t>
+        <w:t xml:space="preserve">Abrir "Perguntas salvas" e escolher uma pergunta marcada com ⚡.</w:t>
       </w:r>
     </w:p>
     <w:p>
@@ -10754,7 +10951,43 @@
         <w:pStyle w:val="ListParagraph"/>
         <w:numPr>
           <w:ilvl w:val="0"/>
-          <w:numId w:val="9"/>
+          <w:numId w:val="10"/>
+        </w:numPr>
+        <w:spacing w:after="60"/>
+      </w:pPr>
+      <w:r>
+        <w:rPr>
+          <w:rFonts w:ascii="Calibri" w:cs="Calibri" w:eastAsia="Calibri" w:hAnsi="Calibri"/>
+          <w:sz w:val="21"/>
+          <w:szCs w:val="21"/>
+        </w:rPr>
+        <w:t xml:space="preserve">A frase aparece com os chips no lugar dos valores. Ex.: "faturamento do cliente [Cliente: Diguinho] [Período: nos últimos 6 meses]".</w:t>
+      </w:r>
+    </w:p>
+    <w:p>
+      <w:pPr>
+        <w:pStyle w:val="ListParagraph"/>
+        <w:numPr>
+          <w:ilvl w:val="0"/>
+          <w:numId w:val="10"/>
+        </w:numPr>
+        <w:spacing w:after="60"/>
+      </w:pPr>
+      <w:r>
+        <w:rPr>
+          <w:rFonts w:ascii="Calibri" w:cs="Calibri" w:eastAsia="Calibri" w:hAnsi="Calibri"/>
+          <w:sz w:val="21"/>
+          <w:szCs w:val="21"/>
+        </w:rPr>
+        <w:t xml:space="preserve">Clicar em um chip para trocar o valor.</w:t>
+      </w:r>
+    </w:p>
+    <w:p>
+      <w:pPr>
+        <w:pStyle w:val="ListParagraph"/>
+        <w:numPr>
+          <w:ilvl w:val="0"/>
+          <w:numId w:val="10"/>
         </w:numPr>
         <w:spacing w:after="60"/>
       </w:pPr>
@@ -14763,7 +14996,7 @@
         <w:pStyle w:val="ListParagraph"/>
         <w:numPr>
           <w:ilvl w:val="0"/>
-          <w:numId w:val="10"/>
+          <w:numId w:val="11"/>
         </w:numPr>
         <w:spacing w:after="60"/>
       </w:pPr>
@@ -14781,7 +15014,7 @@
         <w:pStyle w:val="ListParagraph"/>
         <w:numPr>
           <w:ilvl w:val="0"/>
-          <w:numId w:val="10"/>
+          <w:numId w:val="11"/>
         </w:numPr>
         <w:spacing w:after="60"/>
       </w:pPr>
@@ -14799,7 +15032,7 @@
         <w:pStyle w:val="ListParagraph"/>
         <w:numPr>
           <w:ilvl w:val="0"/>
-          <w:numId w:val="10"/>
+          <w:numId w:val="11"/>
         </w:numPr>
         <w:spacing w:after="60"/>
       </w:pPr>
@@ -18382,7 +18615,7 @@
         <w:pStyle w:val="ListParagraph"/>
         <w:numPr>
           <w:ilvl w:val="0"/>
-          <w:numId w:val="11"/>
+          <w:numId w:val="12"/>
         </w:numPr>
         <w:spacing w:after="60"/>
       </w:pPr>
@@ -18400,7 +18633,7 @@
         <w:pStyle w:val="ListParagraph"/>
         <w:numPr>
           <w:ilvl w:val="0"/>
-          <w:numId w:val="11"/>
+          <w:numId w:val="12"/>
         </w:numPr>
         <w:spacing w:after="60"/>
       </w:pPr>
@@ -18418,7 +18651,7 @@
         <w:pStyle w:val="ListParagraph"/>
         <w:numPr>
           <w:ilvl w:val="0"/>
-          <w:numId w:val="11"/>
+          <w:numId w:val="12"/>
         </w:numPr>
         <w:spacing w:after="60"/>
       </w:pPr>
@@ -18436,7 +18669,7 @@
         <w:pStyle w:val="ListParagraph"/>
         <w:numPr>
           <w:ilvl w:val="0"/>
-          <w:numId w:val="11"/>
+          <w:numId w:val="12"/>
         </w:numPr>
         <w:spacing w:after="60"/>
       </w:pPr>
@@ -18454,7 +18687,7 @@
         <w:pStyle w:val="ListParagraph"/>
         <w:numPr>
           <w:ilvl w:val="0"/>
-          <w:numId w:val="11"/>
+          <w:numId w:val="12"/>
         </w:numPr>
         <w:spacing w:after="60"/>
       </w:pPr>
@@ -18472,7 +18705,7 @@
         <w:pStyle w:val="ListParagraph"/>
         <w:numPr>
           <w:ilvl w:val="0"/>
-          <w:numId w:val="11"/>
+          <w:numId w:val="12"/>
         </w:numPr>
         <w:spacing w:after="60"/>
       </w:pPr>
@@ -19454,7 +19687,7 @@
         <w:pStyle w:val="ListParagraph"/>
         <w:numPr>
           <w:ilvl w:val="0"/>
-          <w:numId w:val="12"/>
+          <w:numId w:val="13"/>
         </w:numPr>
         <w:spacing w:after="60"/>
       </w:pPr>
@@ -19472,7 +19705,7 @@
         <w:pStyle w:val="ListParagraph"/>
         <w:numPr>
           <w:ilvl w:val="0"/>
-          <w:numId w:val="12"/>
+          <w:numId w:val="13"/>
         </w:numPr>
         <w:spacing w:after="60"/>
       </w:pPr>
@@ -19490,7 +19723,7 @@
         <w:pStyle w:val="ListParagraph"/>
         <w:numPr>
           <w:ilvl w:val="0"/>
-          <w:numId w:val="12"/>
+          <w:numId w:val="13"/>
         </w:numPr>
         <w:spacing w:after="60"/>
       </w:pPr>
@@ -19508,7 +19741,7 @@
         <w:pStyle w:val="ListParagraph"/>
         <w:numPr>
           <w:ilvl w:val="0"/>
-          <w:numId w:val="12"/>
+          <w:numId w:val="13"/>
         </w:numPr>
         <w:spacing w:after="60"/>
       </w:pPr>
@@ -19526,7 +19759,7 @@
         <w:pStyle w:val="ListParagraph"/>
         <w:numPr>
           <w:ilvl w:val="0"/>
-          <w:numId w:val="12"/>
+          <w:numId w:val="13"/>
         </w:numPr>
         <w:spacing w:after="60"/>
       </w:pPr>
@@ -19544,7 +19777,7 @@
         <w:pStyle w:val="ListParagraph"/>
         <w:numPr>
           <w:ilvl w:val="0"/>
-          <w:numId w:val="12"/>
+          <w:numId w:val="13"/>
         </w:numPr>
         <w:spacing w:after="60"/>
       </w:pPr>
@@ -19970,7 +20203,7 @@
         <w:pStyle w:val="ListParagraph"/>
         <w:numPr>
           <w:ilvl w:val="0"/>
-          <w:numId w:val="13"/>
+          <w:numId w:val="14"/>
         </w:numPr>
         <w:spacing w:after="60"/>
       </w:pPr>
@@ -19988,7 +20221,7 @@
         <w:pStyle w:val="ListParagraph"/>
         <w:numPr>
           <w:ilvl w:val="0"/>
-          <w:numId w:val="13"/>
+          <w:numId w:val="14"/>
         </w:numPr>
         <w:spacing w:after="60"/>
       </w:pPr>
@@ -20006,7 +20239,7 @@
         <w:pStyle w:val="ListParagraph"/>
         <w:numPr>
           <w:ilvl w:val="0"/>
-          <w:numId w:val="13"/>
+          <w:numId w:val="14"/>
         </w:numPr>
         <w:spacing w:after="60"/>
       </w:pPr>
@@ -24811,6 +25044,770 @@
     </w:p>
     <w:p>
       <w:pPr>
+        <w:pStyle w:val="Heading2"/>
+        <w:keepNext/>
+      </w:pPr>
+      <w:r>
+        <w:rPr>
+          <w:rFonts w:ascii="Calibri" w:cs="Calibri" w:eastAsia="Calibri" w:hAnsi="Calibri"/>
+        </w:rPr>
+        <w:t xml:space="preserve">Categoria Atualizável</w:t>
+      </w:r>
+    </w:p>
+    <w:p>
+      <w:pPr>
+        <w:spacing w:after="120"/>
+      </w:pPr>
+      <w:r>
+        <w:rPr>
+          <w:rFonts w:ascii="Calibri" w:cs="Calibri" w:eastAsia="Calibri" w:hAnsi="Calibri"/>
+          <w:sz w:val="21"/>
+          <w:szCs w:val="21"/>
+        </w:rPr>
+        <w:t xml:space="preserve">Em "Editar categoria", a opção "Atualizável — os memos mudam de situação" serve para agenda, tarefas, pedidos: registros que depois são remarcados, concluídos ou cancelados.</w:t>
+      </w:r>
+    </w:p>
+    <w:p>
+      <w:pPr>
+        <w:pStyle w:val="ListParagraph"/>
+        <w:numPr>
+          <w:ilvl w:val="0"/>
+          <w:numId w:val="2"/>
+        </w:numPr>
+        <w:spacing w:after="60"/>
+      </w:pPr>
+      <w:r>
+        <w:rPr>
+          <w:rFonts w:ascii="Calibri" w:cs="Calibri" w:eastAsia="Calibri" w:hAnsi="Calibri"/>
+          <w:sz w:val="21"/>
+          <w:szCs w:val="21"/>
+        </w:rPr>
+        <w:t xml:space="preserve">Ao marcar, o sistema usa o campo "Situação" da categoria (ou cria um), com os padrões Ativo, Concluído e Cancelado — as mesmas três situações em todas as categorias atualizáveis. Memo sem situação conta como Ativo.</w:t>
+      </w:r>
+    </w:p>
+    <w:p>
+      <w:pPr>
+        <w:pStyle w:val="ListParagraph"/>
+        <w:numPr>
+          <w:ilvl w:val="0"/>
+          <w:numId w:val="2"/>
+        </w:numPr>
+        <w:spacing w:after="60"/>
+      </w:pPr>
+      <w:r>
+        <w:rPr>
+          <w:rFonts w:ascii="Calibri" w:cs="Calibri" w:eastAsia="Calibri" w:hAnsi="Calibri"/>
+          <w:sz w:val="21"/>
+          <w:szCs w:val="21"/>
+        </w:rPr>
+        <w:t xml:space="preserve">Nas respostas do Perguntar, os memos da categoria podem ser alterados, concluídos ou cancelados (ver seção 8).</w:t>
+      </w:r>
+    </w:p>
+    <w:p>
+      <w:pPr>
+        <w:pStyle w:val="ListParagraph"/>
+        <w:numPr>
+          <w:ilvl w:val="0"/>
+          <w:numId w:val="2"/>
+        </w:numPr>
+        <w:spacing w:after="60"/>
+      </w:pPr>
+      <w:r>
+        <w:rPr>
+          <w:rFonts w:ascii="Calibri" w:cs="Calibri" w:eastAsia="Calibri" w:hAnsi="Calibri"/>
+          <w:sz w:val="21"/>
+          <w:szCs w:val="21"/>
+        </w:rPr>
+        <w:t xml:space="preserve">Perguntas: a Query padrão esconde Concluído e Cancelado, a menos que a pergunta peça pela situação ("o que foi cancelado este mês?"). Queries editadas à mão não ganham esse filtro automaticamente.</w:t>
+      </w:r>
+    </w:p>
+    <w:p>
+      <w:pPr>
+        <w:pStyle w:val="ListParagraph"/>
+        <w:numPr>
+          <w:ilvl w:val="0"/>
+          <w:numId w:val="2"/>
+        </w:numPr>
+        <w:spacing w:after="60"/>
+      </w:pPr>
+      <w:r>
+        <w:rPr>
+          <w:rFonts w:ascii="Calibri" w:cs="Calibri" w:eastAsia="Calibri" w:hAnsi="Calibri"/>
+          <w:sz w:val="21"/>
+          <w:szCs w:val="21"/>
+        </w:rPr>
+        <w:t xml:space="preserve">Lembretes: memos concluídos ou cancelados não geram aviso. Remarcar (mudar data ou hora) já reprograma o lembrete.</w:t>
+      </w:r>
+    </w:p>
+    <w:tbl>
+      <w:tblPr>
+        <w:tblW w:type="dxa" w:w="10106"/>
+        <w:tblBorders>
+          <w:top w:val="single" w:color="auto" w:sz="4"/>
+          <w:left w:val="single" w:color="auto" w:sz="4"/>
+          <w:bottom w:val="single" w:color="auto" w:sz="4"/>
+          <w:right w:val="single" w:color="auto" w:sz="4"/>
+          <w:insideH w:val="single" w:color="auto" w:sz="4"/>
+          <w:insideV w:val="single" w:color="auto" w:sz="4"/>
+        </w:tblBorders>
+      </w:tblPr>
+      <w:tblGrid>
+        <w:gridCol w:w="2021"/>
+        <w:gridCol w:w="2021"/>
+        <w:gridCol w:w="2021"/>
+        <w:gridCol w:w="2021"/>
+        <w:gridCol w:w="2022"/>
+      </w:tblGrid>
+      <w:tr>
+        <w:trPr>
+          <w:cantSplit/>
+          <w:tblHeader/>
+        </w:trPr>
+        <w:tc>
+          <w:tcPr>
+            <w:tcW w:type="dxa" w:w="2021"/>
+            <w:tcBorders>
+              <w:top w:val="single" w:color="B7C4D6" w:sz="4"/>
+              <w:left w:val="single" w:color="B7C4D6" w:sz="4"/>
+              <w:bottom w:val="single" w:color="B7C4D6" w:sz="4"/>
+              <w:right w:val="single" w:color="B7C4D6" w:sz="4"/>
+            </w:tcBorders>
+            <w:shd w:fill="D0E4FF" w:color="auto" w:val="clear"/>
+            <w:tcMar>
+              <w:top w:type="dxa" w:w="60"/>
+              <w:left w:type="dxa" w:w="100"/>
+              <w:bottom w:type="dxa" w:w="60"/>
+              <w:right w:type="dxa" w:w="100"/>
+            </w:tcMar>
+          </w:tcPr>
+          <w:p>
+            <w:r>
+              <w:rPr>
+                <w:rFonts w:ascii="Calibri" w:cs="Calibri" w:eastAsia="Calibri" w:hAnsi="Calibri"/>
+                <w:b/>
+                <w:bCs/>
+                <w:color w:val="1E3A5F"/>
+                <w:sz w:val="20"/>
+                <w:szCs w:val="20"/>
+              </w:rPr>
+              <w:t xml:space="preserve">Situação</w:t>
+            </w:r>
+          </w:p>
+        </w:tc>
+        <w:tc>
+          <w:tcPr>
+            <w:tcW w:type="dxa" w:w="2021"/>
+            <w:tcBorders>
+              <w:top w:val="single" w:color="B7C4D6" w:sz="4"/>
+              <w:left w:val="single" w:color="B7C4D6" w:sz="4"/>
+              <w:bottom w:val="single" w:color="B7C4D6" w:sz="4"/>
+              <w:right w:val="single" w:color="B7C4D6" w:sz="4"/>
+            </w:tcBorders>
+            <w:shd w:fill="D0E4FF" w:color="auto" w:val="clear"/>
+            <w:tcMar>
+              <w:top w:type="dxa" w:w="60"/>
+              <w:left w:type="dxa" w:w="100"/>
+              <w:bottom w:type="dxa" w:w="60"/>
+              <w:right w:type="dxa" w:w="100"/>
+            </w:tcMar>
+          </w:tcPr>
+          <w:p>
+            <w:r>
+              <w:rPr>
+                <w:rFonts w:ascii="Calibri" w:cs="Calibri" w:eastAsia="Calibri" w:hAnsi="Calibri"/>
+                <w:b/>
+                <w:bCs/>
+                <w:color w:val="1E3A5F"/>
+                <w:sz w:val="20"/>
+                <w:szCs w:val="20"/>
+              </w:rPr>
+              <w:t xml:space="preserve">Significa</w:t>
+            </w:r>
+          </w:p>
+        </w:tc>
+        <w:tc>
+          <w:tcPr>
+            <w:tcW w:type="dxa" w:w="2021"/>
+            <w:tcBorders>
+              <w:top w:val="single" w:color="B7C4D6" w:sz="4"/>
+              <w:left w:val="single" w:color="B7C4D6" w:sz="4"/>
+              <w:bottom w:val="single" w:color="B7C4D6" w:sz="4"/>
+              <w:right w:val="single" w:color="B7C4D6" w:sz="4"/>
+            </w:tcBorders>
+            <w:shd w:fill="D0E4FF" w:color="auto" w:val="clear"/>
+            <w:tcMar>
+              <w:top w:type="dxa" w:w="60"/>
+              <w:left w:type="dxa" w:w="100"/>
+              <w:bottom w:type="dxa" w:w="60"/>
+              <w:right w:type="dxa" w:w="100"/>
+            </w:tcMar>
+          </w:tcPr>
+          <w:p>
+            <w:r>
+              <w:rPr>
+                <w:rFonts w:ascii="Calibri" w:cs="Calibri" w:eastAsia="Calibri" w:hAnsi="Calibri"/>
+                <w:b/>
+                <w:bCs/>
+                <w:color w:val="1E3A5F"/>
+                <w:sz w:val="20"/>
+                <w:szCs w:val="20"/>
+              </w:rPr>
+              <w:t xml:space="preserve">Agenda</w:t>
+            </w:r>
+          </w:p>
+        </w:tc>
+        <w:tc>
+          <w:tcPr>
+            <w:tcW w:type="dxa" w:w="2021"/>
+            <w:tcBorders>
+              <w:top w:val="single" w:color="B7C4D6" w:sz="4"/>
+              <w:left w:val="single" w:color="B7C4D6" w:sz="4"/>
+              <w:bottom w:val="single" w:color="B7C4D6" w:sz="4"/>
+              <w:right w:val="single" w:color="B7C4D6" w:sz="4"/>
+            </w:tcBorders>
+            <w:shd w:fill="D0E4FF" w:color="auto" w:val="clear"/>
+            <w:tcMar>
+              <w:top w:type="dxa" w:w="60"/>
+              <w:left w:type="dxa" w:w="100"/>
+              <w:bottom w:type="dxa" w:w="60"/>
+              <w:right w:type="dxa" w:w="100"/>
+            </w:tcMar>
+          </w:tcPr>
+          <w:p>
+            <w:r>
+              <w:rPr>
+                <w:rFonts w:ascii="Calibri" w:cs="Calibri" w:eastAsia="Calibri" w:hAnsi="Calibri"/>
+                <w:b/>
+                <w:bCs/>
+                <w:color w:val="1E3A5F"/>
+                <w:sz w:val="20"/>
+                <w:szCs w:val="20"/>
+              </w:rPr>
+              <w:t xml:space="preserve">Tarefa</w:t>
+            </w:r>
+          </w:p>
+        </w:tc>
+        <w:tc>
+          <w:tcPr>
+            <w:tcW w:type="dxa" w:w="2022"/>
+            <w:tcBorders>
+              <w:top w:val="single" w:color="B7C4D6" w:sz="4"/>
+              <w:left w:val="single" w:color="B7C4D6" w:sz="4"/>
+              <w:bottom w:val="single" w:color="B7C4D6" w:sz="4"/>
+              <w:right w:val="single" w:color="B7C4D6" w:sz="4"/>
+            </w:tcBorders>
+            <w:shd w:fill="D0E4FF" w:color="auto" w:val="clear"/>
+            <w:tcMar>
+              <w:top w:type="dxa" w:w="60"/>
+              <w:left w:type="dxa" w:w="100"/>
+              <w:bottom w:type="dxa" w:w="60"/>
+              <w:right w:type="dxa" w:w="100"/>
+            </w:tcMar>
+          </w:tcPr>
+          <w:p>
+            <w:r>
+              <w:rPr>
+                <w:rFonts w:ascii="Calibri" w:cs="Calibri" w:eastAsia="Calibri" w:hAnsi="Calibri"/>
+                <w:b/>
+                <w:bCs/>
+                <w:color w:val="1E3A5F"/>
+                <w:sz w:val="20"/>
+                <w:szCs w:val="20"/>
+              </w:rPr>
+              <w:t xml:space="preserve">Pedido</w:t>
+            </w:r>
+          </w:p>
+        </w:tc>
+      </w:tr>
+      <w:tr>
+        <w:trPr>
+          <w:cantSplit/>
+          <w:tblHeader w:val="false"/>
+        </w:trPr>
+        <w:tc>
+          <w:tcPr>
+            <w:tcW w:type="dxa" w:w="2021"/>
+            <w:tcBorders>
+              <w:top w:val="single" w:color="B7C4D6" w:sz="4"/>
+              <w:left w:val="single" w:color="B7C4D6" w:sz="4"/>
+              <w:bottom w:val="single" w:color="B7C4D6" w:sz="4"/>
+              <w:right w:val="single" w:color="B7C4D6" w:sz="4"/>
+            </w:tcBorders>
+            <w:tcMar>
+              <w:top w:type="dxa" w:w="60"/>
+              <w:left w:type="dxa" w:w="100"/>
+              <w:bottom w:type="dxa" w:w="60"/>
+              <w:right w:type="dxa" w:w="100"/>
+            </w:tcMar>
+          </w:tcPr>
+          <w:p>
+            <w:r>
+              <w:rPr>
+                <w:rFonts w:ascii="Calibri" w:cs="Calibri" w:eastAsia="Calibri" w:hAnsi="Calibri"/>
+                <w:b w:val="false"/>
+                <w:bCs w:val="false"/>
+                <w:sz w:val="20"/>
+                <w:szCs w:val="20"/>
+              </w:rPr>
+              <w:t xml:space="preserve">Ativo</w:t>
+            </w:r>
+          </w:p>
+        </w:tc>
+        <w:tc>
+          <w:tcPr>
+            <w:tcW w:type="dxa" w:w="2021"/>
+            <w:tcBorders>
+              <w:top w:val="single" w:color="B7C4D6" w:sz="4"/>
+              <w:left w:val="single" w:color="B7C4D6" w:sz="4"/>
+              <w:bottom w:val="single" w:color="B7C4D6" w:sz="4"/>
+              <w:right w:val="single" w:color="B7C4D6" w:sz="4"/>
+            </w:tcBorders>
+            <w:tcMar>
+              <w:top w:type="dxa" w:w="60"/>
+              <w:left w:type="dxa" w:w="100"/>
+              <w:bottom w:type="dxa" w:w="60"/>
+              <w:right w:type="dxa" w:w="100"/>
+            </w:tcMar>
+          </w:tcPr>
+          <w:p>
+            <w:r>
+              <w:rPr>
+                <w:rFonts w:ascii="Calibri" w:cs="Calibri" w:eastAsia="Calibri" w:hAnsi="Calibri"/>
+                <w:b w:val="false"/>
+                <w:bCs w:val="false"/>
+                <w:sz w:val="20"/>
+                <w:szCs w:val="20"/>
+              </w:rPr>
+              <w:t xml:space="preserve">vale, em andamento</w:t>
+            </w:r>
+          </w:p>
+        </w:tc>
+        <w:tc>
+          <w:tcPr>
+            <w:tcW w:type="dxa" w:w="2021"/>
+            <w:tcBorders>
+              <w:top w:val="single" w:color="B7C4D6" w:sz="4"/>
+              <w:left w:val="single" w:color="B7C4D6" w:sz="4"/>
+              <w:bottom w:val="single" w:color="B7C4D6" w:sz="4"/>
+              <w:right w:val="single" w:color="B7C4D6" w:sz="4"/>
+            </w:tcBorders>
+            <w:tcMar>
+              <w:top w:type="dxa" w:w="60"/>
+              <w:left w:type="dxa" w:w="100"/>
+              <w:bottom w:type="dxa" w:w="60"/>
+              <w:right w:type="dxa" w:w="100"/>
+            </w:tcMar>
+          </w:tcPr>
+          <w:p>
+            <w:r>
+              <w:rPr>
+                <w:rFonts w:ascii="Calibri" w:cs="Calibri" w:eastAsia="Calibri" w:hAnsi="Calibri"/>
+                <w:b w:val="false"/>
+                <w:bCs w:val="false"/>
+                <w:sz w:val="20"/>
+                <w:szCs w:val="20"/>
+              </w:rPr>
+              <w:t xml:space="preserve">marcado</w:t>
+            </w:r>
+          </w:p>
+        </w:tc>
+        <w:tc>
+          <w:tcPr>
+            <w:tcW w:type="dxa" w:w="2021"/>
+            <w:tcBorders>
+              <w:top w:val="single" w:color="B7C4D6" w:sz="4"/>
+              <w:left w:val="single" w:color="B7C4D6" w:sz="4"/>
+              <w:bottom w:val="single" w:color="B7C4D6" w:sz="4"/>
+              <w:right w:val="single" w:color="B7C4D6" w:sz="4"/>
+            </w:tcBorders>
+            <w:tcMar>
+              <w:top w:type="dxa" w:w="60"/>
+              <w:left w:type="dxa" w:w="100"/>
+              <w:bottom w:type="dxa" w:w="60"/>
+              <w:right w:type="dxa" w:w="100"/>
+            </w:tcMar>
+          </w:tcPr>
+          <w:p>
+            <w:r>
+              <w:rPr>
+                <w:rFonts w:ascii="Calibri" w:cs="Calibri" w:eastAsia="Calibri" w:hAnsi="Calibri"/>
+                <w:b w:val="false"/>
+                <w:bCs w:val="false"/>
+                <w:sz w:val="20"/>
+                <w:szCs w:val="20"/>
+              </w:rPr>
+              <w:t xml:space="preserve">aberta</w:t>
+            </w:r>
+          </w:p>
+        </w:tc>
+        <w:tc>
+          <w:tcPr>
+            <w:tcW w:type="dxa" w:w="2022"/>
+            <w:tcBorders>
+              <w:top w:val="single" w:color="B7C4D6" w:sz="4"/>
+              <w:left w:val="single" w:color="B7C4D6" w:sz="4"/>
+              <w:bottom w:val="single" w:color="B7C4D6" w:sz="4"/>
+              <w:right w:val="single" w:color="B7C4D6" w:sz="4"/>
+            </w:tcBorders>
+            <w:tcMar>
+              <w:top w:type="dxa" w:w="60"/>
+              <w:left w:type="dxa" w:w="100"/>
+              <w:bottom w:type="dxa" w:w="60"/>
+              <w:right w:type="dxa" w:w="100"/>
+            </w:tcMar>
+          </w:tcPr>
+          <w:p>
+            <w:r>
+              <w:rPr>
+                <w:rFonts w:ascii="Calibri" w:cs="Calibri" w:eastAsia="Calibri" w:hAnsi="Calibri"/>
+                <w:b w:val="false"/>
+                <w:bCs w:val="false"/>
+                <w:sz w:val="20"/>
+                <w:szCs w:val="20"/>
+              </w:rPr>
+              <w:t xml:space="preserve">em aberto</w:t>
+            </w:r>
+          </w:p>
+        </w:tc>
+      </w:tr>
+      <w:tr>
+        <w:trPr>
+          <w:cantSplit/>
+          <w:tblHeader w:val="false"/>
+        </w:trPr>
+        <w:tc>
+          <w:tcPr>
+            <w:tcW w:type="dxa" w:w="2021"/>
+            <w:tcBorders>
+              <w:top w:val="single" w:color="B7C4D6" w:sz="4"/>
+              <w:left w:val="single" w:color="B7C4D6" w:sz="4"/>
+              <w:bottom w:val="single" w:color="B7C4D6" w:sz="4"/>
+              <w:right w:val="single" w:color="B7C4D6" w:sz="4"/>
+            </w:tcBorders>
+            <w:tcMar>
+              <w:top w:type="dxa" w:w="60"/>
+              <w:left w:type="dxa" w:w="100"/>
+              <w:bottom w:type="dxa" w:w="60"/>
+              <w:right w:type="dxa" w:w="100"/>
+            </w:tcMar>
+          </w:tcPr>
+          <w:p>
+            <w:r>
+              <w:rPr>
+                <w:rFonts w:ascii="Calibri" w:cs="Calibri" w:eastAsia="Calibri" w:hAnsi="Calibri"/>
+                <w:b w:val="false"/>
+                <w:bCs w:val="false"/>
+                <w:sz w:val="20"/>
+                <w:szCs w:val="20"/>
+              </w:rPr>
+              <w:t xml:space="preserve">Concluído</w:t>
+            </w:r>
+          </w:p>
+        </w:tc>
+        <w:tc>
+          <w:tcPr>
+            <w:tcW w:type="dxa" w:w="2021"/>
+            <w:tcBorders>
+              <w:top w:val="single" w:color="B7C4D6" w:sz="4"/>
+              <w:left w:val="single" w:color="B7C4D6" w:sz="4"/>
+              <w:bottom w:val="single" w:color="B7C4D6" w:sz="4"/>
+              <w:right w:val="single" w:color="B7C4D6" w:sz="4"/>
+            </w:tcBorders>
+            <w:tcMar>
+              <w:top w:type="dxa" w:w="60"/>
+              <w:left w:type="dxa" w:w="100"/>
+              <w:bottom w:type="dxa" w:w="60"/>
+              <w:right w:type="dxa" w:w="100"/>
+            </w:tcMar>
+          </w:tcPr>
+          <w:p>
+            <w:r>
+              <w:rPr>
+                <w:rFonts w:ascii="Calibri" w:cs="Calibri" w:eastAsia="Calibri" w:hAnsi="Calibri"/>
+                <w:b w:val="false"/>
+                <w:bCs w:val="false"/>
+                <w:sz w:val="20"/>
+                <w:szCs w:val="20"/>
+              </w:rPr>
+              <w:t xml:space="preserve">terminou</w:t>
+            </w:r>
+          </w:p>
+        </w:tc>
+        <w:tc>
+          <w:tcPr>
+            <w:tcW w:type="dxa" w:w="2021"/>
+            <w:tcBorders>
+              <w:top w:val="single" w:color="B7C4D6" w:sz="4"/>
+              <w:left w:val="single" w:color="B7C4D6" w:sz="4"/>
+              <w:bottom w:val="single" w:color="B7C4D6" w:sz="4"/>
+              <w:right w:val="single" w:color="B7C4D6" w:sz="4"/>
+            </w:tcBorders>
+            <w:tcMar>
+              <w:top w:type="dxa" w:w="60"/>
+              <w:left w:type="dxa" w:w="100"/>
+              <w:bottom w:type="dxa" w:w="60"/>
+              <w:right w:type="dxa" w:w="100"/>
+            </w:tcMar>
+          </w:tcPr>
+          <w:p>
+            <w:r>
+              <w:rPr>
+                <w:rFonts w:ascii="Calibri" w:cs="Calibri" w:eastAsia="Calibri" w:hAnsi="Calibri"/>
+                <w:b w:val="false"/>
+                <w:bCs w:val="false"/>
+                <w:sz w:val="20"/>
+                <w:szCs w:val="20"/>
+              </w:rPr>
+              <w:t xml:space="preserve">aconteceu</w:t>
+            </w:r>
+          </w:p>
+        </w:tc>
+        <w:tc>
+          <w:tcPr>
+            <w:tcW w:type="dxa" w:w="2021"/>
+            <w:tcBorders>
+              <w:top w:val="single" w:color="B7C4D6" w:sz="4"/>
+              <w:left w:val="single" w:color="B7C4D6" w:sz="4"/>
+              <w:bottom w:val="single" w:color="B7C4D6" w:sz="4"/>
+              <w:right w:val="single" w:color="B7C4D6" w:sz="4"/>
+            </w:tcBorders>
+            <w:tcMar>
+              <w:top w:type="dxa" w:w="60"/>
+              <w:left w:type="dxa" w:w="100"/>
+              <w:bottom w:type="dxa" w:w="60"/>
+              <w:right w:type="dxa" w:w="100"/>
+            </w:tcMar>
+          </w:tcPr>
+          <w:p>
+            <w:r>
+              <w:rPr>
+                <w:rFonts w:ascii="Calibri" w:cs="Calibri" w:eastAsia="Calibri" w:hAnsi="Calibri"/>
+                <w:b w:val="false"/>
+                <w:bCs w:val="false"/>
+                <w:sz w:val="20"/>
+                <w:szCs w:val="20"/>
+              </w:rPr>
+              <w:t xml:space="preserve">feita</w:t>
+            </w:r>
+          </w:p>
+        </w:tc>
+        <w:tc>
+          <w:tcPr>
+            <w:tcW w:type="dxa" w:w="2022"/>
+            <w:tcBorders>
+              <w:top w:val="single" w:color="B7C4D6" w:sz="4"/>
+              <w:left w:val="single" w:color="B7C4D6" w:sz="4"/>
+              <w:bottom w:val="single" w:color="B7C4D6" w:sz="4"/>
+              <w:right w:val="single" w:color="B7C4D6" w:sz="4"/>
+            </w:tcBorders>
+            <w:tcMar>
+              <w:top w:type="dxa" w:w="60"/>
+              <w:left w:type="dxa" w:w="100"/>
+              <w:bottom w:type="dxa" w:w="60"/>
+              <w:right w:type="dxa" w:w="100"/>
+            </w:tcMar>
+          </w:tcPr>
+          <w:p>
+            <w:r>
+              <w:rPr>
+                <w:rFonts w:ascii="Calibri" w:cs="Calibri" w:eastAsia="Calibri" w:hAnsi="Calibri"/>
+                <w:b w:val="false"/>
+                <w:bCs w:val="false"/>
+                <w:sz w:val="20"/>
+                <w:szCs w:val="20"/>
+              </w:rPr>
+              <w:t xml:space="preserve">entregue</w:t>
+            </w:r>
+          </w:p>
+        </w:tc>
+      </w:tr>
+      <w:tr>
+        <w:trPr>
+          <w:cantSplit/>
+          <w:tblHeader w:val="false"/>
+        </w:trPr>
+        <w:tc>
+          <w:tcPr>
+            <w:tcW w:type="dxa" w:w="2021"/>
+            <w:tcBorders>
+              <w:top w:val="single" w:color="B7C4D6" w:sz="4"/>
+              <w:left w:val="single" w:color="B7C4D6" w:sz="4"/>
+              <w:bottom w:val="single" w:color="B7C4D6" w:sz="4"/>
+              <w:right w:val="single" w:color="B7C4D6" w:sz="4"/>
+            </w:tcBorders>
+            <w:tcMar>
+              <w:top w:type="dxa" w:w="60"/>
+              <w:left w:type="dxa" w:w="100"/>
+              <w:bottom w:type="dxa" w:w="60"/>
+              <w:right w:type="dxa" w:w="100"/>
+            </w:tcMar>
+          </w:tcPr>
+          <w:p>
+            <w:r>
+              <w:rPr>
+                <w:rFonts w:ascii="Calibri" w:cs="Calibri" w:eastAsia="Calibri" w:hAnsi="Calibri"/>
+                <w:b w:val="false"/>
+                <w:bCs w:val="false"/>
+                <w:sz w:val="20"/>
+                <w:szCs w:val="20"/>
+              </w:rPr>
+              <w:t xml:space="preserve">Cancelado</w:t>
+            </w:r>
+          </w:p>
+        </w:tc>
+        <w:tc>
+          <w:tcPr>
+            <w:tcW w:type="dxa" w:w="2021"/>
+            <w:tcBorders>
+              <w:top w:val="single" w:color="B7C4D6" w:sz="4"/>
+              <w:left w:val="single" w:color="B7C4D6" w:sz="4"/>
+              <w:bottom w:val="single" w:color="B7C4D6" w:sz="4"/>
+              <w:right w:val="single" w:color="B7C4D6" w:sz="4"/>
+            </w:tcBorders>
+            <w:tcMar>
+              <w:top w:type="dxa" w:w="60"/>
+              <w:left w:type="dxa" w:w="100"/>
+              <w:bottom w:type="dxa" w:w="60"/>
+              <w:right w:type="dxa" w:w="100"/>
+            </w:tcMar>
+          </w:tcPr>
+          <w:p>
+            <w:r>
+              <w:rPr>
+                <w:rFonts w:ascii="Calibri" w:cs="Calibri" w:eastAsia="Calibri" w:hAnsi="Calibri"/>
+                <w:b w:val="false"/>
+                <w:bCs w:val="false"/>
+                <w:sz w:val="20"/>
+                <w:szCs w:val="20"/>
+              </w:rPr>
+              <w:t xml:space="preserve">não vai acontecer</w:t>
+            </w:r>
+          </w:p>
+        </w:tc>
+        <w:tc>
+          <w:tcPr>
+            <w:tcW w:type="dxa" w:w="2021"/>
+            <w:tcBorders>
+              <w:top w:val="single" w:color="B7C4D6" w:sz="4"/>
+              <w:left w:val="single" w:color="B7C4D6" w:sz="4"/>
+              <w:bottom w:val="single" w:color="B7C4D6" w:sz="4"/>
+              <w:right w:val="single" w:color="B7C4D6" w:sz="4"/>
+            </w:tcBorders>
+            <w:tcMar>
+              <w:top w:type="dxa" w:w="60"/>
+              <w:left w:type="dxa" w:w="100"/>
+              <w:bottom w:type="dxa" w:w="60"/>
+              <w:right w:type="dxa" w:w="100"/>
+            </w:tcMar>
+          </w:tcPr>
+          <w:p>
+            <w:r>
+              <w:rPr>
+                <w:rFonts w:ascii="Calibri" w:cs="Calibri" w:eastAsia="Calibri" w:hAnsi="Calibri"/>
+                <w:b w:val="false"/>
+                <w:bCs w:val="false"/>
+                <w:sz w:val="20"/>
+                <w:szCs w:val="20"/>
+              </w:rPr>
+              <w:t xml:space="preserve">desmarcado</w:t>
+            </w:r>
+          </w:p>
+        </w:tc>
+        <w:tc>
+          <w:tcPr>
+            <w:tcW w:type="dxa" w:w="2021"/>
+            <w:tcBorders>
+              <w:top w:val="single" w:color="B7C4D6" w:sz="4"/>
+              <w:left w:val="single" w:color="B7C4D6" w:sz="4"/>
+              <w:bottom w:val="single" w:color="B7C4D6" w:sz="4"/>
+              <w:right w:val="single" w:color="B7C4D6" w:sz="4"/>
+            </w:tcBorders>
+            <w:tcMar>
+              <w:top w:type="dxa" w:w="60"/>
+              <w:left w:type="dxa" w:w="100"/>
+              <w:bottom w:type="dxa" w:w="60"/>
+              <w:right w:type="dxa" w:w="100"/>
+            </w:tcMar>
+          </w:tcPr>
+          <w:p>
+            <w:r>
+              <w:rPr>
+                <w:rFonts w:ascii="Calibri" w:cs="Calibri" w:eastAsia="Calibri" w:hAnsi="Calibri"/>
+                <w:b w:val="false"/>
+                <w:bCs w:val="false"/>
+                <w:sz w:val="20"/>
+                <w:szCs w:val="20"/>
+              </w:rPr>
+              <w:t xml:space="preserve">desistida</w:t>
+            </w:r>
+          </w:p>
+        </w:tc>
+        <w:tc>
+          <w:tcPr>
+            <w:tcW w:type="dxa" w:w="2022"/>
+            <w:tcBorders>
+              <w:top w:val="single" w:color="B7C4D6" w:sz="4"/>
+              <w:left w:val="single" w:color="B7C4D6" w:sz="4"/>
+              <w:bottom w:val="single" w:color="B7C4D6" w:sz="4"/>
+              <w:right w:val="single" w:color="B7C4D6" w:sz="4"/>
+            </w:tcBorders>
+            <w:tcMar>
+              <w:top w:type="dxa" w:w="60"/>
+              <w:left w:type="dxa" w:w="100"/>
+              <w:bottom w:type="dxa" w:w="60"/>
+              <w:right w:type="dxa" w:w="100"/>
+            </w:tcMar>
+          </w:tcPr>
+          <w:p>
+            <w:r>
+              <w:rPr>
+                <w:rFonts w:ascii="Calibri" w:cs="Calibri" w:eastAsia="Calibri" w:hAnsi="Calibri"/>
+                <w:b w:val="false"/>
+                <w:bCs w:val="false"/>
+                <w:sz w:val="20"/>
+                <w:szCs w:val="20"/>
+              </w:rPr>
+              <w:t xml:space="preserve">cancelado</w:t>
+            </w:r>
+          </w:p>
+        </w:tc>
+      </w:tr>
+    </w:tbl>
+    <w:p>
+      <w:pPr>
+        <w:spacing w:after="60"/>
+      </w:pPr>
+    </w:p>
+    <w:p>
+      <w:pPr>
+        <w:pBdr>
+          <w:left w:val="single" w:color="7B3F00" w:sz="12" w:space="8"/>
+        </w:pBdr>
+        <w:spacing w:before="80" w:after="80"/>
+        <w:ind w:left="360"/>
+      </w:pPr>
+      <w:r>
+        <w:rPr>
+          <w:rFonts w:ascii="Calibri" w:cs="Calibri" w:eastAsia="Calibri" w:hAnsi="Calibri"/>
+          <w:b/>
+          <w:bCs/>
+          <w:color w:val="7B3F00"/>
+          <w:sz w:val="21"/>
+          <w:szCs w:val="21"/>
+        </w:rPr>
+        <w:t xml:space="preserve">NOTA: </w:t>
+      </w:r>
+      <w:r>
+        <w:rPr>
+          <w:rFonts w:ascii="Calibri" w:cs="Calibri" w:eastAsia="Calibri" w:hAnsi="Calibri"/>
+          <w:sz w:val="21"/>
+          <w:szCs w:val="21"/>
+        </w:rPr>
+        <w:t xml:space="preserve">Remarcar não é uma situação: o memo continua Ativo e a mudança de data ou hora fica no registro de alterações.</w:t>
+      </w:r>
+    </w:p>
+    <w:p>
+      <w:pPr>
         <w:pStyle w:val="ListParagraph"/>
         <w:numPr>
           <w:ilvl w:val="0"/>
@@ -26639,7 +27636,7 @@
         <w:pStyle w:val="ListParagraph"/>
         <w:numPr>
           <w:ilvl w:val="0"/>
-          <w:numId w:val="14"/>
+          <w:numId w:val="15"/>
         </w:numPr>
         <w:spacing w:after="60"/>
       </w:pPr>
@@ -26657,7 +27654,7 @@
         <w:pStyle w:val="ListParagraph"/>
         <w:numPr>
           <w:ilvl w:val="0"/>
-          <w:numId w:val="14"/>
+          <w:numId w:val="15"/>
         </w:numPr>
         <w:spacing w:after="60"/>
       </w:pPr>
@@ -26675,7 +27672,7 @@
         <w:pStyle w:val="ListParagraph"/>
         <w:numPr>
           <w:ilvl w:val="0"/>
-          <w:numId w:val="14"/>
+          <w:numId w:val="15"/>
         </w:numPr>
         <w:spacing w:after="60"/>
       </w:pPr>
@@ -32910,7 +33907,7 @@
         <w:pStyle w:val="ListParagraph"/>
         <w:numPr>
           <w:ilvl w:val="0"/>
-          <w:numId w:val="15"/>
+          <w:numId w:val="16"/>
         </w:numPr>
         <w:spacing w:after="60"/>
       </w:pPr>
@@ -32928,7 +33925,7 @@
         <w:pStyle w:val="ListParagraph"/>
         <w:numPr>
           <w:ilvl w:val="0"/>
-          <w:numId w:val="15"/>
+          <w:numId w:val="16"/>
         </w:numPr>
         <w:spacing w:after="60"/>
       </w:pPr>
@@ -32946,7 +33943,7 @@
         <w:pStyle w:val="ListParagraph"/>
         <w:numPr>
           <w:ilvl w:val="0"/>
-          <w:numId w:val="15"/>
+          <w:numId w:val="16"/>
         </w:numPr>
         <w:spacing w:after="60"/>
       </w:pPr>
@@ -32964,7 +33961,7 @@
         <w:pStyle w:val="ListParagraph"/>
         <w:numPr>
           <w:ilvl w:val="0"/>
-          <w:numId w:val="15"/>
+          <w:numId w:val="16"/>
         </w:numPr>
         <w:spacing w:after="60"/>
       </w:pPr>
@@ -32982,7 +33979,7 @@
         <w:pStyle w:val="ListParagraph"/>
         <w:numPr>
           <w:ilvl w:val="0"/>
-          <w:numId w:val="15"/>
+          <w:numId w:val="16"/>
         </w:numPr>
         <w:spacing w:after="60"/>
       </w:pPr>
@@ -34275,7 +35272,7 @@
         <w:pStyle w:val="ListParagraph"/>
         <w:numPr>
           <w:ilvl w:val="0"/>
-          <w:numId w:val="16"/>
+          <w:numId w:val="17"/>
         </w:numPr>
         <w:spacing w:after="60"/>
       </w:pPr>
@@ -34286,54 +35283,6 @@
           <w:szCs w:val="21"/>
         </w:rPr>
         <w:t xml:space="preserve">Na Estrutura do contexto, criar a categoria de destino (ex.: "Manual MyMemory") no grupo ou como global.</w:t>
-      </w:r>
-    </w:p>
-    <w:p>
-      <w:pPr>
-        <w:pStyle w:val="ListParagraph"/>
-        <w:numPr>
-          <w:ilvl w:val="0"/>
-          <w:numId w:val="16"/>
-        </w:numPr>
-        <w:spacing w:after="60"/>
-      </w:pPr>
-      <w:r>
-        <w:rPr>
-          <w:rFonts w:ascii="Calibri" w:cs="Calibri" w:eastAsia="Calibri" w:hAnsi="Calibri"/>
-          <w:sz w:val="21"/>
-          <w:szCs w:val="21"/>
-        </w:rPr>
-        <w:t xml:space="preserve">Criar nela os campos Seção, Tela, Rota, Perfil, Tipo e Versão. Os nomes são casados com ou sem acento ("Secao" = "Seção").</w:t>
-      </w:r>
-    </w:p>
-    <w:p>
-      <w:pPr>
-        <w:pStyle w:val="ListParagraph"/>
-        <w:numPr>
-          <w:ilvl w:val="0"/>
-          <w:numId w:val="16"/>
-        </w:numPr>
-        <w:spacing w:after="60"/>
-      </w:pPr>
-      <w:r>
-        <w:rPr>
-          <w:rFonts w:ascii="Calibri" w:cs="Calibri" w:eastAsia="Calibri" w:hAnsi="Calibri"/>
-          <w:sz w:val="21"/>
-          <w:szCs w:val="21"/>
-        </w:rPr>
-        <w:t xml:space="preserve">Ter o arquivo .jsonl com um trecho por linha (campos obrigatórios: id e texto).</w:t>
-      </w:r>
-    </w:p>
-    <w:p>
-      <w:pPr>
-        <w:pStyle w:val="Heading2"/>
-        <w:keepNext/>
-      </w:pPr>
-      <w:r>
-        <w:rPr>
-          <w:rFonts w:ascii="Calibri" w:cs="Calibri" w:eastAsia="Calibri" w:hAnsi="Calibri"/>
-        </w:rPr>
-        <w:t xml:space="preserve">Como importar</w:t>
       </w:r>
     </w:p>
     <w:p>
@@ -34351,7 +35300,7 @@
           <w:sz w:val="21"/>
           <w:szCs w:val="21"/>
         </w:rPr>
-        <w:t xml:space="preserve">Abrir Admin → Importar conhecimento.</w:t>
+        <w:t xml:space="preserve">Criar nela os campos Seção, Tela, Rota, Perfil, Tipo e Versão. Os nomes são casados com ou sem acento ("Secao" = "Seção").</w:t>
       </w:r>
     </w:p>
     <w:p>
@@ -34369,7 +35318,19 @@
           <w:sz w:val="21"/>
           <w:szCs w:val="21"/>
         </w:rPr>
-        <w:t xml:space="preserve">Escolher o grupo que vai consultar o conhecimento.</w:t>
+        <w:t xml:space="preserve">Ter o arquivo .jsonl com um trecho por linha (campos obrigatórios: id e texto).</w:t>
+      </w:r>
+    </w:p>
+    <w:p>
+      <w:pPr>
+        <w:pStyle w:val="Heading2"/>
+        <w:keepNext/>
+      </w:pPr>
+      <w:r>
+        <w:rPr>
+          <w:rFonts w:ascii="Calibri" w:cs="Calibri" w:eastAsia="Calibri" w:hAnsi="Calibri"/>
+        </w:rPr>
+        <w:t xml:space="preserve">Como importar</w:t>
       </w:r>
     </w:p>
     <w:p>
@@ -34377,7 +35338,7 @@
         <w:pStyle w:val="ListParagraph"/>
         <w:numPr>
           <w:ilvl w:val="0"/>
-          <w:numId w:val="17"/>
+          <w:numId w:val="18"/>
         </w:numPr>
         <w:spacing w:after="60"/>
       </w:pPr>
@@ -34387,7 +35348,7 @@
           <w:sz w:val="21"/>
           <w:szCs w:val="21"/>
         </w:rPr>
-        <w:t xml:space="preserve">Escolher a categoria (as globais aparecem com "(global)"). Uma categoria com "manual" no nome é pré-selecionada.</w:t>
+        <w:t xml:space="preserve">Abrir Admin → Importar conhecimento.</w:t>
       </w:r>
     </w:p>
     <w:p>
@@ -34395,7 +35356,7 @@
         <w:pStyle w:val="ListParagraph"/>
         <w:numPr>
           <w:ilvl w:val="0"/>
-          <w:numId w:val="17"/>
+          <w:numId w:val="18"/>
         </w:numPr>
         <w:spacing w:after="60"/>
       </w:pPr>
@@ -34405,7 +35366,7 @@
           <w:sz w:val="21"/>
           <w:szCs w:val="21"/>
         </w:rPr>
-        <w:t xml:space="preserve">Escolher o arquivo .jsonl. A tela mostra quantos trechos foram lidos.</w:t>
+        <w:t xml:space="preserve">Escolher o grupo que vai consultar o conhecimento.</w:t>
       </w:r>
     </w:p>
     <w:p>
@@ -34413,7 +35374,7 @@
         <w:pStyle w:val="ListParagraph"/>
         <w:numPr>
           <w:ilvl w:val="0"/>
-          <w:numId w:val="17"/>
+          <w:numId w:val="18"/>
         </w:numPr>
         <w:spacing w:after="60"/>
       </w:pPr>
@@ -34423,7 +35384,7 @@
           <w:sz w:val="21"/>
           <w:szCs w:val="21"/>
         </w:rPr>
-        <w:t xml:space="preserve">Manter marcado "Substituir os trechos importados antes nesta categoria" para trocar a versão anterior.</w:t>
+        <w:t xml:space="preserve">Escolher a categoria (as globais aparecem com "(global)"). Uma categoria com "manual" no nome é pré-selecionada.</w:t>
       </w:r>
     </w:p>
     <w:p>
@@ -34431,7 +35392,43 @@
         <w:pStyle w:val="ListParagraph"/>
         <w:numPr>
           <w:ilvl w:val="0"/>
-          <w:numId w:val="17"/>
+          <w:numId w:val="18"/>
+        </w:numPr>
+        <w:spacing w:after="60"/>
+      </w:pPr>
+      <w:r>
+        <w:rPr>
+          <w:rFonts w:ascii="Calibri" w:cs="Calibri" w:eastAsia="Calibri" w:hAnsi="Calibri"/>
+          <w:sz w:val="21"/>
+          <w:szCs w:val="21"/>
+        </w:rPr>
+        <w:t xml:space="preserve">Escolher o arquivo .jsonl. A tela mostra quantos trechos foram lidos.</w:t>
+      </w:r>
+    </w:p>
+    <w:p>
+      <w:pPr>
+        <w:pStyle w:val="ListParagraph"/>
+        <w:numPr>
+          <w:ilvl w:val="0"/>
+          <w:numId w:val="18"/>
+        </w:numPr>
+        <w:spacing w:after="60"/>
+      </w:pPr>
+      <w:r>
+        <w:rPr>
+          <w:rFonts w:ascii="Calibri" w:cs="Calibri" w:eastAsia="Calibri" w:hAnsi="Calibri"/>
+          <w:sz w:val="21"/>
+          <w:szCs w:val="21"/>
+        </w:rPr>
+        <w:t xml:space="preserve">Manter marcado "Substituir os trechos importados antes nesta categoria" para trocar a versão anterior.</w:t>
+      </w:r>
+    </w:p>
+    <w:p>
+      <w:pPr>
+        <w:pStyle w:val="ListParagraph"/>
+        <w:numPr>
+          <w:ilvl w:val="0"/>
+          <w:numId w:val="18"/>
         </w:numPr>
         <w:spacing w:after="60"/>
       </w:pPr>
@@ -40066,7 +41063,7 @@
         <w:pStyle w:val="ListParagraph"/>
         <w:numPr>
           <w:ilvl w:val="0"/>
-          <w:numId w:val="18"/>
+          <w:numId w:val="19"/>
         </w:numPr>
         <w:spacing w:after="60"/>
       </w:pPr>
@@ -40084,7 +41081,7 @@
         <w:pStyle w:val="ListParagraph"/>
         <w:numPr>
           <w:ilvl w:val="0"/>
-          <w:numId w:val="18"/>
+          <w:numId w:val="19"/>
         </w:numPr>
         <w:spacing w:after="60"/>
       </w:pPr>
@@ -40102,7 +41099,7 @@
         <w:pStyle w:val="ListParagraph"/>
         <w:numPr>
           <w:ilvl w:val="0"/>
-          <w:numId w:val="18"/>
+          <w:numId w:val="19"/>
         </w:numPr>
         <w:spacing w:after="60"/>
       </w:pPr>
@@ -40120,7 +41117,7 @@
         <w:pStyle w:val="ListParagraph"/>
         <w:numPr>
           <w:ilvl w:val="0"/>
-          <w:numId w:val="18"/>
+          <w:numId w:val="19"/>
         </w:numPr>
         <w:spacing w:after="60"/>
       </w:pPr>
@@ -40138,7 +41135,7 @@
         <w:pStyle w:val="ListParagraph"/>
         <w:numPr>
           <w:ilvl w:val="0"/>
-          <w:numId w:val="18"/>
+          <w:numId w:val="19"/>
         </w:numPr>
         <w:spacing w:after="60"/>
       </w:pPr>
@@ -40481,6 +41478,12 @@
     </w:lvlOverride>
   </w:num>
   <w:num w:numId="18">
+    <w:abstractNumId w:val="3"/>
+    <w:lvlOverride w:ilvl="0">
+      <w:startOverride w:val="1"/>
+    </w:lvlOverride>
+  </w:num>
+  <w:num w:numId="19">
     <w:abstractNumId w:val="3"/>
     <w:lvlOverride w:ilvl="0">
       <w:startOverride w:val="1"/>

</xml_diff>

<commit_message>
feat(perguntas): calendário de períodos relativos calculado no horário de Brasília (semana seg–dom, 'semana que vem' = 'próxima semana', 'próxima sexta' numa sexta = semana seguinte)
Co-Authored-By: Claude Opus 5.5 <noreply@anthropic.com>
</commit_message>
<xml_diff>
--- a/MyMemory_Manual_Operacional_v2.docx
+++ b/MyMemory_Manual_Operacional_v2.docx
@@ -2501,6 +2501,70 @@
                 <w:sz w:val="20"/>
                 <w:szCs w:val="20"/>
               </w:rPr>
+              <w:t xml:space="preserve">Períodos relativos ("semana que vem", "próxima sexta", "fim de semana"…) calculados pelo sistema no horário de Brasília</w:t>
+            </w:r>
+          </w:p>
+        </w:tc>
+        <w:tc>
+          <w:tcPr>
+            <w:tcW w:type="dxa" w:w="7075"/>
+            <w:tcBorders>
+              <w:top w:val="single" w:color="B7C4D6" w:sz="4"/>
+              <w:left w:val="single" w:color="B7C4D6" w:sz="4"/>
+              <w:bottom w:val="single" w:color="B7C4D6" w:sz="4"/>
+              <w:right w:val="single" w:color="B7C4D6" w:sz="4"/>
+            </w:tcBorders>
+            <w:tcMar>
+              <w:top w:type="dxa" w:w="60"/>
+              <w:left w:type="dxa" w:w="100"/>
+              <w:bottom w:type="dxa" w:w="60"/>
+              <w:right w:type="dxa" w:w="100"/>
+            </w:tcMar>
+          </w:tcPr>
+          <w:p>
+            <w:r>
+              <w:rPr>
+                <w:rFonts w:ascii="Calibri" w:cs="Calibri" w:eastAsia="Calibri" w:hAnsi="Calibri"/>
+                <w:b w:val="false"/>
+                <w:bCs w:val="false"/>
+                <w:sz w:val="20"/>
+                <w:szCs w:val="20"/>
+              </w:rPr>
+              <w:t xml:space="preserve">Seção 8</w:t>
+            </w:r>
+          </w:p>
+        </w:tc>
+      </w:tr>
+      <w:tr>
+        <w:trPr>
+          <w:cantSplit/>
+          <w:tblHeader w:val="false"/>
+        </w:trPr>
+        <w:tc>
+          <w:tcPr>
+            <w:tcW w:type="dxa" w:w="3031"/>
+            <w:tcBorders>
+              <w:top w:val="single" w:color="B7C4D6" w:sz="4"/>
+              <w:left w:val="single" w:color="B7C4D6" w:sz="4"/>
+              <w:bottom w:val="single" w:color="B7C4D6" w:sz="4"/>
+              <w:right w:val="single" w:color="B7C4D6" w:sz="4"/>
+            </w:tcBorders>
+            <w:tcMar>
+              <w:top w:type="dxa" w:w="60"/>
+              <w:left w:type="dxa" w:w="100"/>
+              <w:bottom w:type="dxa" w:w="60"/>
+              <w:right w:type="dxa" w:w="100"/>
+            </w:tcMar>
+          </w:tcPr>
+          <w:p>
+            <w:r>
+              <w:rPr>
+                <w:rFonts w:ascii="Calibri" w:cs="Calibri" w:eastAsia="Calibri" w:hAnsi="Calibri"/>
+                <w:b/>
+                <w:bCs/>
+                <w:sz w:val="20"/>
+                <w:szCs w:val="20"/>
+              </w:rPr>
               <w:t xml:space="preserve">Autenticação por chave de API para integrações externas (ex.: Softing-erp) com contexto da tela</w:t>
             </w:r>
           </w:p>
@@ -9845,6 +9909,1297 @@
           <w:szCs w:val="21"/>
         </w:rPr>
         <w:t xml:space="preserve">Ao testar várias vezes a mesma pergunta, use "Nova sessão": respostas anteriores erradas no histórico podem influenciar o planejamento.</w:t>
+      </w:r>
+    </w:p>
+    <w:p>
+      <w:pPr>
+        <w:pStyle w:val="Heading2"/>
+        <w:keepNext/>
+      </w:pPr>
+      <w:r>
+        <w:rPr>
+          <w:rFonts w:ascii="Calibri" w:cs="Calibri" w:eastAsia="Calibri" w:hAnsi="Calibri"/>
+        </w:rPr>
+        <w:t xml:space="preserve">Períodos relativos</w:t>
+      </w:r>
+    </w:p>
+    <w:p>
+      <w:pPr>
+        <w:spacing w:after="120"/>
+      </w:pPr>
+      <w:r>
+        <w:rPr>
+          <w:rFonts w:ascii="Calibri" w:cs="Calibri" w:eastAsia="Calibri" w:hAnsi="Calibri"/>
+          <w:sz w:val="21"/>
+          <w:szCs w:val="21"/>
+        </w:rPr>
+        <w:t xml:space="preserve">Expressões de tempo na pergunta são calculadas pelo sistema, no horário de Brasília, e enviadas prontas à IA — a pergunta não é reescrita. A semana vai de segunda a domingo. Exemplo com hoje = segunda-feira, 26/10/2026:</w:t>
+      </w:r>
+    </w:p>
+    <w:tbl>
+      <w:tblPr>
+        <w:tblW w:type="dxa" w:w="10106"/>
+        <w:tblBorders>
+          <w:top w:val="single" w:color="auto" w:sz="4"/>
+          <w:left w:val="single" w:color="auto" w:sz="4"/>
+          <w:bottom w:val="single" w:color="auto" w:sz="4"/>
+          <w:right w:val="single" w:color="auto" w:sz="4"/>
+          <w:insideH w:val="single" w:color="auto" w:sz="4"/>
+          <w:insideV w:val="single" w:color="auto" w:sz="4"/>
+        </w:tblBorders>
+      </w:tblPr>
+      <w:tblGrid>
+        <w:gridCol w:w="2526"/>
+        <w:gridCol w:w="3537"/>
+        <w:gridCol w:w="4043"/>
+      </w:tblGrid>
+      <w:tr>
+        <w:trPr>
+          <w:cantSplit/>
+          <w:tblHeader/>
+        </w:trPr>
+        <w:tc>
+          <w:tcPr>
+            <w:tcW w:type="dxa" w:w="2526"/>
+            <w:tcBorders>
+              <w:top w:val="single" w:color="B7C4D6" w:sz="4"/>
+              <w:left w:val="single" w:color="B7C4D6" w:sz="4"/>
+              <w:bottom w:val="single" w:color="B7C4D6" w:sz="4"/>
+              <w:right w:val="single" w:color="B7C4D6" w:sz="4"/>
+            </w:tcBorders>
+            <w:shd w:fill="D0E4FF" w:color="auto" w:val="clear"/>
+            <w:tcMar>
+              <w:top w:type="dxa" w:w="60"/>
+              <w:left w:type="dxa" w:w="100"/>
+              <w:bottom w:type="dxa" w:w="60"/>
+              <w:right w:type="dxa" w:w="100"/>
+            </w:tcMar>
+          </w:tcPr>
+          <w:p>
+            <w:r>
+              <w:rPr>
+                <w:rFonts w:ascii="Calibri" w:cs="Calibri" w:eastAsia="Calibri" w:hAnsi="Calibri"/>
+                <w:b/>
+                <w:bCs/>
+                <w:color w:val="1E3A5F"/>
+                <w:sz w:val="20"/>
+                <w:szCs w:val="20"/>
+              </w:rPr>
+              <w:t xml:space="preserve">Expressão</w:t>
+            </w:r>
+          </w:p>
+        </w:tc>
+        <w:tc>
+          <w:tcPr>
+            <w:tcW w:type="dxa" w:w="3537"/>
+            <w:tcBorders>
+              <w:top w:val="single" w:color="B7C4D6" w:sz="4"/>
+              <w:left w:val="single" w:color="B7C4D6" w:sz="4"/>
+              <w:bottom w:val="single" w:color="B7C4D6" w:sz="4"/>
+              <w:right w:val="single" w:color="B7C4D6" w:sz="4"/>
+            </w:tcBorders>
+            <w:shd w:fill="D0E4FF" w:color="auto" w:val="clear"/>
+            <w:tcMar>
+              <w:top w:type="dxa" w:w="60"/>
+              <w:left w:type="dxa" w:w="100"/>
+              <w:bottom w:type="dxa" w:w="60"/>
+              <w:right w:type="dxa" w:w="100"/>
+            </w:tcMar>
+          </w:tcPr>
+          <w:p>
+            <w:r>
+              <w:rPr>
+                <w:rFonts w:ascii="Calibri" w:cs="Calibri" w:eastAsia="Calibri" w:hAnsi="Calibri"/>
+                <w:b/>
+                <w:bCs/>
+                <w:color w:val="1E3A5F"/>
+                <w:sz w:val="20"/>
+                <w:szCs w:val="20"/>
+              </w:rPr>
+              <w:t xml:space="preserve">Período</w:t>
+            </w:r>
+          </w:p>
+        </w:tc>
+        <w:tc>
+          <w:tcPr>
+            <w:tcW w:type="dxa" w:w="4043"/>
+            <w:tcBorders>
+              <w:top w:val="single" w:color="B7C4D6" w:sz="4"/>
+              <w:left w:val="single" w:color="B7C4D6" w:sz="4"/>
+              <w:bottom w:val="single" w:color="B7C4D6" w:sz="4"/>
+              <w:right w:val="single" w:color="B7C4D6" w:sz="4"/>
+            </w:tcBorders>
+            <w:shd w:fill="D0E4FF" w:color="auto" w:val="clear"/>
+            <w:tcMar>
+              <w:top w:type="dxa" w:w="60"/>
+              <w:left w:type="dxa" w:w="100"/>
+              <w:bottom w:type="dxa" w:w="60"/>
+              <w:right w:type="dxa" w:w="100"/>
+            </w:tcMar>
+          </w:tcPr>
+          <w:p>
+            <w:r>
+              <w:rPr>
+                <w:rFonts w:ascii="Calibri" w:cs="Calibri" w:eastAsia="Calibri" w:hAnsi="Calibri"/>
+                <w:b/>
+                <w:bCs/>
+                <w:color w:val="1E3A5F"/>
+                <w:sz w:val="20"/>
+                <w:szCs w:val="20"/>
+              </w:rPr>
+              <w:t xml:space="preserve">Exemplo</w:t>
+            </w:r>
+          </w:p>
+        </w:tc>
+      </w:tr>
+      <w:tr>
+        <w:trPr>
+          <w:cantSplit/>
+          <w:tblHeader w:val="false"/>
+        </w:trPr>
+        <w:tc>
+          <w:tcPr>
+            <w:tcW w:type="dxa" w:w="2526"/>
+            <w:tcBorders>
+              <w:top w:val="single" w:color="B7C4D6" w:sz="4"/>
+              <w:left w:val="single" w:color="B7C4D6" w:sz="4"/>
+              <w:bottom w:val="single" w:color="B7C4D6" w:sz="4"/>
+              <w:right w:val="single" w:color="B7C4D6" w:sz="4"/>
+            </w:tcBorders>
+            <w:tcMar>
+              <w:top w:type="dxa" w:w="60"/>
+              <w:left w:type="dxa" w:w="100"/>
+              <w:bottom w:type="dxa" w:w="60"/>
+              <w:right w:type="dxa" w:w="100"/>
+            </w:tcMar>
+          </w:tcPr>
+          <w:p>
+            <w:r>
+              <w:rPr>
+                <w:rFonts w:ascii="Calibri" w:cs="Calibri" w:eastAsia="Calibri" w:hAnsi="Calibri"/>
+                <w:b w:val="false"/>
+                <w:bCs w:val="false"/>
+                <w:sz w:val="20"/>
+                <w:szCs w:val="20"/>
+              </w:rPr>
+              <w:t xml:space="preserve">hoje / amanhã / depois de amanhã / ontem</w:t>
+            </w:r>
+          </w:p>
+        </w:tc>
+        <w:tc>
+          <w:tcPr>
+            <w:tcW w:type="dxa" w:w="3537"/>
+            <w:tcBorders>
+              <w:top w:val="single" w:color="B7C4D6" w:sz="4"/>
+              <w:left w:val="single" w:color="B7C4D6" w:sz="4"/>
+              <w:bottom w:val="single" w:color="B7C4D6" w:sz="4"/>
+              <w:right w:val="single" w:color="B7C4D6" w:sz="4"/>
+            </w:tcBorders>
+            <w:tcMar>
+              <w:top w:type="dxa" w:w="60"/>
+              <w:left w:type="dxa" w:w="100"/>
+              <w:bottom w:type="dxa" w:w="60"/>
+              <w:right w:type="dxa" w:w="100"/>
+            </w:tcMar>
+          </w:tcPr>
+          <w:p>
+            <w:r>
+              <w:rPr>
+                <w:rFonts w:ascii="Calibri" w:cs="Calibri" w:eastAsia="Calibri" w:hAnsi="Calibri"/>
+                <w:b w:val="false"/>
+                <w:bCs w:val="false"/>
+                <w:sz w:val="20"/>
+                <w:szCs w:val="20"/>
+              </w:rPr>
+              <w:t xml:space="preserve">o dia</w:t>
+            </w:r>
+          </w:p>
+        </w:tc>
+        <w:tc>
+          <w:tcPr>
+            <w:tcW w:type="dxa" w:w="4043"/>
+            <w:tcBorders>
+              <w:top w:val="single" w:color="B7C4D6" w:sz="4"/>
+              <w:left w:val="single" w:color="B7C4D6" w:sz="4"/>
+              <w:bottom w:val="single" w:color="B7C4D6" w:sz="4"/>
+              <w:right w:val="single" w:color="B7C4D6" w:sz="4"/>
+            </w:tcBorders>
+            <w:tcMar>
+              <w:top w:type="dxa" w:w="60"/>
+              <w:left w:type="dxa" w:w="100"/>
+              <w:bottom w:type="dxa" w:w="60"/>
+              <w:right w:type="dxa" w:w="100"/>
+            </w:tcMar>
+          </w:tcPr>
+          <w:p>
+            <w:r>
+              <w:rPr>
+                <w:rFonts w:ascii="Calibri" w:cs="Calibri" w:eastAsia="Calibri" w:hAnsi="Calibri"/>
+                <w:b w:val="false"/>
+                <w:bCs w:val="false"/>
+                <w:sz w:val="20"/>
+                <w:szCs w:val="20"/>
+              </w:rPr>
+              <w:t xml:space="preserve">26/10 · 27/10 · 28/10 · 25/10</w:t>
+            </w:r>
+          </w:p>
+        </w:tc>
+      </w:tr>
+      <w:tr>
+        <w:trPr>
+          <w:cantSplit/>
+          <w:tblHeader w:val="false"/>
+        </w:trPr>
+        <w:tc>
+          <w:tcPr>
+            <w:tcW w:type="dxa" w:w="2526"/>
+            <w:tcBorders>
+              <w:top w:val="single" w:color="B7C4D6" w:sz="4"/>
+              <w:left w:val="single" w:color="B7C4D6" w:sz="4"/>
+              <w:bottom w:val="single" w:color="B7C4D6" w:sz="4"/>
+              <w:right w:val="single" w:color="B7C4D6" w:sz="4"/>
+            </w:tcBorders>
+            <w:tcMar>
+              <w:top w:type="dxa" w:w="60"/>
+              <w:left w:type="dxa" w:w="100"/>
+              <w:bottom w:type="dxa" w:w="60"/>
+              <w:right w:type="dxa" w:w="100"/>
+            </w:tcMar>
+          </w:tcPr>
+          <w:p>
+            <w:r>
+              <w:rPr>
+                <w:rFonts w:ascii="Calibri" w:cs="Calibri" w:eastAsia="Calibri" w:hAnsi="Calibri"/>
+                <w:b w:val="false"/>
+                <w:bCs w:val="false"/>
+                <w:sz w:val="20"/>
+                <w:szCs w:val="20"/>
+              </w:rPr>
+              <w:t xml:space="preserve">esta semana</w:t>
+            </w:r>
+          </w:p>
+        </w:tc>
+        <w:tc>
+          <w:tcPr>
+            <w:tcW w:type="dxa" w:w="3537"/>
+            <w:tcBorders>
+              <w:top w:val="single" w:color="B7C4D6" w:sz="4"/>
+              <w:left w:val="single" w:color="B7C4D6" w:sz="4"/>
+              <w:bottom w:val="single" w:color="B7C4D6" w:sz="4"/>
+              <w:right w:val="single" w:color="B7C4D6" w:sz="4"/>
+            </w:tcBorders>
+            <w:tcMar>
+              <w:top w:type="dxa" w:w="60"/>
+              <w:left w:type="dxa" w:w="100"/>
+              <w:bottom w:type="dxa" w:w="60"/>
+              <w:right w:type="dxa" w:w="100"/>
+            </w:tcMar>
+          </w:tcPr>
+          <w:p>
+            <w:r>
+              <w:rPr>
+                <w:rFonts w:ascii="Calibri" w:cs="Calibri" w:eastAsia="Calibri" w:hAnsi="Calibri"/>
+                <w:b w:val="false"/>
+                <w:bCs w:val="false"/>
+                <w:sz w:val="20"/>
+                <w:szCs w:val="20"/>
+              </w:rPr>
+              <w:t xml:space="preserve">de hoje até domingo</w:t>
+            </w:r>
+          </w:p>
+        </w:tc>
+        <w:tc>
+          <w:tcPr>
+            <w:tcW w:type="dxa" w:w="4043"/>
+            <w:tcBorders>
+              <w:top w:val="single" w:color="B7C4D6" w:sz="4"/>
+              <w:left w:val="single" w:color="B7C4D6" w:sz="4"/>
+              <w:bottom w:val="single" w:color="B7C4D6" w:sz="4"/>
+              <w:right w:val="single" w:color="B7C4D6" w:sz="4"/>
+            </w:tcBorders>
+            <w:tcMar>
+              <w:top w:type="dxa" w:w="60"/>
+              <w:left w:type="dxa" w:w="100"/>
+              <w:bottom w:type="dxa" w:w="60"/>
+              <w:right w:type="dxa" w:w="100"/>
+            </w:tcMar>
+          </w:tcPr>
+          <w:p>
+            <w:r>
+              <w:rPr>
+                <w:rFonts w:ascii="Calibri" w:cs="Calibri" w:eastAsia="Calibri" w:hAnsi="Calibri"/>
+                <w:b w:val="false"/>
+                <w:bCs w:val="false"/>
+                <w:sz w:val="20"/>
+                <w:szCs w:val="20"/>
+              </w:rPr>
+              <w:t xml:space="preserve">26/10 a 01/11</w:t>
+            </w:r>
+          </w:p>
+        </w:tc>
+      </w:tr>
+      <w:tr>
+        <w:trPr>
+          <w:cantSplit/>
+          <w:tblHeader w:val="false"/>
+        </w:trPr>
+        <w:tc>
+          <w:tcPr>
+            <w:tcW w:type="dxa" w:w="2526"/>
+            <w:tcBorders>
+              <w:top w:val="single" w:color="B7C4D6" w:sz="4"/>
+              <w:left w:val="single" w:color="B7C4D6" w:sz="4"/>
+              <w:bottom w:val="single" w:color="B7C4D6" w:sz="4"/>
+              <w:right w:val="single" w:color="B7C4D6" w:sz="4"/>
+            </w:tcBorders>
+            <w:tcMar>
+              <w:top w:type="dxa" w:w="60"/>
+              <w:left w:type="dxa" w:w="100"/>
+              <w:bottom w:type="dxa" w:w="60"/>
+              <w:right w:type="dxa" w:w="100"/>
+            </w:tcMar>
+          </w:tcPr>
+          <w:p>
+            <w:r>
+              <w:rPr>
+                <w:rFonts w:ascii="Calibri" w:cs="Calibri" w:eastAsia="Calibri" w:hAnsi="Calibri"/>
+                <w:b w:val="false"/>
+                <w:bCs w:val="false"/>
+                <w:sz w:val="20"/>
+                <w:szCs w:val="20"/>
+              </w:rPr>
+              <w:t xml:space="preserve">semana que vem = próxima semana</w:t>
+            </w:r>
+          </w:p>
+        </w:tc>
+        <w:tc>
+          <w:tcPr>
+            <w:tcW w:type="dxa" w:w="3537"/>
+            <w:tcBorders>
+              <w:top w:val="single" w:color="B7C4D6" w:sz="4"/>
+              <w:left w:val="single" w:color="B7C4D6" w:sz="4"/>
+              <w:bottom w:val="single" w:color="B7C4D6" w:sz="4"/>
+              <w:right w:val="single" w:color="B7C4D6" w:sz="4"/>
+            </w:tcBorders>
+            <w:tcMar>
+              <w:top w:type="dxa" w:w="60"/>
+              <w:left w:type="dxa" w:w="100"/>
+              <w:bottom w:type="dxa" w:w="60"/>
+              <w:right w:type="dxa" w:w="100"/>
+            </w:tcMar>
+          </w:tcPr>
+          <w:p>
+            <w:r>
+              <w:rPr>
+                <w:rFonts w:ascii="Calibri" w:cs="Calibri" w:eastAsia="Calibri" w:hAnsi="Calibri"/>
+                <w:b w:val="false"/>
+                <w:bCs w:val="false"/>
+                <w:sz w:val="20"/>
+                <w:szCs w:val="20"/>
+              </w:rPr>
+              <w:t xml:space="preserve">segunda a domingo seguintes</w:t>
+            </w:r>
+          </w:p>
+        </w:tc>
+        <w:tc>
+          <w:tcPr>
+            <w:tcW w:type="dxa" w:w="4043"/>
+            <w:tcBorders>
+              <w:top w:val="single" w:color="B7C4D6" w:sz="4"/>
+              <w:left w:val="single" w:color="B7C4D6" w:sz="4"/>
+              <w:bottom w:val="single" w:color="B7C4D6" w:sz="4"/>
+              <w:right w:val="single" w:color="B7C4D6" w:sz="4"/>
+            </w:tcBorders>
+            <w:tcMar>
+              <w:top w:type="dxa" w:w="60"/>
+              <w:left w:type="dxa" w:w="100"/>
+              <w:bottom w:type="dxa" w:w="60"/>
+              <w:right w:type="dxa" w:w="100"/>
+            </w:tcMar>
+          </w:tcPr>
+          <w:p>
+            <w:r>
+              <w:rPr>
+                <w:rFonts w:ascii="Calibri" w:cs="Calibri" w:eastAsia="Calibri" w:hAnsi="Calibri"/>
+                <w:b w:val="false"/>
+                <w:bCs w:val="false"/>
+                <w:sz w:val="20"/>
+                <w:szCs w:val="20"/>
+              </w:rPr>
+              <w:t xml:space="preserve">02/11 a 08/11</w:t>
+            </w:r>
+          </w:p>
+        </w:tc>
+      </w:tr>
+      <w:tr>
+        <w:trPr>
+          <w:cantSplit/>
+          <w:tblHeader w:val="false"/>
+        </w:trPr>
+        <w:tc>
+          <w:tcPr>
+            <w:tcW w:type="dxa" w:w="2526"/>
+            <w:tcBorders>
+              <w:top w:val="single" w:color="B7C4D6" w:sz="4"/>
+              <w:left w:val="single" w:color="B7C4D6" w:sz="4"/>
+              <w:bottom w:val="single" w:color="B7C4D6" w:sz="4"/>
+              <w:right w:val="single" w:color="B7C4D6" w:sz="4"/>
+            </w:tcBorders>
+            <w:tcMar>
+              <w:top w:type="dxa" w:w="60"/>
+              <w:left w:type="dxa" w:w="100"/>
+              <w:bottom w:type="dxa" w:w="60"/>
+              <w:right w:type="dxa" w:w="100"/>
+            </w:tcMar>
+          </w:tcPr>
+          <w:p>
+            <w:r>
+              <w:rPr>
+                <w:rFonts w:ascii="Calibri" w:cs="Calibri" w:eastAsia="Calibri" w:hAnsi="Calibri"/>
+                <w:b w:val="false"/>
+                <w:bCs w:val="false"/>
+                <w:sz w:val="20"/>
+                <w:szCs w:val="20"/>
+              </w:rPr>
+              <w:t xml:space="preserve">semana passada</w:t>
+            </w:r>
+          </w:p>
+        </w:tc>
+        <w:tc>
+          <w:tcPr>
+            <w:tcW w:type="dxa" w:w="3537"/>
+            <w:tcBorders>
+              <w:top w:val="single" w:color="B7C4D6" w:sz="4"/>
+              <w:left w:val="single" w:color="B7C4D6" w:sz="4"/>
+              <w:bottom w:val="single" w:color="B7C4D6" w:sz="4"/>
+              <w:right w:val="single" w:color="B7C4D6" w:sz="4"/>
+            </w:tcBorders>
+            <w:tcMar>
+              <w:top w:type="dxa" w:w="60"/>
+              <w:left w:type="dxa" w:w="100"/>
+              <w:bottom w:type="dxa" w:w="60"/>
+              <w:right w:type="dxa" w:w="100"/>
+            </w:tcMar>
+          </w:tcPr>
+          <w:p>
+            <w:r>
+              <w:rPr>
+                <w:rFonts w:ascii="Calibri" w:cs="Calibri" w:eastAsia="Calibri" w:hAnsi="Calibri"/>
+                <w:b w:val="false"/>
+                <w:bCs w:val="false"/>
+                <w:sz w:val="20"/>
+                <w:szCs w:val="20"/>
+              </w:rPr>
+              <w:t xml:space="preserve">segunda a domingo anteriores</w:t>
+            </w:r>
+          </w:p>
+        </w:tc>
+        <w:tc>
+          <w:tcPr>
+            <w:tcW w:type="dxa" w:w="4043"/>
+            <w:tcBorders>
+              <w:top w:val="single" w:color="B7C4D6" w:sz="4"/>
+              <w:left w:val="single" w:color="B7C4D6" w:sz="4"/>
+              <w:bottom w:val="single" w:color="B7C4D6" w:sz="4"/>
+              <w:right w:val="single" w:color="B7C4D6" w:sz="4"/>
+            </w:tcBorders>
+            <w:tcMar>
+              <w:top w:type="dxa" w:w="60"/>
+              <w:left w:type="dxa" w:w="100"/>
+              <w:bottom w:type="dxa" w:w="60"/>
+              <w:right w:type="dxa" w:w="100"/>
+            </w:tcMar>
+          </w:tcPr>
+          <w:p>
+            <w:r>
+              <w:rPr>
+                <w:rFonts w:ascii="Calibri" w:cs="Calibri" w:eastAsia="Calibri" w:hAnsi="Calibri"/>
+                <w:b w:val="false"/>
+                <w:bCs w:val="false"/>
+                <w:sz w:val="20"/>
+                <w:szCs w:val="20"/>
+              </w:rPr>
+              <w:t xml:space="preserve">19/10 a 25/10</w:t>
+            </w:r>
+          </w:p>
+        </w:tc>
+      </w:tr>
+      <w:tr>
+        <w:trPr>
+          <w:cantSplit/>
+          <w:tblHeader w:val="false"/>
+        </w:trPr>
+        <w:tc>
+          <w:tcPr>
+            <w:tcW w:type="dxa" w:w="2526"/>
+            <w:tcBorders>
+              <w:top w:val="single" w:color="B7C4D6" w:sz="4"/>
+              <w:left w:val="single" w:color="B7C4D6" w:sz="4"/>
+              <w:bottom w:val="single" w:color="B7C4D6" w:sz="4"/>
+              <w:right w:val="single" w:color="B7C4D6" w:sz="4"/>
+            </w:tcBorders>
+            <w:tcMar>
+              <w:top w:type="dxa" w:w="60"/>
+              <w:left w:type="dxa" w:w="100"/>
+              <w:bottom w:type="dxa" w:w="60"/>
+              <w:right w:type="dxa" w:w="100"/>
+            </w:tcMar>
+          </w:tcPr>
+          <w:p>
+            <w:r>
+              <w:rPr>
+                <w:rFonts w:ascii="Calibri" w:cs="Calibri" w:eastAsia="Calibri" w:hAnsi="Calibri"/>
+                <w:b w:val="false"/>
+                <w:bCs w:val="false"/>
+                <w:sz w:val="20"/>
+                <w:szCs w:val="20"/>
+              </w:rPr>
+              <w:t xml:space="preserve">fim de semana</w:t>
+            </w:r>
+          </w:p>
+        </w:tc>
+        <w:tc>
+          <w:tcPr>
+            <w:tcW w:type="dxa" w:w="3537"/>
+            <w:tcBorders>
+              <w:top w:val="single" w:color="B7C4D6" w:sz="4"/>
+              <w:left w:val="single" w:color="B7C4D6" w:sz="4"/>
+              <w:bottom w:val="single" w:color="B7C4D6" w:sz="4"/>
+              <w:right w:val="single" w:color="B7C4D6" w:sz="4"/>
+            </w:tcBorders>
+            <w:tcMar>
+              <w:top w:type="dxa" w:w="60"/>
+              <w:left w:type="dxa" w:w="100"/>
+              <w:bottom w:type="dxa" w:w="60"/>
+              <w:right w:type="dxa" w:w="100"/>
+            </w:tcMar>
+          </w:tcPr>
+          <w:p>
+            <w:r>
+              <w:rPr>
+                <w:rFonts w:ascii="Calibri" w:cs="Calibri" w:eastAsia="Calibri" w:hAnsi="Calibri"/>
+                <w:b w:val="false"/>
+                <w:bCs w:val="false"/>
+                <w:sz w:val="20"/>
+                <w:szCs w:val="20"/>
+              </w:rPr>
+              <w:t xml:space="preserve">sábado e domingo desta semana (hoje, se já for fim de semana)</w:t>
+            </w:r>
+          </w:p>
+        </w:tc>
+        <w:tc>
+          <w:tcPr>
+            <w:tcW w:type="dxa" w:w="4043"/>
+            <w:tcBorders>
+              <w:top w:val="single" w:color="B7C4D6" w:sz="4"/>
+              <w:left w:val="single" w:color="B7C4D6" w:sz="4"/>
+              <w:bottom w:val="single" w:color="B7C4D6" w:sz="4"/>
+              <w:right w:val="single" w:color="B7C4D6" w:sz="4"/>
+            </w:tcBorders>
+            <w:tcMar>
+              <w:top w:type="dxa" w:w="60"/>
+              <w:left w:type="dxa" w:w="100"/>
+              <w:bottom w:type="dxa" w:w="60"/>
+              <w:right w:type="dxa" w:w="100"/>
+            </w:tcMar>
+          </w:tcPr>
+          <w:p>
+            <w:r>
+              <w:rPr>
+                <w:rFonts w:ascii="Calibri" w:cs="Calibri" w:eastAsia="Calibri" w:hAnsi="Calibri"/>
+                <w:b w:val="false"/>
+                <w:bCs w:val="false"/>
+                <w:sz w:val="20"/>
+                <w:szCs w:val="20"/>
+              </w:rPr>
+              <w:t xml:space="preserve">31/10 a 01/11</w:t>
+            </w:r>
+          </w:p>
+        </w:tc>
+      </w:tr>
+      <w:tr>
+        <w:trPr>
+          <w:cantSplit/>
+          <w:tblHeader w:val="false"/>
+        </w:trPr>
+        <w:tc>
+          <w:tcPr>
+            <w:tcW w:type="dxa" w:w="2526"/>
+            <w:tcBorders>
+              <w:top w:val="single" w:color="B7C4D6" w:sz="4"/>
+              <w:left w:val="single" w:color="B7C4D6" w:sz="4"/>
+              <w:bottom w:val="single" w:color="B7C4D6" w:sz="4"/>
+              <w:right w:val="single" w:color="B7C4D6" w:sz="4"/>
+            </w:tcBorders>
+            <w:tcMar>
+              <w:top w:type="dxa" w:w="60"/>
+              <w:left w:type="dxa" w:w="100"/>
+              <w:bottom w:type="dxa" w:w="60"/>
+              <w:right w:type="dxa" w:w="100"/>
+            </w:tcMar>
+          </w:tcPr>
+          <w:p>
+            <w:r>
+              <w:rPr>
+                <w:rFonts w:ascii="Calibri" w:cs="Calibri" w:eastAsia="Calibri" w:hAnsi="Calibri"/>
+                <w:b w:val="false"/>
+                <w:bCs w:val="false"/>
+                <w:sz w:val="20"/>
+                <w:szCs w:val="20"/>
+              </w:rPr>
+              <w:t xml:space="preserve">próximo fim de semana</w:t>
+            </w:r>
+          </w:p>
+        </w:tc>
+        <w:tc>
+          <w:tcPr>
+            <w:tcW w:type="dxa" w:w="3537"/>
+            <w:tcBorders>
+              <w:top w:val="single" w:color="B7C4D6" w:sz="4"/>
+              <w:left w:val="single" w:color="B7C4D6" w:sz="4"/>
+              <w:bottom w:val="single" w:color="B7C4D6" w:sz="4"/>
+              <w:right w:val="single" w:color="B7C4D6" w:sz="4"/>
+            </w:tcBorders>
+            <w:tcMar>
+              <w:top w:type="dxa" w:w="60"/>
+              <w:left w:type="dxa" w:w="100"/>
+              <w:bottom w:type="dxa" w:w="60"/>
+              <w:right w:type="dxa" w:w="100"/>
+            </w:tcMar>
+          </w:tcPr>
+          <w:p>
+            <w:r>
+              <w:rPr>
+                <w:rFonts w:ascii="Calibri" w:cs="Calibri" w:eastAsia="Calibri" w:hAnsi="Calibri"/>
+                <w:b w:val="false"/>
+                <w:bCs w:val="false"/>
+                <w:sz w:val="20"/>
+                <w:szCs w:val="20"/>
+              </w:rPr>
+              <w:t xml:space="preserve">o mesmo; num sábado ou domingo, o seguinte</w:t>
+            </w:r>
+          </w:p>
+        </w:tc>
+        <w:tc>
+          <w:tcPr>
+            <w:tcW w:type="dxa" w:w="4043"/>
+            <w:tcBorders>
+              <w:top w:val="single" w:color="B7C4D6" w:sz="4"/>
+              <w:left w:val="single" w:color="B7C4D6" w:sz="4"/>
+              <w:bottom w:val="single" w:color="B7C4D6" w:sz="4"/>
+              <w:right w:val="single" w:color="B7C4D6" w:sz="4"/>
+            </w:tcBorders>
+            <w:tcMar>
+              <w:top w:type="dxa" w:w="60"/>
+              <w:left w:type="dxa" w:w="100"/>
+              <w:bottom w:type="dxa" w:w="60"/>
+              <w:right w:type="dxa" w:w="100"/>
+            </w:tcMar>
+          </w:tcPr>
+          <w:p>
+            <w:r>
+              <w:rPr>
+                <w:rFonts w:ascii="Calibri" w:cs="Calibri" w:eastAsia="Calibri" w:hAnsi="Calibri"/>
+                <w:b w:val="false"/>
+                <w:bCs w:val="false"/>
+                <w:sz w:val="20"/>
+                <w:szCs w:val="20"/>
+              </w:rPr>
+              <w:t xml:space="preserve">31/10 a 01/11</w:t>
+            </w:r>
+          </w:p>
+        </w:tc>
+      </w:tr>
+      <w:tr>
+        <w:trPr>
+          <w:cantSplit/>
+          <w:tblHeader w:val="false"/>
+        </w:trPr>
+        <w:tc>
+          <w:tcPr>
+            <w:tcW w:type="dxa" w:w="2526"/>
+            <w:tcBorders>
+              <w:top w:val="single" w:color="B7C4D6" w:sz="4"/>
+              <w:left w:val="single" w:color="B7C4D6" w:sz="4"/>
+              <w:bottom w:val="single" w:color="B7C4D6" w:sz="4"/>
+              <w:right w:val="single" w:color="B7C4D6" w:sz="4"/>
+            </w:tcBorders>
+            <w:tcMar>
+              <w:top w:type="dxa" w:w="60"/>
+              <w:left w:type="dxa" w:w="100"/>
+              <w:bottom w:type="dxa" w:w="60"/>
+              <w:right w:type="dxa" w:w="100"/>
+            </w:tcMar>
+          </w:tcPr>
+          <w:p>
+            <w:r>
+              <w:rPr>
+                <w:rFonts w:ascii="Calibri" w:cs="Calibri" w:eastAsia="Calibri" w:hAnsi="Calibri"/>
+                <w:b w:val="false"/>
+                <w:bCs w:val="false"/>
+                <w:sz w:val="20"/>
+                <w:szCs w:val="20"/>
+              </w:rPr>
+              <w:t xml:space="preserve">sexta (ou outro dia)</w:t>
+            </w:r>
+          </w:p>
+        </w:tc>
+        <w:tc>
+          <w:tcPr>
+            <w:tcW w:type="dxa" w:w="3537"/>
+            <w:tcBorders>
+              <w:top w:val="single" w:color="B7C4D6" w:sz="4"/>
+              <w:left w:val="single" w:color="B7C4D6" w:sz="4"/>
+              <w:bottom w:val="single" w:color="B7C4D6" w:sz="4"/>
+              <w:right w:val="single" w:color="B7C4D6" w:sz="4"/>
+            </w:tcBorders>
+            <w:tcMar>
+              <w:top w:type="dxa" w:w="60"/>
+              <w:left w:type="dxa" w:w="100"/>
+              <w:bottom w:type="dxa" w:w="60"/>
+              <w:right w:type="dxa" w:w="100"/>
+            </w:tcMar>
+          </w:tcPr>
+          <w:p>
+            <w:r>
+              <w:rPr>
+                <w:rFonts w:ascii="Calibri" w:cs="Calibri" w:eastAsia="Calibri" w:hAnsi="Calibri"/>
+                <w:b w:val="false"/>
+                <w:bCs w:val="false"/>
+                <w:sz w:val="20"/>
+                <w:szCs w:val="20"/>
+              </w:rPr>
+              <w:t xml:space="preserve">hoje, se hoje for sexta; senão a próxima</w:t>
+            </w:r>
+          </w:p>
+        </w:tc>
+        <w:tc>
+          <w:tcPr>
+            <w:tcW w:type="dxa" w:w="4043"/>
+            <w:tcBorders>
+              <w:top w:val="single" w:color="B7C4D6" w:sz="4"/>
+              <w:left w:val="single" w:color="B7C4D6" w:sz="4"/>
+              <w:bottom w:val="single" w:color="B7C4D6" w:sz="4"/>
+              <w:right w:val="single" w:color="B7C4D6" w:sz="4"/>
+            </w:tcBorders>
+            <w:tcMar>
+              <w:top w:type="dxa" w:w="60"/>
+              <w:left w:type="dxa" w:w="100"/>
+              <w:bottom w:type="dxa" w:w="60"/>
+              <w:right w:type="dxa" w:w="100"/>
+            </w:tcMar>
+          </w:tcPr>
+          <w:p>
+            <w:r>
+              <w:rPr>
+                <w:rFonts w:ascii="Calibri" w:cs="Calibri" w:eastAsia="Calibri" w:hAnsi="Calibri"/>
+                <w:b w:val="false"/>
+                <w:bCs w:val="false"/>
+                <w:sz w:val="20"/>
+                <w:szCs w:val="20"/>
+              </w:rPr>
+              <w:t xml:space="preserve">30/10</w:t>
+            </w:r>
+          </w:p>
+        </w:tc>
+      </w:tr>
+      <w:tr>
+        <w:trPr>
+          <w:cantSplit/>
+          <w:tblHeader w:val="false"/>
+        </w:trPr>
+        <w:tc>
+          <w:tcPr>
+            <w:tcW w:type="dxa" w:w="2526"/>
+            <w:tcBorders>
+              <w:top w:val="single" w:color="B7C4D6" w:sz="4"/>
+              <w:left w:val="single" w:color="B7C4D6" w:sz="4"/>
+              <w:bottom w:val="single" w:color="B7C4D6" w:sz="4"/>
+              <w:right w:val="single" w:color="B7C4D6" w:sz="4"/>
+            </w:tcBorders>
+            <w:tcMar>
+              <w:top w:type="dxa" w:w="60"/>
+              <w:left w:type="dxa" w:w="100"/>
+              <w:bottom w:type="dxa" w:w="60"/>
+              <w:right w:type="dxa" w:w="100"/>
+            </w:tcMar>
+          </w:tcPr>
+          <w:p>
+            <w:r>
+              <w:rPr>
+                <w:rFonts w:ascii="Calibri" w:cs="Calibri" w:eastAsia="Calibri" w:hAnsi="Calibri"/>
+                <w:b w:val="false"/>
+                <w:bCs w:val="false"/>
+                <w:sz w:val="20"/>
+                <w:szCs w:val="20"/>
+              </w:rPr>
+              <w:t xml:space="preserve">próxima sexta</w:t>
+            </w:r>
+          </w:p>
+        </w:tc>
+        <w:tc>
+          <w:tcPr>
+            <w:tcW w:type="dxa" w:w="3537"/>
+            <w:tcBorders>
+              <w:top w:val="single" w:color="B7C4D6" w:sz="4"/>
+              <w:left w:val="single" w:color="B7C4D6" w:sz="4"/>
+              <w:bottom w:val="single" w:color="B7C4D6" w:sz="4"/>
+              <w:right w:val="single" w:color="B7C4D6" w:sz="4"/>
+            </w:tcBorders>
+            <w:tcMar>
+              <w:top w:type="dxa" w:w="60"/>
+              <w:left w:type="dxa" w:w="100"/>
+              <w:bottom w:type="dxa" w:w="60"/>
+              <w:right w:type="dxa" w:w="100"/>
+            </w:tcMar>
+          </w:tcPr>
+          <w:p>
+            <w:r>
+              <w:rPr>
+                <w:rFonts w:ascii="Calibri" w:cs="Calibri" w:eastAsia="Calibri" w:hAnsi="Calibri"/>
+                <w:b w:val="false"/>
+                <w:bCs w:val="false"/>
+                <w:sz w:val="20"/>
+                <w:szCs w:val="20"/>
+              </w:rPr>
+              <w:t xml:space="preserve">a próxima; numa sexta-feira, a da semana seguinte</w:t>
+            </w:r>
+          </w:p>
+        </w:tc>
+        <w:tc>
+          <w:tcPr>
+            <w:tcW w:type="dxa" w:w="4043"/>
+            <w:tcBorders>
+              <w:top w:val="single" w:color="B7C4D6" w:sz="4"/>
+              <w:left w:val="single" w:color="B7C4D6" w:sz="4"/>
+              <w:bottom w:val="single" w:color="B7C4D6" w:sz="4"/>
+              <w:right w:val="single" w:color="B7C4D6" w:sz="4"/>
+            </w:tcBorders>
+            <w:tcMar>
+              <w:top w:type="dxa" w:w="60"/>
+              <w:left w:type="dxa" w:w="100"/>
+              <w:bottom w:type="dxa" w:w="60"/>
+              <w:right w:type="dxa" w:w="100"/>
+            </w:tcMar>
+          </w:tcPr>
+          <w:p>
+            <w:r>
+              <w:rPr>
+                <w:rFonts w:ascii="Calibri" w:cs="Calibri" w:eastAsia="Calibri" w:hAnsi="Calibri"/>
+                <w:b w:val="false"/>
+                <w:bCs w:val="false"/>
+                <w:sz w:val="20"/>
+                <w:szCs w:val="20"/>
+              </w:rPr>
+              <w:t xml:space="preserve">30/10</w:t>
+            </w:r>
+          </w:p>
+        </w:tc>
+      </w:tr>
+      <w:tr>
+        <w:trPr>
+          <w:cantSplit/>
+          <w:tblHeader w:val="false"/>
+        </w:trPr>
+        <w:tc>
+          <w:tcPr>
+            <w:tcW w:type="dxa" w:w="2526"/>
+            <w:tcBorders>
+              <w:top w:val="single" w:color="B7C4D6" w:sz="4"/>
+              <w:left w:val="single" w:color="B7C4D6" w:sz="4"/>
+              <w:bottom w:val="single" w:color="B7C4D6" w:sz="4"/>
+              <w:right w:val="single" w:color="B7C4D6" w:sz="4"/>
+            </w:tcBorders>
+            <w:tcMar>
+              <w:top w:type="dxa" w:w="60"/>
+              <w:left w:type="dxa" w:w="100"/>
+              <w:bottom w:type="dxa" w:w="60"/>
+              <w:right w:type="dxa" w:w="100"/>
+            </w:tcMar>
+          </w:tcPr>
+          <w:p>
+            <w:r>
+              <w:rPr>
+                <w:rFonts w:ascii="Calibri" w:cs="Calibri" w:eastAsia="Calibri" w:hAnsi="Calibri"/>
+                <w:b w:val="false"/>
+                <w:bCs w:val="false"/>
+                <w:sz w:val="20"/>
+                <w:szCs w:val="20"/>
+              </w:rPr>
+              <w:t xml:space="preserve">próximos 7 / 15 / 30 dias</w:t>
+            </w:r>
+          </w:p>
+        </w:tc>
+        <w:tc>
+          <w:tcPr>
+            <w:tcW w:type="dxa" w:w="3537"/>
+            <w:tcBorders>
+              <w:top w:val="single" w:color="B7C4D6" w:sz="4"/>
+              <w:left w:val="single" w:color="B7C4D6" w:sz="4"/>
+              <w:bottom w:val="single" w:color="B7C4D6" w:sz="4"/>
+              <w:right w:val="single" w:color="B7C4D6" w:sz="4"/>
+            </w:tcBorders>
+            <w:tcMar>
+              <w:top w:type="dxa" w:w="60"/>
+              <w:left w:type="dxa" w:w="100"/>
+              <w:bottom w:type="dxa" w:w="60"/>
+              <w:right w:type="dxa" w:w="100"/>
+            </w:tcMar>
+          </w:tcPr>
+          <w:p>
+            <w:r>
+              <w:rPr>
+                <w:rFonts w:ascii="Calibri" w:cs="Calibri" w:eastAsia="Calibri" w:hAnsi="Calibri"/>
+                <w:b w:val="false"/>
+                <w:bCs w:val="false"/>
+                <w:sz w:val="20"/>
+                <w:szCs w:val="20"/>
+              </w:rPr>
+              <w:t xml:space="preserve">de hoje até hoje + N</w:t>
+            </w:r>
+          </w:p>
+        </w:tc>
+        <w:tc>
+          <w:tcPr>
+            <w:tcW w:type="dxa" w:w="4043"/>
+            <w:tcBorders>
+              <w:top w:val="single" w:color="B7C4D6" w:sz="4"/>
+              <w:left w:val="single" w:color="B7C4D6" w:sz="4"/>
+              <w:bottom w:val="single" w:color="B7C4D6" w:sz="4"/>
+              <w:right w:val="single" w:color="B7C4D6" w:sz="4"/>
+            </w:tcBorders>
+            <w:tcMar>
+              <w:top w:type="dxa" w:w="60"/>
+              <w:left w:type="dxa" w:w="100"/>
+              <w:bottom w:type="dxa" w:w="60"/>
+              <w:right w:type="dxa" w:w="100"/>
+            </w:tcMar>
+          </w:tcPr>
+          <w:p>
+            <w:r>
+              <w:rPr>
+                <w:rFonts w:ascii="Calibri" w:cs="Calibri" w:eastAsia="Calibri" w:hAnsi="Calibri"/>
+                <w:b w:val="false"/>
+                <w:bCs w:val="false"/>
+                <w:sz w:val="20"/>
+                <w:szCs w:val="20"/>
+              </w:rPr>
+              <w:t xml:space="preserve">26/10 a 02/11 (7)</w:t>
+            </w:r>
+          </w:p>
+        </w:tc>
+      </w:tr>
+      <w:tr>
+        <w:trPr>
+          <w:cantSplit/>
+          <w:tblHeader w:val="false"/>
+        </w:trPr>
+        <w:tc>
+          <w:tcPr>
+            <w:tcW w:type="dxa" w:w="2526"/>
+            <w:tcBorders>
+              <w:top w:val="single" w:color="B7C4D6" w:sz="4"/>
+              <w:left w:val="single" w:color="B7C4D6" w:sz="4"/>
+              <w:bottom w:val="single" w:color="B7C4D6" w:sz="4"/>
+              <w:right w:val="single" w:color="B7C4D6" w:sz="4"/>
+            </w:tcBorders>
+            <w:tcMar>
+              <w:top w:type="dxa" w:w="60"/>
+              <w:left w:type="dxa" w:w="100"/>
+              <w:bottom w:type="dxa" w:w="60"/>
+              <w:right w:type="dxa" w:w="100"/>
+            </w:tcMar>
+          </w:tcPr>
+          <w:p>
+            <w:r>
+              <w:rPr>
+                <w:rFonts w:ascii="Calibri" w:cs="Calibri" w:eastAsia="Calibri" w:hAnsi="Calibri"/>
+                <w:b w:val="false"/>
+                <w:bCs w:val="false"/>
+                <w:sz w:val="20"/>
+                <w:szCs w:val="20"/>
+              </w:rPr>
+              <w:t xml:space="preserve">últimos 7 / 15 / 30 dias</w:t>
+            </w:r>
+          </w:p>
+        </w:tc>
+        <w:tc>
+          <w:tcPr>
+            <w:tcW w:type="dxa" w:w="3537"/>
+            <w:tcBorders>
+              <w:top w:val="single" w:color="B7C4D6" w:sz="4"/>
+              <w:left w:val="single" w:color="B7C4D6" w:sz="4"/>
+              <w:bottom w:val="single" w:color="B7C4D6" w:sz="4"/>
+              <w:right w:val="single" w:color="B7C4D6" w:sz="4"/>
+            </w:tcBorders>
+            <w:tcMar>
+              <w:top w:type="dxa" w:w="60"/>
+              <w:left w:type="dxa" w:w="100"/>
+              <w:bottom w:type="dxa" w:w="60"/>
+              <w:right w:type="dxa" w:w="100"/>
+            </w:tcMar>
+          </w:tcPr>
+          <w:p>
+            <w:r>
+              <w:rPr>
+                <w:rFonts w:ascii="Calibri" w:cs="Calibri" w:eastAsia="Calibri" w:hAnsi="Calibri"/>
+                <w:b w:val="false"/>
+                <w:bCs w:val="false"/>
+                <w:sz w:val="20"/>
+                <w:szCs w:val="20"/>
+              </w:rPr>
+              <w:t xml:space="preserve">de hoje − N até hoje</w:t>
+            </w:r>
+          </w:p>
+        </w:tc>
+        <w:tc>
+          <w:tcPr>
+            <w:tcW w:type="dxa" w:w="4043"/>
+            <w:tcBorders>
+              <w:top w:val="single" w:color="B7C4D6" w:sz="4"/>
+              <w:left w:val="single" w:color="B7C4D6" w:sz="4"/>
+              <w:bottom w:val="single" w:color="B7C4D6" w:sz="4"/>
+              <w:right w:val="single" w:color="B7C4D6" w:sz="4"/>
+            </w:tcBorders>
+            <w:tcMar>
+              <w:top w:type="dxa" w:w="60"/>
+              <w:left w:type="dxa" w:w="100"/>
+              <w:bottom w:type="dxa" w:w="60"/>
+              <w:right w:type="dxa" w:w="100"/>
+            </w:tcMar>
+          </w:tcPr>
+          <w:p>
+            <w:r>
+              <w:rPr>
+                <w:rFonts w:ascii="Calibri" w:cs="Calibri" w:eastAsia="Calibri" w:hAnsi="Calibri"/>
+                <w:b w:val="false"/>
+                <w:bCs w:val="false"/>
+                <w:sz w:val="20"/>
+                <w:szCs w:val="20"/>
+              </w:rPr>
+              <w:t xml:space="preserve">19/10 a 26/10 (7)</w:t>
+            </w:r>
+          </w:p>
+        </w:tc>
+      </w:tr>
+      <w:tr>
+        <w:trPr>
+          <w:cantSplit/>
+          <w:tblHeader w:val="false"/>
+        </w:trPr>
+        <w:tc>
+          <w:tcPr>
+            <w:tcW w:type="dxa" w:w="2526"/>
+            <w:tcBorders>
+              <w:top w:val="single" w:color="B7C4D6" w:sz="4"/>
+              <w:left w:val="single" w:color="B7C4D6" w:sz="4"/>
+              <w:bottom w:val="single" w:color="B7C4D6" w:sz="4"/>
+              <w:right w:val="single" w:color="B7C4D6" w:sz="4"/>
+            </w:tcBorders>
+            <w:tcMar>
+              <w:top w:type="dxa" w:w="60"/>
+              <w:left w:type="dxa" w:w="100"/>
+              <w:bottom w:type="dxa" w:w="60"/>
+              <w:right w:type="dxa" w:w="100"/>
+            </w:tcMar>
+          </w:tcPr>
+          <w:p>
+            <w:r>
+              <w:rPr>
+                <w:rFonts w:ascii="Calibri" w:cs="Calibri" w:eastAsia="Calibri" w:hAnsi="Calibri"/>
+                <w:b w:val="false"/>
+                <w:bCs w:val="false"/>
+                <w:sz w:val="20"/>
+                <w:szCs w:val="20"/>
+              </w:rPr>
+              <w:t xml:space="preserve">este mês / mês que vem / mês passado</w:t>
+            </w:r>
+          </w:p>
+        </w:tc>
+        <w:tc>
+          <w:tcPr>
+            <w:tcW w:type="dxa" w:w="3537"/>
+            <w:tcBorders>
+              <w:top w:val="single" w:color="B7C4D6" w:sz="4"/>
+              <w:left w:val="single" w:color="B7C4D6" w:sz="4"/>
+              <w:bottom w:val="single" w:color="B7C4D6" w:sz="4"/>
+              <w:right w:val="single" w:color="B7C4D6" w:sz="4"/>
+            </w:tcBorders>
+            <w:tcMar>
+              <w:top w:type="dxa" w:w="60"/>
+              <w:left w:type="dxa" w:w="100"/>
+              <w:bottom w:type="dxa" w:w="60"/>
+              <w:right w:type="dxa" w:w="100"/>
+            </w:tcMar>
+          </w:tcPr>
+          <w:p>
+            <w:r>
+              <w:rPr>
+                <w:rFonts w:ascii="Calibri" w:cs="Calibri" w:eastAsia="Calibri" w:hAnsi="Calibri"/>
+                <w:b w:val="false"/>
+                <w:bCs w:val="false"/>
+                <w:sz w:val="20"/>
+                <w:szCs w:val="20"/>
+              </w:rPr>
+              <w:t xml:space="preserve">o mês inteiro</w:t>
+            </w:r>
+          </w:p>
+        </w:tc>
+        <w:tc>
+          <w:tcPr>
+            <w:tcW w:type="dxa" w:w="4043"/>
+            <w:tcBorders>
+              <w:top w:val="single" w:color="B7C4D6" w:sz="4"/>
+              <w:left w:val="single" w:color="B7C4D6" w:sz="4"/>
+              <w:bottom w:val="single" w:color="B7C4D6" w:sz="4"/>
+              <w:right w:val="single" w:color="B7C4D6" w:sz="4"/>
+            </w:tcBorders>
+            <w:tcMar>
+              <w:top w:type="dxa" w:w="60"/>
+              <w:left w:type="dxa" w:w="100"/>
+              <w:bottom w:type="dxa" w:w="60"/>
+              <w:right w:type="dxa" w:w="100"/>
+            </w:tcMar>
+          </w:tcPr>
+          <w:p>
+            <w:r>
+              <w:rPr>
+                <w:rFonts w:ascii="Calibri" w:cs="Calibri" w:eastAsia="Calibri" w:hAnsi="Calibri"/>
+                <w:b w:val="false"/>
+                <w:bCs w:val="false"/>
+                <w:sz w:val="20"/>
+                <w:szCs w:val="20"/>
+              </w:rPr>
+              <w:t xml:space="preserve">out · nov · set</w:t>
+            </w:r>
+          </w:p>
+        </w:tc>
+      </w:tr>
+      <w:tr>
+        <w:trPr>
+          <w:cantSplit/>
+          <w:tblHeader w:val="false"/>
+        </w:trPr>
+        <w:tc>
+          <w:tcPr>
+            <w:tcW w:type="dxa" w:w="2526"/>
+            <w:tcBorders>
+              <w:top w:val="single" w:color="B7C4D6" w:sz="4"/>
+              <w:left w:val="single" w:color="B7C4D6" w:sz="4"/>
+              <w:bottom w:val="single" w:color="B7C4D6" w:sz="4"/>
+              <w:right w:val="single" w:color="B7C4D6" w:sz="4"/>
+            </w:tcBorders>
+            <w:tcMar>
+              <w:top w:type="dxa" w:w="60"/>
+              <w:left w:type="dxa" w:w="100"/>
+              <w:bottom w:type="dxa" w:w="60"/>
+              <w:right w:type="dxa" w:w="100"/>
+            </w:tcMar>
+          </w:tcPr>
+          <w:p>
+            <w:r>
+              <w:rPr>
+                <w:rFonts w:ascii="Calibri" w:cs="Calibri" w:eastAsia="Calibri" w:hAnsi="Calibri"/>
+                <w:b w:val="false"/>
+                <w:bCs w:val="false"/>
+                <w:sz w:val="20"/>
+                <w:szCs w:val="20"/>
+              </w:rPr>
+              <w:t xml:space="preserve">este ano / ano que vem / ano passado</w:t>
+            </w:r>
+          </w:p>
+        </w:tc>
+        <w:tc>
+          <w:tcPr>
+            <w:tcW w:type="dxa" w:w="3537"/>
+            <w:tcBorders>
+              <w:top w:val="single" w:color="B7C4D6" w:sz="4"/>
+              <w:left w:val="single" w:color="B7C4D6" w:sz="4"/>
+              <w:bottom w:val="single" w:color="B7C4D6" w:sz="4"/>
+              <w:right w:val="single" w:color="B7C4D6" w:sz="4"/>
+            </w:tcBorders>
+            <w:tcMar>
+              <w:top w:type="dxa" w:w="60"/>
+              <w:left w:type="dxa" w:w="100"/>
+              <w:bottom w:type="dxa" w:w="60"/>
+              <w:right w:type="dxa" w:w="100"/>
+            </w:tcMar>
+          </w:tcPr>
+          <w:p>
+            <w:r>
+              <w:rPr>
+                <w:rFonts w:ascii="Calibri" w:cs="Calibri" w:eastAsia="Calibri" w:hAnsi="Calibri"/>
+                <w:b w:val="false"/>
+                <w:bCs w:val="false"/>
+                <w:sz w:val="20"/>
+                <w:szCs w:val="20"/>
+              </w:rPr>
+              <w:t xml:space="preserve">o ano inteiro</w:t>
+            </w:r>
+          </w:p>
+        </w:tc>
+        <w:tc>
+          <w:tcPr>
+            <w:tcW w:type="dxa" w:w="4043"/>
+            <w:tcBorders>
+              <w:top w:val="single" w:color="B7C4D6" w:sz="4"/>
+              <w:left w:val="single" w:color="B7C4D6" w:sz="4"/>
+              <w:bottom w:val="single" w:color="B7C4D6" w:sz="4"/>
+              <w:right w:val="single" w:color="B7C4D6" w:sz="4"/>
+            </w:tcBorders>
+            <w:tcMar>
+              <w:top w:type="dxa" w:w="60"/>
+              <w:left w:type="dxa" w:w="100"/>
+              <w:bottom w:type="dxa" w:w="60"/>
+              <w:right w:type="dxa" w:w="100"/>
+            </w:tcMar>
+          </w:tcPr>
+          <w:p>
+            <w:r>
+              <w:rPr>
+                <w:rFonts w:ascii="Calibri" w:cs="Calibri" w:eastAsia="Calibri" w:hAnsi="Calibri"/>
+                <w:b w:val="false"/>
+                <w:bCs w:val="false"/>
+                <w:sz w:val="20"/>
+                <w:szCs w:val="20"/>
+              </w:rPr>
+              <w:t xml:space="preserve">2026 · 2027 · 2025</w:t>
+            </w:r>
+          </w:p>
+        </w:tc>
+      </w:tr>
+    </w:tbl>
+    <w:p>
+      <w:pPr>
+        <w:spacing w:after="60"/>
+      </w:pPr>
+    </w:p>
+    <w:p>
+      <w:pPr>
+        <w:pBdr>
+          <w:left w:val="single" w:color="7B3F00" w:sz="12" w:space="8"/>
+        </w:pBdr>
+        <w:spacing w:before="80" w:after="80"/>
+        <w:ind w:left="360"/>
+      </w:pPr>
+      <w:r>
+        <w:rPr>
+          <w:rFonts w:ascii="Calibri" w:cs="Calibri" w:eastAsia="Calibri" w:hAnsi="Calibri"/>
+          <w:b/>
+          <w:bCs/>
+          <w:color w:val="7B3F00"/>
+          <w:sz w:val="21"/>
+          <w:szCs w:val="21"/>
+        </w:rPr>
+        <w:t xml:space="preserve">NOTA: </w:t>
+      </w:r>
+      <w:r>
+        <w:rPr>
+          <w:rFonts w:ascii="Calibri" w:cs="Calibri" w:eastAsia="Calibri" w:hAnsi="Calibri"/>
+          <w:sz w:val="21"/>
+          <w:szCs w:val="21"/>
+        </w:rPr>
+        <w:t xml:space="preserve">"Próximos 7 dias" é diferente de "semana que vem": conta a partir de hoje, não da próxima segunda.</w:t>
       </w:r>
     </w:p>
     <w:p>

</xml_diff>